<commit_message>
Link GoCue project board in lab report
</commit_message>
<xml_diff>
--- a/docs/lab-01/ЛР1_Отчёт_GoCue.docx
+++ b/docs/lab-01/ЛР1_Отчёт_GoCue.docx
@@ -902,7 +902,7 @@
           </w:tcPr>
           <w:p>
             <w:r>
-              <w:t>Не создана. Ссылку вставить после настройки.</w:t>
+              <w:t>https://github.com/users/techmo0/projects/1/views/1; ссылка предоставлена владельцем, содержимое и доступ команды предстоит проверить.</w:t>
             </w:r>
           </w:p>
         </w:tc>
@@ -11237,7 +11237,7 @@
           </w:tcPr>
           <w:p>
             <w:r>
-              <w:t>Не создана</w:t>
+              <w:t>Создана: https://github.com/users/techmo0/projects/1/views/1; права и связь с репозиторием не проверены</w:t>
             </w:r>
           </w:p>
         </w:tc>
@@ -11253,7 +11253,7 @@
           </w:tcPr>
           <w:p>
             <w:r>
-              <w:t>Не назначен</w:t>
+              <w:t>Боровик Ф. И.</w:t>
             </w:r>
           </w:p>
         </w:tc>
@@ -11269,7 +11269,7 @@
           </w:tcPr>
           <w:p>
             <w:r>
-              <w:t>☐</w:t>
+              <w:t>☑ создана</w:t>
             </w:r>
           </w:p>
         </w:tc>
@@ -11506,7 +11506,7 @@
               <w:br/>
               <w:t>Отчёт ЛР 1: docs/lab-01/</w:t>
               <w:br/>
-              <w:t>Доска задач: ссылка после создания.</w:t>
+              <w:t>Доска задач: https://github.com/users/techmo0/projects/1/views/1</w:t>
               <w:br/>
               <w:br/>
               <w:t>## Статус</w:t>
@@ -13922,7 +13922,7 @@
           </w:tcPr>
           <w:p>
             <w:r>
-              <w:t>Скриншот доски будет вставлен после фактического создания GitHub Projects и проверки настроек.</w:t>
+              <w:t>Доска: https://github.com/users/techmo0/projects/1/views/1. Скриншот добавить после проверки содержимого, связи с репозиторием и доступов команды.</w:t>
             </w:r>
           </w:p>
         </w:tc>
@@ -13952,7 +13952,7 @@
         <w:rPr>
           <w:sz w:val="20"/>
         </w:rPr>
-        <w:t>К моменту подготовки черновика есть спецификация GoCue, отчёт и репозиторий GitHub. Согласование темы, командная самооценка, доска, рецензия соседней команды, мини-защита и загрузка на портал ещё не подтверждены. После фактического выполнения команда дополнит этот раздел результатами ретроспективы: что получилось, что мешало, что меняем в ЛР 2.</w:t>
+        <w:t>К моменту подготовки черновика есть спецификация GoCue, отчёт, репозиторий и ссылка на созданную доску GitHub Projects. Согласование темы, командная самооценка, наполнение доски задачами, доступ команды, рецензия соседней команды, мини-защита и загрузка на портал ещё не подтверждены. После фактического выполнения команда дополнит этот раздел результатами ретроспективы: что получилось, что мешало, что меняем в ЛР 2.</w:t>
       </w:r>
     </w:p>
     <w:p>

</xml_diff>

<commit_message>
Record confirmed lab 1 team facts
</commit_message>
<xml_diff>
--- a/docs/lab-01/ЛР1_Отчёт_GoCue.docx
+++ b/docs/lab-01/ЛР1_Отчёт_GoCue.docx
@@ -231,7 +231,7 @@
         <w:rPr>
           <w:sz w:val="20"/>
         </w:rPr>
-        <w:t>Выполнили студенты группы [номер группы уточняется]:</w:t>
+        <w:t>Выполнили студенты группы ПИб-23Э1:</w:t>
       </w:r>
     </w:p>
     <w:p>
@@ -522,7 +522,7 @@
           </w:tcPr>
           <w:p>
             <w:r>
-              <w:t>GoCue — мобильное приложение контекстных намерений; тема ожидает согласования.</w:t>
+              <w:t>GoCue — мобильное приложение контекстных намерений; тема согласована с преподавателем по сообщению команды.</w:t>
             </w:r>
           </w:p>
         </w:tc>
@@ -1688,7 +1688,7 @@
           </w:tcPr>
           <w:p>
             <w:r>
-              <w:t>Тема выбрана инициатором; самооценка команды и согласование ещё впереди.</w:t>
+              <w:t>Тема согласована с преподавателем, роли подтверждены командой; матрица компетенций ещё не заполнена.</w:t>
             </w:r>
           </w:p>
         </w:tc>
@@ -11269,7 +11269,7 @@
           </w:tcPr>
           <w:p>
             <w:r>
-              <w:t>☑ создана</w:t>
+              <w:t>☐ нет</w:t>
             </w:r>
           </w:p>
         </w:tc>
@@ -11511,7 +11511,7 @@
               <w:br/>
               <w:t>## Статус</w:t>
               <w:br/>
-              <w:t>ЛР 1 — инициация; тема требует согласования.</w:t>
+              <w:t>ЛР 1 — инициация; тема согласована с преподавателем.</w:t>
             </w:r>
           </w:p>
         </w:tc>
@@ -13952,7 +13952,7 @@
         <w:rPr>
           <w:sz w:val="20"/>
         </w:rPr>
-        <w:t>К моменту подготовки черновика есть спецификация GoCue, отчёт, репозиторий и ссылка на созданную доску GitHub Projects. Согласование темы, командная самооценка, наполнение доски задачами, доступ команды, рецензия соседней команды, мини-защита и загрузка на портал ещё не подтверждены. После фактического выполнения команда дополнит этот раздел результатами ретроспективы: что получилось, что мешало, что меняем в ЛР 2.</w:t>
+        <w:t>К моменту подготовки отчёта тема GoCue согласована с преподавателем, роли подтверждены командой, есть спецификация, репозиторий и ссылка на созданную доску GitHub Projects. Матрица компетенций ещё не заполнена. Рецензия другой команды и ретроспектива не проведены; преподавателю пока не предоставлен доступ к приватной доске. Наполнение доски задачами, мини-защита и загрузка на портал также не подтверждены. После фактического выполнения команда дополнит этот раздел результатами ретроспективы: что получилось, что мешало, что меняем в ЛР 2.</w:t>
       </w:r>
     </w:p>
     <w:p>

</xml_diff>

<commit_message>
Tailor competency matrix to GoCue mobile work
</commit_message>
<xml_diff>
--- a/docs/lab-01/ЛР1_Отчёт_GoCue.docx
+++ b/docs/lab-01/ЛР1_Отчёт_GoCue.docx
@@ -8146,84 +8146,9 @@
       </w:pPr>
       <w:r>
         <w:rPr>
-          <w:rFonts w:ascii="Times New Roman" w:hAnsi="Times New Roman" w:cs="Times New Roman"/>
-          <w:color w:val="5B6573"/>
           <w:sz w:val="20"/>
-          <w:szCs w:val="28"/>
-        </w:rPr>
-        <w:t xml:space="preserve">Шкала: 0 </w:t>
-      </w:r>
-      <w:r>
-        <w:rPr>
-          <w:rFonts w:ascii="Times New Roman" w:hAnsi="Times New Roman" w:cs="Times New Roman"/>
-          <w:color w:val="5B6573"/>
-          <w:sz w:val="20"/>
-          <w:szCs w:val="28"/>
-        </w:rPr>
-        <w:t>–</w:t>
-      </w:r>
-      <w:r>
-        <w:rPr>
-          <w:rFonts w:ascii="Times New Roman" w:hAnsi="Times New Roman" w:cs="Times New Roman"/>
-          <w:color w:val="5B6573"/>
-          <w:sz w:val="20"/>
-          <w:szCs w:val="28"/>
-        </w:rPr>
-        <w:t xml:space="preserve"> не знаю, 1 </w:t>
-      </w:r>
-      <w:r>
-        <w:rPr>
-          <w:rFonts w:ascii="Times New Roman" w:hAnsi="Times New Roman" w:cs="Times New Roman"/>
-          <w:color w:val="5B6573"/>
-          <w:sz w:val="20"/>
-          <w:szCs w:val="28"/>
-        </w:rPr>
-        <w:t>–</w:t>
-      </w:r>
-      <w:r>
-        <w:rPr>
-          <w:rFonts w:ascii="Times New Roman" w:hAnsi="Times New Roman" w:cs="Times New Roman"/>
-          <w:color w:val="5B6573"/>
-          <w:sz w:val="20"/>
-          <w:szCs w:val="28"/>
-        </w:rPr>
-        <w:t xml:space="preserve"> базовый уровень, 2 </w:t>
-      </w:r>
-      <w:r>
-        <w:rPr>
-          <w:rFonts w:ascii="Times New Roman" w:hAnsi="Times New Roman" w:cs="Times New Roman"/>
-          <w:color w:val="5B6573"/>
-          <w:sz w:val="20"/>
-          <w:szCs w:val="28"/>
-        </w:rPr>
-        <w:t>–</w:t>
-      </w:r>
-      <w:r>
-        <w:rPr>
-          <w:rFonts w:ascii="Times New Roman" w:hAnsi="Times New Roman" w:cs="Times New Roman"/>
-          <w:color w:val="5B6573"/>
-          <w:sz w:val="20"/>
-          <w:szCs w:val="28"/>
-        </w:rPr>
-        <w:t xml:space="preserve"> уверенно, 3 </w:t>
-      </w:r>
-      <w:r>
-        <w:rPr>
-          <w:rFonts w:ascii="Times New Roman" w:hAnsi="Times New Roman" w:cs="Times New Roman"/>
-          <w:color w:val="5B6573"/>
-          <w:sz w:val="20"/>
-          <w:szCs w:val="28"/>
-        </w:rPr>
-        <w:t>–</w:t>
-      </w:r>
-      <w:r>
-        <w:rPr>
-          <w:rFonts w:ascii="Times New Roman" w:hAnsi="Times New Roman" w:cs="Times New Roman"/>
-          <w:color w:val="5B6573"/>
-          <w:sz w:val="20"/>
-          <w:szCs w:val="28"/>
-        </w:rPr>
-        <w:t xml:space="preserve"> могу научить других.</w:t>
+        </w:rPr>
+        <w:t>Шкала: 0 – не знаю, 1 – базовый уровень, 2 – уверенно, 3 – могу научить других. Моб. код — нативная разработка; Гео — геолокация и геозоны; Фон — фоновая работа и уведомления; БД — локальное хранение; Лог. — архитектура и оценка намерений; Анал. — продуктовая аналитика и документация.</w:t>
       </w:r>
     </w:p>
     <w:tbl>
@@ -8274,23 +8199,7 @@
             </w:tcMar>
           </w:tcPr>
           <w:p>
-            <w:pPr>
-              <w:spacing w:after="30" w:line="245" w:lineRule="auto"/>
-              <w:rPr>
-                <w:rFonts w:ascii="Times New Roman" w:hAnsi="Times New Roman" w:cs="Times New Roman"/>
-                <w:sz w:val="28"/>
-                <w:szCs w:val="28"/>
-              </w:rPr>
-            </w:pPr>
-            <w:r>
-              <w:rPr>
-                <w:rFonts w:ascii="Times New Roman" w:hAnsi="Times New Roman" w:cs="Times New Roman"/>
-                <w:b/>
-                <w:bCs/>
-                <w:color w:val="FFFFFF"/>
-                <w:sz w:val="28"/>
-                <w:szCs w:val="28"/>
-              </w:rPr>
+            <w:r>
               <w:t>Участник</w:t>
             </w:r>
           </w:p>
@@ -8307,25 +8216,8 @@
             </w:tcMar>
           </w:tcPr>
           <w:p>
-            <w:pPr>
-              <w:spacing w:after="30" w:line="245" w:lineRule="auto"/>
-              <w:jc w:val="center"/>
-              <w:rPr>
-                <w:rFonts w:ascii="Times New Roman" w:hAnsi="Times New Roman" w:cs="Times New Roman"/>
-                <w:sz w:val="20"/>
-                <w:szCs w:val="28"/>
-              </w:rPr>
-            </w:pPr>
-            <w:r>
-              <w:rPr>
-                <w:rFonts w:ascii="Times New Roman" w:hAnsi="Times New Roman" w:cs="Times New Roman"/>
-                <w:b/>
-                <w:bCs/>
-                <w:color w:val="FFFFFF"/>
-                <w:sz w:val="20"/>
-                <w:szCs w:val="28"/>
-              </w:rPr>
-              <w:t>Бэкенд</w:t>
+            <w:r>
+              <w:t>Моб. код</w:t>
             </w:r>
           </w:p>
         </w:tc>
@@ -8341,28 +8233,9 @@
             </w:tcMar>
           </w:tcPr>
           <w:p>
-            <w:pPr>
-              <w:spacing w:after="30" w:line="245" w:lineRule="auto"/>
-              <w:jc w:val="center"/>
-              <w:rPr>
-                <w:rFonts w:ascii="Times New Roman" w:hAnsi="Times New Roman" w:cs="Times New Roman"/>
-                <w:sz w:val="20"/>
-                <w:szCs w:val="28"/>
-              </w:rPr>
-            </w:pPr>
-            <w:proofErr w:type="spellStart"/>
-            <w:r>
-              <w:rPr>
-                <w:rFonts w:ascii="Times New Roman" w:hAnsi="Times New Roman" w:cs="Times New Roman"/>
-                <w:b/>
-                <w:bCs/>
-                <w:color w:val="FFFFFF"/>
-                <w:sz w:val="20"/>
-                <w:szCs w:val="28"/>
-              </w:rPr>
-              <w:t>Фронт­енд</w:t>
-            </w:r>
-            <w:proofErr w:type="spellEnd"/>
+            <w:r>
+              <w:t>UI/UX</w:t>
+            </w:r>
           </w:p>
         </w:tc>
         <w:tc>
@@ -8377,25 +8250,8 @@
             </w:tcMar>
           </w:tcPr>
           <w:p>
-            <w:pPr>
-              <w:spacing w:after="30" w:line="245" w:lineRule="auto"/>
-              <w:jc w:val="center"/>
-              <w:rPr>
-                <w:rFonts w:ascii="Times New Roman" w:hAnsi="Times New Roman" w:cs="Times New Roman"/>
-                <w:sz w:val="20"/>
-                <w:szCs w:val="28"/>
-              </w:rPr>
-            </w:pPr>
-            <w:r>
-              <w:rPr>
-                <w:rFonts w:ascii="Times New Roman" w:hAnsi="Times New Roman" w:cs="Times New Roman"/>
-                <w:b/>
-                <w:bCs/>
-                <w:color w:val="FFFFFF"/>
-                <w:sz w:val="20"/>
-                <w:szCs w:val="28"/>
-              </w:rPr>
-              <w:t>БД</w:t>
+            <w:r>
+              <w:t>Гео</w:t>
             </w:r>
           </w:p>
         </w:tc>
@@ -8411,25 +8267,8 @@
             </w:tcMar>
           </w:tcPr>
           <w:p>
-            <w:pPr>
-              <w:spacing w:after="30" w:line="245" w:lineRule="auto"/>
-              <w:jc w:val="center"/>
-              <w:rPr>
-                <w:rFonts w:ascii="Times New Roman" w:hAnsi="Times New Roman" w:cs="Times New Roman"/>
-                <w:sz w:val="20"/>
-                <w:szCs w:val="28"/>
-              </w:rPr>
-            </w:pPr>
-            <w:r>
-              <w:rPr>
-                <w:rFonts w:ascii="Times New Roman" w:hAnsi="Times New Roman" w:cs="Times New Roman"/>
-                <w:b/>
-                <w:bCs/>
-                <w:color w:val="FFFFFF"/>
-                <w:sz w:val="20"/>
-                <w:szCs w:val="28"/>
-              </w:rPr>
-              <w:t>Анали­тика</w:t>
+            <w:r>
+              <w:t>Фон</w:t>
             </w:r>
           </w:p>
         </w:tc>
@@ -8445,25 +8284,8 @@
             </w:tcMar>
           </w:tcPr>
           <w:p>
-            <w:pPr>
-              <w:spacing w:after="30" w:line="245" w:lineRule="auto"/>
-              <w:jc w:val="center"/>
-              <w:rPr>
-                <w:rFonts w:ascii="Times New Roman" w:hAnsi="Times New Roman" w:cs="Times New Roman"/>
-                <w:sz w:val="20"/>
-                <w:szCs w:val="28"/>
-              </w:rPr>
-            </w:pPr>
-            <w:r>
-              <w:rPr>
-                <w:rFonts w:ascii="Times New Roman" w:hAnsi="Times New Roman" w:cs="Times New Roman"/>
-                <w:b/>
-                <w:bCs/>
-                <w:color w:val="FFFFFF"/>
-                <w:sz w:val="20"/>
-                <w:szCs w:val="28"/>
-              </w:rPr>
-              <w:t>Тести­рование</w:t>
+            <w:r>
+              <w:t>БД</w:t>
             </w:r>
           </w:p>
         </w:tc>
@@ -8479,28 +8301,9 @@
             </w:tcMar>
           </w:tcPr>
           <w:p>
-            <w:pPr>
-              <w:spacing w:after="30" w:line="245" w:lineRule="auto"/>
-              <w:jc w:val="center"/>
-              <w:rPr>
-                <w:rFonts w:ascii="Times New Roman" w:hAnsi="Times New Roman" w:cs="Times New Roman"/>
-                <w:sz w:val="20"/>
-                <w:szCs w:val="28"/>
-              </w:rPr>
-            </w:pPr>
-            <w:proofErr w:type="spellStart"/>
-            <w:r>
-              <w:rPr>
-                <w:rFonts w:ascii="Times New Roman" w:hAnsi="Times New Roman" w:cs="Times New Roman"/>
-                <w:b/>
-                <w:bCs/>
-                <w:color w:val="FFFFFF"/>
-                <w:sz w:val="20"/>
-                <w:szCs w:val="28"/>
-              </w:rPr>
-              <w:t>DevOps</w:t>
-            </w:r>
-            <w:proofErr w:type="spellEnd"/>
+            <w:r>
+              <w:t>Лог.</w:t>
+            </w:r>
           </w:p>
         </w:tc>
         <w:tc>
@@ -8515,25 +8318,8 @@
             </w:tcMar>
           </w:tcPr>
           <w:p>
-            <w:pPr>
-              <w:spacing w:after="30" w:line="245" w:lineRule="auto"/>
-              <w:jc w:val="center"/>
-              <w:rPr>
-                <w:rFonts w:ascii="Times New Roman" w:hAnsi="Times New Roman" w:cs="Times New Roman"/>
-                <w:sz w:val="20"/>
-                <w:szCs w:val="28"/>
-              </w:rPr>
-            </w:pPr>
-            <w:r>
-              <w:rPr>
-                <w:rFonts w:ascii="Times New Roman" w:hAnsi="Times New Roman" w:cs="Times New Roman"/>
-                <w:b/>
-                <w:bCs/>
-                <w:color w:val="FFFFFF"/>
-                <w:sz w:val="20"/>
-                <w:szCs w:val="28"/>
-              </w:rPr>
-              <w:t>UX/UI</w:t>
+            <w:r>
+              <w:t>Тесты</w:t>
             </w:r>
           </w:p>
         </w:tc>
@@ -8549,25 +8335,8 @@
             </w:tcMar>
           </w:tcPr>
           <w:p>
-            <w:pPr>
-              <w:spacing w:after="30" w:line="245" w:lineRule="auto"/>
-              <w:jc w:val="center"/>
-              <w:rPr>
-                <w:rFonts w:ascii="Times New Roman" w:hAnsi="Times New Roman" w:cs="Times New Roman"/>
-                <w:sz w:val="20"/>
-                <w:szCs w:val="28"/>
-              </w:rPr>
-            </w:pPr>
-            <w:r>
-              <w:rPr>
-                <w:rFonts w:ascii="Times New Roman" w:hAnsi="Times New Roman" w:cs="Times New Roman"/>
-                <w:b/>
-                <w:bCs/>
-                <w:color w:val="FFFFFF"/>
-                <w:sz w:val="20"/>
-                <w:szCs w:val="28"/>
-              </w:rPr>
-              <w:t>Доку­менты</w:t>
+            <w:r>
+              <w:t>Анал.</w:t>
             </w:r>
           </w:p>
         </w:tc>
@@ -8583,24 +8352,8 @@
             </w:tcMar>
           </w:tcPr>
           <w:p>
-            <w:pPr>
-              <w:spacing w:after="30" w:line="245" w:lineRule="auto"/>
-              <w:rPr>
-                <w:rFonts w:ascii="Times New Roman" w:hAnsi="Times New Roman" w:cs="Times New Roman"/>
-                <w:sz w:val="20"/>
-                <w:szCs w:val="28"/>
-              </w:rPr>
-            </w:pPr>
-            <w:r>
-              <w:rPr>
-                <w:rFonts w:ascii="Times New Roman" w:hAnsi="Times New Roman" w:cs="Times New Roman"/>
-                <w:b/>
-                <w:bCs/>
-                <w:color w:val="FFFFFF"/>
-                <w:sz w:val="20"/>
-                <w:szCs w:val="28"/>
-              </w:rPr>
-              <w:t>Хочу развить</w:t>
+            <w:r>
+              <w:t>Развить</w:t>
             </w:r>
           </w:p>
         </w:tc>
@@ -8654,6 +8407,22 @@
           </w:tcPr>
           <w:p>
             <w:r>
+              <w:t>0</w:t>
+            </w:r>
+          </w:p>
+        </w:tc>
+        <w:tc>
+          <w:tcPr>
+            <w:tcW w:w="830" w:type="dxa"/>
+            <w:tcMar>
+              <w:top w:w="45" w:type="dxa"/>
+              <w:left w:w="80" w:type="dxa"/>
+              <w:bottom w:w="45" w:type="dxa"/>
+              <w:right w:w="80" w:type="dxa"/>
+            </w:tcMar>
+          </w:tcPr>
+          <w:p>
+            <w:r>
               <w:t>—</w:t>
             </w:r>
           </w:p>
@@ -8718,13 +8487,29 @@
           </w:tcPr>
           <w:p>
             <w:r>
+              <w:t>1</w:t>
+            </w:r>
+          </w:p>
+        </w:tc>
+        <w:tc>
+          <w:tcPr>
+            <w:tcW w:w="830" w:type="dxa"/>
+            <w:tcMar>
+              <w:top w:w="45" w:type="dxa"/>
+              <w:left w:w="80" w:type="dxa"/>
+              <w:bottom w:w="45" w:type="dxa"/>
+              <w:right w:w="80" w:type="dxa"/>
+            </w:tcMar>
+          </w:tcPr>
+          <w:p>
+            <w:r>
               <w:t>—</w:t>
             </w:r>
           </w:p>
         </w:tc>
         <w:tc>
           <w:tcPr>
-            <w:tcW w:w="830" w:type="dxa"/>
+            <w:tcW w:w="1308" w:type="dxa"/>
             <w:tcMar>
               <w:top w:w="45" w:type="dxa"/>
               <w:left w:w="80" w:type="dxa"/>
@@ -8735,38 +8520,6 @@
           <w:p>
             <w:r>
               <w:t>—</w:t>
-            </w:r>
-          </w:p>
-        </w:tc>
-        <w:tc>
-          <w:tcPr>
-            <w:tcW w:w="830" w:type="dxa"/>
-            <w:tcMar>
-              <w:top w:w="45" w:type="dxa"/>
-              <w:left w:w="80" w:type="dxa"/>
-              <w:bottom w:w="45" w:type="dxa"/>
-              <w:right w:w="80" w:type="dxa"/>
-            </w:tcMar>
-          </w:tcPr>
-          <w:p>
-            <w:r>
-              <w:t>—</w:t>
-            </w:r>
-          </w:p>
-        </w:tc>
-        <w:tc>
-          <w:tcPr>
-            <w:tcW w:w="1308" w:type="dxa"/>
-            <w:tcMar>
-              <w:top w:w="45" w:type="dxa"/>
-              <w:left w:w="80" w:type="dxa"/>
-              <w:bottom w:w="45" w:type="dxa"/>
-              <w:right w:w="80" w:type="dxa"/>
-            </w:tcMar>
-          </w:tcPr>
-          <w:p>
-            <w:r>
-              <w:t>Заполняется участником после самооценки</w:t>
             </w:r>
           </w:p>
         </w:tc>
@@ -8820,6 +8573,22 @@
           </w:tcPr>
           <w:p>
             <w:r>
+              <w:t>3</w:t>
+            </w:r>
+          </w:p>
+        </w:tc>
+        <w:tc>
+          <w:tcPr>
+            <w:tcW w:w="830" w:type="dxa"/>
+            <w:tcMar>
+              <w:top w:w="45" w:type="dxa"/>
+              <w:left w:w="80" w:type="dxa"/>
+              <w:bottom w:w="45" w:type="dxa"/>
+              <w:right w:w="80" w:type="dxa"/>
+            </w:tcMar>
+          </w:tcPr>
+          <w:p>
+            <w:r>
               <w:t>—</w:t>
             </w:r>
           </w:p>
@@ -8884,13 +8653,29 @@
           </w:tcPr>
           <w:p>
             <w:r>
+              <w:t>1</w:t>
+            </w:r>
+          </w:p>
+        </w:tc>
+        <w:tc>
+          <w:tcPr>
+            <w:tcW w:w="830" w:type="dxa"/>
+            <w:tcMar>
+              <w:top w:w="45" w:type="dxa"/>
+              <w:left w:w="80" w:type="dxa"/>
+              <w:bottom w:w="45" w:type="dxa"/>
+              <w:right w:w="80" w:type="dxa"/>
+            </w:tcMar>
+          </w:tcPr>
+          <w:p>
+            <w:r>
               <w:t>—</w:t>
             </w:r>
           </w:p>
         </w:tc>
         <w:tc>
           <w:tcPr>
-            <w:tcW w:w="830" w:type="dxa"/>
+            <w:tcW w:w="1308" w:type="dxa"/>
             <w:tcMar>
               <w:top w:w="45" w:type="dxa"/>
               <w:left w:w="80" w:type="dxa"/>
@@ -8901,38 +8686,6 @@
           <w:p>
             <w:r>
               <w:t>—</w:t>
-            </w:r>
-          </w:p>
-        </w:tc>
-        <w:tc>
-          <w:tcPr>
-            <w:tcW w:w="830" w:type="dxa"/>
-            <w:tcMar>
-              <w:top w:w="45" w:type="dxa"/>
-              <w:left w:w="80" w:type="dxa"/>
-              <w:bottom w:w="45" w:type="dxa"/>
-              <w:right w:w="80" w:type="dxa"/>
-            </w:tcMar>
-          </w:tcPr>
-          <w:p>
-            <w:r>
-              <w:t>—</w:t>
-            </w:r>
-          </w:p>
-        </w:tc>
-        <w:tc>
-          <w:tcPr>
-            <w:tcW w:w="1308" w:type="dxa"/>
-            <w:tcMar>
-              <w:top w:w="45" w:type="dxa"/>
-              <w:left w:w="80" w:type="dxa"/>
-              <w:bottom w:w="45" w:type="dxa"/>
-              <w:right w:w="80" w:type="dxa"/>
-            </w:tcMar>
-          </w:tcPr>
-          <w:p>
-            <w:r>
-              <w:t>Заполняется участником после самооценки</w:t>
             </w:r>
           </w:p>
         </w:tc>
@@ -8986,6 +8739,22 @@
           </w:tcPr>
           <w:p>
             <w:r>
+              <w:t>2</w:t>
+            </w:r>
+          </w:p>
+        </w:tc>
+        <w:tc>
+          <w:tcPr>
+            <w:tcW w:w="830" w:type="dxa"/>
+            <w:tcMar>
+              <w:top w:w="45" w:type="dxa"/>
+              <w:left w:w="80" w:type="dxa"/>
+              <w:bottom w:w="45" w:type="dxa"/>
+              <w:right w:w="80" w:type="dxa"/>
+            </w:tcMar>
+          </w:tcPr>
+          <w:p>
+            <w:r>
               <w:t>—</w:t>
             </w:r>
           </w:p>
@@ -9050,13 +8819,29 @@
           </w:tcPr>
           <w:p>
             <w:r>
+              <w:t>3</w:t>
+            </w:r>
+          </w:p>
+        </w:tc>
+        <w:tc>
+          <w:tcPr>
+            <w:tcW w:w="830" w:type="dxa"/>
+            <w:tcMar>
+              <w:top w:w="45" w:type="dxa"/>
+              <w:left w:w="80" w:type="dxa"/>
+              <w:bottom w:w="45" w:type="dxa"/>
+              <w:right w:w="80" w:type="dxa"/>
+            </w:tcMar>
+          </w:tcPr>
+          <w:p>
+            <w:r>
               <w:t>—</w:t>
             </w:r>
           </w:p>
         </w:tc>
         <w:tc>
           <w:tcPr>
-            <w:tcW w:w="830" w:type="dxa"/>
+            <w:tcW w:w="1308" w:type="dxa"/>
             <w:tcMar>
               <w:top w:w="45" w:type="dxa"/>
               <w:left w:w="80" w:type="dxa"/>
@@ -9067,38 +8852,6 @@
           <w:p>
             <w:r>
               <w:t>—</w:t>
-            </w:r>
-          </w:p>
-        </w:tc>
-        <w:tc>
-          <w:tcPr>
-            <w:tcW w:w="830" w:type="dxa"/>
-            <w:tcMar>
-              <w:top w:w="45" w:type="dxa"/>
-              <w:left w:w="80" w:type="dxa"/>
-              <w:bottom w:w="45" w:type="dxa"/>
-              <w:right w:w="80" w:type="dxa"/>
-            </w:tcMar>
-          </w:tcPr>
-          <w:p>
-            <w:r>
-              <w:t>—</w:t>
-            </w:r>
-          </w:p>
-        </w:tc>
-        <w:tc>
-          <w:tcPr>
-            <w:tcW w:w="1308" w:type="dxa"/>
-            <w:tcMar>
-              <w:top w:w="45" w:type="dxa"/>
-              <w:left w:w="80" w:type="dxa"/>
-              <w:bottom w:w="45" w:type="dxa"/>
-              <w:right w:w="80" w:type="dxa"/>
-            </w:tcMar>
-          </w:tcPr>
-          <w:p>
-            <w:r>
-              <w:t>Заполняется участником после самооценки</w:t>
             </w:r>
           </w:p>
         </w:tc>
@@ -9264,7 +9017,7 @@
           </w:tcPr>
           <w:p>
             <w:r>
-              <w:t>Заполняется участником после самооценки</w:t>
+              <w:t>—</w:t>
             </w:r>
           </w:p>
         </w:tc>
@@ -9770,14 +9523,9 @@
       </w:pPr>
       <w:r>
         <w:rPr>
-          <w:rFonts w:ascii="Times New Roman" w:hAnsi="Times New Roman" w:cs="Times New Roman"/>
-          <w:i/>
-          <w:iCs/>
-          <w:color w:val="7F7F7F"/>
           <w:sz w:val="20"/>
-          <w:szCs w:val="28"/>
-        </w:rPr>
-        <w:t>В команде из трёх человек роль UX / технического писателя распределяется между участниками. Код пишут все.</w:t>
+        </w:rPr>
+        <w:t>В команде из четырёх человек роли распределены по таблице. Код пишут все участники; UX и техническую документацию ведут назначенные участники.</w:t>
       </w:r>
     </w:p>
     <w:p>

</xml_diff>

<commit_message>
Clarify team responsibilities and competency matrix
</commit_message>
<xml_diff>
--- a/docs/lab-01/ЛР1_Отчёт_GoCue.docx
+++ b/docs/lab-01/ЛР1_Отчёт_GoCue.docx
@@ -826,7 +826,7 @@
           </w:tcPr>
           <w:p>
             <w:r>
-              <w:t>Нативное приложение: Android/Kotlin/Jetpack Compose/Room либо iOS/Swift/SwiftUI/SwiftData. Платформу определим после оценки навыков и устройств. Доменная логика отделена от GPS.</w:t>
+              <w:t>Нативное приложение: Android/Kotlin/Jetpack Compose/Room либо iOS/Swift/SwiftUI/SwiftData. Платформу определим после оценки навыков и устройств. Правила показа намерений отделены от данных GPS.</w:t>
             </w:r>
           </w:p>
         </w:tc>
@@ -8148,230 +8148,36 @@
         <w:rPr>
           <w:sz w:val="20"/>
         </w:rPr>
-        <w:t>Шкала: 0 – не знаю, 1 – базовый уровень, 2 – уверенно, 3 – могу научить других. Моб. код — нативная разработка; Гео — геолокация и геозоны; Фон — фоновая работа и уведомления; БД — локальное хранение; Лог. — архитектура и оценка намерений; Анал. — продуктовая аналитика и документация.</w:t>
+        <w:t>Шкала: 0 – не знаю, 1 – базовый уровень, 2 – уверенно, 3 – могу научить других. Оценки выставляет сам участник команды.</w:t>
       </w:r>
     </w:p>
     <w:tbl>
       <w:tblPr>
-        <w:tblW w:w="9848" w:type="dxa"/>
-        <w:tblInd w:w="70" w:type="dxa"/>
-        <w:tblBorders>
-          <w:top w:val="single" w:sz="4" w:space="0" w:color="BFC9D6"/>
-          <w:left w:val="single" w:sz="4" w:space="0" w:color="BFC9D6"/>
-          <w:bottom w:val="single" w:sz="4" w:space="0" w:color="BFC9D6"/>
-          <w:right w:val="single" w:sz="4" w:space="0" w:color="BFC9D6"/>
-          <w:insideH w:val="single" w:sz="4" w:space="0" w:color="BFC9D6"/>
-          <w:insideV w:val="single" w:sz="4" w:space="0" w:color="BFC9D6"/>
-        </w:tblBorders>
+        <w:tblW w:type="auto" w:w="0"/>
         <w:tblLayout w:type="fixed"/>
-        <w:tblCellMar>
-          <w:left w:w="10" w:type="dxa"/>
-          <w:right w:w="10" w:type="dxa"/>
-        </w:tblCellMar>
-        <w:tblLook w:val="04A0" w:firstRow="1" w:lastRow="0" w:firstColumn="1" w:lastColumn="0" w:noHBand="0" w:noVBand="1"/>
+        <w:tblLook w:firstColumn="1" w:firstRow="1" w:lastColumn="0" w:lastRow="0" w:noHBand="0" w:noVBand="1" w:val="04A0"/>
       </w:tblPr>
       <w:tblGrid>
-        <w:gridCol w:w="1900"/>
-        <w:gridCol w:w="830"/>
-        <w:gridCol w:w="830"/>
-        <w:gridCol w:w="830"/>
-        <w:gridCol w:w="830"/>
-        <w:gridCol w:w="830"/>
-        <w:gridCol w:w="830"/>
-        <w:gridCol w:w="830"/>
-        <w:gridCol w:w="830"/>
-        <w:gridCol w:w="1308"/>
+        <w:gridCol w:w="3402"/>
+        <w:gridCol w:w="1417"/>
+        <w:gridCol w:w="1701"/>
+        <w:gridCol w:w="1701"/>
+        <w:gridCol w:w="1417"/>
       </w:tblGrid>
       <w:tr>
-        <w:trPr>
-          <w:cantSplit/>
-          <w:tblHeader/>
-        </w:trPr>
-        <w:tc>
-          <w:tcPr>
-            <w:tcW w:w="1900" w:type="dxa"/>
-            <w:shd w:val="clear" w:color="auto" w:fill="1F3864"/>
-            <w:tcMar>
-              <w:top w:w="45" w:type="dxa"/>
-              <w:left w:w="80" w:type="dxa"/>
-              <w:bottom w:w="45" w:type="dxa"/>
-              <w:right w:w="80" w:type="dxa"/>
-            </w:tcMar>
-          </w:tcPr>
-          <w:p>
-            <w:r>
-              <w:t>Участник</w:t>
-            </w:r>
-          </w:p>
-        </w:tc>
-        <w:tc>
-          <w:tcPr>
-            <w:tcW w:w="830" w:type="dxa"/>
-            <w:shd w:val="clear" w:color="auto" w:fill="1F3864"/>
-            <w:tcMar>
-              <w:top w:w="45" w:type="dxa"/>
-              <w:left w:w="80" w:type="dxa"/>
-              <w:bottom w:w="45" w:type="dxa"/>
-              <w:right w:w="80" w:type="dxa"/>
-            </w:tcMar>
-          </w:tcPr>
-          <w:p>
-            <w:r>
-              <w:t>Моб. код</w:t>
-            </w:r>
-          </w:p>
-        </w:tc>
-        <w:tc>
-          <w:tcPr>
-            <w:tcW w:w="830" w:type="dxa"/>
-            <w:shd w:val="clear" w:color="auto" w:fill="1F3864"/>
-            <w:tcMar>
-              <w:top w:w="45" w:type="dxa"/>
-              <w:left w:w="80" w:type="dxa"/>
-              <w:bottom w:w="45" w:type="dxa"/>
-              <w:right w:w="80" w:type="dxa"/>
-            </w:tcMar>
-          </w:tcPr>
-          <w:p>
-            <w:r>
-              <w:t>UI/UX</w:t>
-            </w:r>
-          </w:p>
-        </w:tc>
-        <w:tc>
-          <w:tcPr>
-            <w:tcW w:w="830" w:type="dxa"/>
-            <w:shd w:val="clear" w:color="auto" w:fill="1F3864"/>
-            <w:tcMar>
-              <w:top w:w="45" w:type="dxa"/>
-              <w:left w:w="80" w:type="dxa"/>
-              <w:bottom w:w="45" w:type="dxa"/>
-              <w:right w:w="80" w:type="dxa"/>
-            </w:tcMar>
-          </w:tcPr>
-          <w:p>
-            <w:r>
-              <w:t>Гео</w:t>
-            </w:r>
-          </w:p>
-        </w:tc>
-        <w:tc>
-          <w:tcPr>
-            <w:tcW w:w="830" w:type="dxa"/>
-            <w:shd w:val="clear" w:color="auto" w:fill="1F3864"/>
-            <w:tcMar>
-              <w:top w:w="45" w:type="dxa"/>
-              <w:left w:w="80" w:type="dxa"/>
-              <w:bottom w:w="45" w:type="dxa"/>
-              <w:right w:w="80" w:type="dxa"/>
-            </w:tcMar>
-          </w:tcPr>
-          <w:p>
-            <w:r>
-              <w:t>Фон</w:t>
-            </w:r>
-          </w:p>
-        </w:tc>
-        <w:tc>
-          <w:tcPr>
-            <w:tcW w:w="830" w:type="dxa"/>
-            <w:shd w:val="clear" w:color="auto" w:fill="1F3864"/>
-            <w:tcMar>
-              <w:top w:w="45" w:type="dxa"/>
-              <w:left w:w="80" w:type="dxa"/>
-              <w:bottom w:w="45" w:type="dxa"/>
-              <w:right w:w="80" w:type="dxa"/>
-            </w:tcMar>
-          </w:tcPr>
-          <w:p>
-            <w:r>
-              <w:t>БД</w:t>
-            </w:r>
-          </w:p>
-        </w:tc>
-        <w:tc>
-          <w:tcPr>
-            <w:tcW w:w="830" w:type="dxa"/>
-            <w:shd w:val="clear" w:color="auto" w:fill="1F3864"/>
-            <w:tcMar>
-              <w:top w:w="45" w:type="dxa"/>
-              <w:left w:w="80" w:type="dxa"/>
-              <w:bottom w:w="45" w:type="dxa"/>
-              <w:right w:w="80" w:type="dxa"/>
-            </w:tcMar>
-          </w:tcPr>
-          <w:p>
-            <w:r>
-              <w:t>Лог.</w:t>
-            </w:r>
-          </w:p>
-        </w:tc>
-        <w:tc>
-          <w:tcPr>
-            <w:tcW w:w="830" w:type="dxa"/>
-            <w:shd w:val="clear" w:color="auto" w:fill="1F3864"/>
-            <w:tcMar>
-              <w:top w:w="45" w:type="dxa"/>
-              <w:left w:w="80" w:type="dxa"/>
-              <w:bottom w:w="45" w:type="dxa"/>
-              <w:right w:w="80" w:type="dxa"/>
-            </w:tcMar>
-          </w:tcPr>
-          <w:p>
-            <w:r>
-              <w:t>Тесты</w:t>
-            </w:r>
-          </w:p>
-        </w:tc>
-        <w:tc>
-          <w:tcPr>
-            <w:tcW w:w="830" w:type="dxa"/>
-            <w:shd w:val="clear" w:color="auto" w:fill="1F3864"/>
-            <w:tcMar>
-              <w:top w:w="45" w:type="dxa"/>
-              <w:left w:w="80" w:type="dxa"/>
-              <w:bottom w:w="45" w:type="dxa"/>
-              <w:right w:w="80" w:type="dxa"/>
-            </w:tcMar>
-          </w:tcPr>
-          <w:p>
-            <w:r>
-              <w:t>Анал.</w:t>
-            </w:r>
-          </w:p>
-        </w:tc>
-        <w:tc>
-          <w:tcPr>
-            <w:tcW w:w="1308" w:type="dxa"/>
-            <w:shd w:val="clear" w:color="auto" w:fill="1F3864"/>
-            <w:tcMar>
-              <w:top w:w="45" w:type="dxa"/>
-              <w:left w:w="80" w:type="dxa"/>
-              <w:bottom w:w="45" w:type="dxa"/>
-              <w:right w:w="80" w:type="dxa"/>
-            </w:tcMar>
-          </w:tcPr>
-          <w:p>
-            <w:r>
-              <w:t>Развить</w:t>
-            </w:r>
-          </w:p>
-        </w:tc>
-      </w:tr>
-      <w:tr>
-        <w:trPr>
-          <w:cantSplit/>
-          <w:trHeight w:val="460"/>
-        </w:trPr>
-        <w:tc>
-          <w:tcPr>
-            <w:tcW w:w="1900" w:type="dxa"/>
-            <w:tcMar>
-              <w:top w:w="45" w:type="dxa"/>
-              <w:left w:w="80" w:type="dxa"/>
-              <w:bottom w:w="45" w:type="dxa"/>
-              <w:right w:w="80" w:type="dxa"/>
-            </w:tcMar>
+        <w:tc>
+          <w:tcPr>
+            <w:tcW w:type="dxa" w:w="3402"/>
+          </w:tcPr>
+          <w:p>
+            <w:r>
+              <w:t>Компетенция</w:t>
+            </w:r>
+          </w:p>
+        </w:tc>
+        <w:tc>
+          <w:tcPr>
+            <w:tcW w:type="dxa" w:w="1417"/>
           </w:tcPr>
           <w:p>
             <w:r>
@@ -8381,13 +8187,49 @@
         </w:tc>
         <w:tc>
           <w:tcPr>
-            <w:tcW w:w="830" w:type="dxa"/>
-            <w:tcMar>
-              <w:top w:w="45" w:type="dxa"/>
-              <w:left w:w="80" w:type="dxa"/>
-              <w:bottom w:w="45" w:type="dxa"/>
-              <w:right w:w="80" w:type="dxa"/>
-            </w:tcMar>
+            <w:tcW w:type="dxa" w:w="1701"/>
+          </w:tcPr>
+          <w:p>
+            <w:r>
+              <w:t>Бартоломей А. М.</w:t>
+            </w:r>
+          </w:p>
+        </w:tc>
+        <w:tc>
+          <w:tcPr>
+            <w:tcW w:type="dxa" w:w="1701"/>
+          </w:tcPr>
+          <w:p>
+            <w:r>
+              <w:t>Золотилина Е. С.</w:t>
+            </w:r>
+          </w:p>
+        </w:tc>
+        <w:tc>
+          <w:tcPr>
+            <w:tcW w:type="dxa" w:w="1417"/>
+          </w:tcPr>
+          <w:p>
+            <w:r>
+              <w:t>Поспелова М. Т.</w:t>
+            </w:r>
+          </w:p>
+        </w:tc>
+      </w:tr>
+      <w:tr>
+        <w:tc>
+          <w:tcPr>
+            <w:tcW w:type="dxa" w:w="3402"/>
+          </w:tcPr>
+          <w:p>
+            <w:r>
+              <w:t>Мобильная разработка</w:t>
+            </w:r>
+          </w:p>
+        </w:tc>
+        <w:tc>
+          <w:tcPr>
+            <w:tcW w:type="dxa" w:w="1417"/>
           </w:tcPr>
           <w:p>
             <w:r>
@@ -8397,13 +8239,49 @@
         </w:tc>
         <w:tc>
           <w:tcPr>
-            <w:tcW w:w="830" w:type="dxa"/>
-            <w:tcMar>
-              <w:top w:w="45" w:type="dxa"/>
-              <w:left w:w="80" w:type="dxa"/>
-              <w:bottom w:w="45" w:type="dxa"/>
-              <w:right w:w="80" w:type="dxa"/>
-            </w:tcMar>
+            <w:tcW w:type="dxa" w:w="1701"/>
+          </w:tcPr>
+          <w:p>
+            <w:r>
+              <w:t>—</w:t>
+            </w:r>
+          </w:p>
+        </w:tc>
+        <w:tc>
+          <w:tcPr>
+            <w:tcW w:type="dxa" w:w="1701"/>
+          </w:tcPr>
+          <w:p>
+            <w:r>
+              <w:t>—</w:t>
+            </w:r>
+          </w:p>
+        </w:tc>
+        <w:tc>
+          <w:tcPr>
+            <w:tcW w:type="dxa" w:w="1417"/>
+          </w:tcPr>
+          <w:p>
+            <w:r>
+              <w:t>—</w:t>
+            </w:r>
+          </w:p>
+        </w:tc>
+      </w:tr>
+      <w:tr>
+        <w:tc>
+          <w:tcPr>
+            <w:tcW w:type="dxa" w:w="3402"/>
+          </w:tcPr>
+          <w:p>
+            <w:r>
+              <w:t>Проектирование мобильного интерфейса</w:t>
+            </w:r>
+          </w:p>
+        </w:tc>
+        <w:tc>
+          <w:tcPr>
+            <w:tcW w:type="dxa" w:w="1417"/>
           </w:tcPr>
           <w:p>
             <w:r>
@@ -8413,13 +8291,27 @@
         </w:tc>
         <w:tc>
           <w:tcPr>
-            <w:tcW w:w="830" w:type="dxa"/>
-            <w:tcMar>
-              <w:top w:w="45" w:type="dxa"/>
-              <w:left w:w="80" w:type="dxa"/>
-              <w:bottom w:w="45" w:type="dxa"/>
-              <w:right w:w="80" w:type="dxa"/>
-            </w:tcMar>
+            <w:tcW w:type="dxa" w:w="1701"/>
+          </w:tcPr>
+          <w:p>
+            <w:r>
+              <w:t>3</w:t>
+            </w:r>
+          </w:p>
+        </w:tc>
+        <w:tc>
+          <w:tcPr>
+            <w:tcW w:type="dxa" w:w="1701"/>
+          </w:tcPr>
+          <w:p>
+            <w:r>
+              <w:t>2</w:t>
+            </w:r>
+          </w:p>
+        </w:tc>
+        <w:tc>
+          <w:tcPr>
+            <w:tcW w:type="dxa" w:w="1417"/>
           </w:tcPr>
           <w:p>
             <w:r>
@@ -8427,15 +8319,21 @@
             </w:r>
           </w:p>
         </w:tc>
-        <w:tc>
-          <w:tcPr>
-            <w:tcW w:w="830" w:type="dxa"/>
-            <w:tcMar>
-              <w:top w:w="45" w:type="dxa"/>
-              <w:left w:w="80" w:type="dxa"/>
-              <w:bottom w:w="45" w:type="dxa"/>
-              <w:right w:w="80" w:type="dxa"/>
-            </w:tcMar>
+      </w:tr>
+      <w:tr>
+        <w:tc>
+          <w:tcPr>
+            <w:tcW w:type="dxa" w:w="3402"/>
+          </w:tcPr>
+          <w:p>
+            <w:r>
+              <w:t>Геолокация и геозоны</w:t>
+            </w:r>
+          </w:p>
+        </w:tc>
+        <w:tc>
+          <w:tcPr>
+            <w:tcW w:type="dxa" w:w="1417"/>
           </w:tcPr>
           <w:p>
             <w:r>
@@ -8445,13 +8343,7 @@
         </w:tc>
         <w:tc>
           <w:tcPr>
-            <w:tcW w:w="830" w:type="dxa"/>
-            <w:tcMar>
-              <w:top w:w="45" w:type="dxa"/>
-              <w:left w:w="80" w:type="dxa"/>
-              <w:bottom w:w="45" w:type="dxa"/>
-              <w:right w:w="80" w:type="dxa"/>
-            </w:tcMar>
+            <w:tcW w:type="dxa" w:w="1701"/>
           </w:tcPr>
           <w:p>
             <w:r>
@@ -8461,13 +8353,7 @@
         </w:tc>
         <w:tc>
           <w:tcPr>
-            <w:tcW w:w="830" w:type="dxa"/>
-            <w:tcMar>
-              <w:top w:w="45" w:type="dxa"/>
-              <w:left w:w="80" w:type="dxa"/>
-              <w:bottom w:w="45" w:type="dxa"/>
-              <w:right w:w="80" w:type="dxa"/>
-            </w:tcMar>
+            <w:tcW w:type="dxa" w:w="1701"/>
           </w:tcPr>
           <w:p>
             <w:r>
@@ -8477,13 +8363,185 @@
         </w:tc>
         <w:tc>
           <w:tcPr>
-            <w:tcW w:w="830" w:type="dxa"/>
-            <w:tcMar>
-              <w:top w:w="45" w:type="dxa"/>
-              <w:left w:w="80" w:type="dxa"/>
-              <w:bottom w:w="45" w:type="dxa"/>
-              <w:right w:w="80" w:type="dxa"/>
-            </w:tcMar>
+            <w:tcW w:type="dxa" w:w="1417"/>
+          </w:tcPr>
+          <w:p>
+            <w:r>
+              <w:t>—</w:t>
+            </w:r>
+          </w:p>
+        </w:tc>
+      </w:tr>
+      <w:tr>
+        <w:tc>
+          <w:tcPr>
+            <w:tcW w:type="dxa" w:w="3402"/>
+          </w:tcPr>
+          <w:p>
+            <w:r>
+              <w:t>Фоновая работа и уведомления</w:t>
+            </w:r>
+          </w:p>
+        </w:tc>
+        <w:tc>
+          <w:tcPr>
+            <w:tcW w:type="dxa" w:w="1417"/>
+          </w:tcPr>
+          <w:p>
+            <w:r>
+              <w:t>—</w:t>
+            </w:r>
+          </w:p>
+        </w:tc>
+        <w:tc>
+          <w:tcPr>
+            <w:tcW w:type="dxa" w:w="1701"/>
+          </w:tcPr>
+          <w:p>
+            <w:r>
+              <w:t>—</w:t>
+            </w:r>
+          </w:p>
+        </w:tc>
+        <w:tc>
+          <w:tcPr>
+            <w:tcW w:type="dxa" w:w="1701"/>
+          </w:tcPr>
+          <w:p>
+            <w:r>
+              <w:t>—</w:t>
+            </w:r>
+          </w:p>
+        </w:tc>
+        <w:tc>
+          <w:tcPr>
+            <w:tcW w:type="dxa" w:w="1417"/>
+          </w:tcPr>
+          <w:p>
+            <w:r>
+              <w:t>—</w:t>
+            </w:r>
+          </w:p>
+        </w:tc>
+      </w:tr>
+      <w:tr>
+        <w:tc>
+          <w:tcPr>
+            <w:tcW w:type="dxa" w:w="3402"/>
+          </w:tcPr>
+          <w:p>
+            <w:r>
+              <w:t>Локальное хранение данных</w:t>
+            </w:r>
+          </w:p>
+        </w:tc>
+        <w:tc>
+          <w:tcPr>
+            <w:tcW w:type="dxa" w:w="1417"/>
+          </w:tcPr>
+          <w:p>
+            <w:r>
+              <w:t>—</w:t>
+            </w:r>
+          </w:p>
+        </w:tc>
+        <w:tc>
+          <w:tcPr>
+            <w:tcW w:type="dxa" w:w="1701"/>
+          </w:tcPr>
+          <w:p>
+            <w:r>
+              <w:t>—</w:t>
+            </w:r>
+          </w:p>
+        </w:tc>
+        <w:tc>
+          <w:tcPr>
+            <w:tcW w:type="dxa" w:w="1701"/>
+          </w:tcPr>
+          <w:p>
+            <w:r>
+              <w:t>—</w:t>
+            </w:r>
+          </w:p>
+        </w:tc>
+        <w:tc>
+          <w:tcPr>
+            <w:tcW w:type="dxa" w:w="1417"/>
+          </w:tcPr>
+          <w:p>
+            <w:r>
+              <w:t>—</w:t>
+            </w:r>
+          </w:p>
+        </w:tc>
+      </w:tr>
+      <w:tr>
+        <w:tc>
+          <w:tcPr>
+            <w:tcW w:type="dxa" w:w="3402"/>
+          </w:tcPr>
+          <w:p>
+            <w:r>
+              <w:t>Архитектура и логика намерений</w:t>
+            </w:r>
+          </w:p>
+        </w:tc>
+        <w:tc>
+          <w:tcPr>
+            <w:tcW w:type="dxa" w:w="1417"/>
+          </w:tcPr>
+          <w:p>
+            <w:r>
+              <w:t>—</w:t>
+            </w:r>
+          </w:p>
+        </w:tc>
+        <w:tc>
+          <w:tcPr>
+            <w:tcW w:type="dxa" w:w="1701"/>
+          </w:tcPr>
+          <w:p>
+            <w:r>
+              <w:t>—</w:t>
+            </w:r>
+          </w:p>
+        </w:tc>
+        <w:tc>
+          <w:tcPr>
+            <w:tcW w:type="dxa" w:w="1701"/>
+          </w:tcPr>
+          <w:p>
+            <w:r>
+              <w:t>—</w:t>
+            </w:r>
+          </w:p>
+        </w:tc>
+        <w:tc>
+          <w:tcPr>
+            <w:tcW w:type="dxa" w:w="1417"/>
+          </w:tcPr>
+          <w:p>
+            <w:r>
+              <w:t>—</w:t>
+            </w:r>
+          </w:p>
+        </w:tc>
+      </w:tr>
+      <w:tr>
+        <w:tc>
+          <w:tcPr>
+            <w:tcW w:type="dxa" w:w="3402"/>
+          </w:tcPr>
+          <w:p>
+            <w:r>
+              <w:t>Тестирование</w:t>
+            </w:r>
+          </w:p>
+        </w:tc>
+        <w:tc>
+          <w:tcPr>
+            <w:tcW w:type="dxa" w:w="1417"/>
           </w:tcPr>
           <w:p>
             <w:r>
@@ -8493,13 +8551,27 @@
         </w:tc>
         <w:tc>
           <w:tcPr>
-            <w:tcW w:w="830" w:type="dxa"/>
-            <w:tcMar>
-              <w:top w:w="45" w:type="dxa"/>
-              <w:left w:w="80" w:type="dxa"/>
-              <w:bottom w:w="45" w:type="dxa"/>
-              <w:right w:w="80" w:type="dxa"/>
-            </w:tcMar>
+            <w:tcW w:type="dxa" w:w="1701"/>
+          </w:tcPr>
+          <w:p>
+            <w:r>
+              <w:t>1</w:t>
+            </w:r>
+          </w:p>
+        </w:tc>
+        <w:tc>
+          <w:tcPr>
+            <w:tcW w:type="dxa" w:w="1701"/>
+          </w:tcPr>
+          <w:p>
+            <w:r>
+              <w:t>3</w:t>
+            </w:r>
+          </w:p>
+        </w:tc>
+        <w:tc>
+          <w:tcPr>
+            <w:tcW w:type="dxa" w:w="1417"/>
           </w:tcPr>
           <w:p>
             <w:r>
@@ -8507,15 +8579,21 @@
             </w:r>
           </w:p>
         </w:tc>
-        <w:tc>
-          <w:tcPr>
-            <w:tcW w:w="1308" w:type="dxa"/>
-            <w:tcMar>
-              <w:top w:w="45" w:type="dxa"/>
-              <w:left w:w="80" w:type="dxa"/>
-              <w:bottom w:w="45" w:type="dxa"/>
-              <w:right w:w="80" w:type="dxa"/>
-            </w:tcMar>
+      </w:tr>
+      <w:tr>
+        <w:tc>
+          <w:tcPr>
+            <w:tcW w:type="dxa" w:w="3402"/>
+          </w:tcPr>
+          <w:p>
+            <w:r>
+              <w:t>Анализ потребностей пользователей</w:t>
+            </w:r>
+          </w:p>
+        </w:tc>
+        <w:tc>
+          <w:tcPr>
+            <w:tcW w:type="dxa" w:w="1417"/>
           </w:tcPr>
           <w:p>
             <w:r>
@@ -8523,37 +8601,9 @@
             </w:r>
           </w:p>
         </w:tc>
-      </w:tr>
-      <w:tr>
-        <w:trPr>
-          <w:cantSplit/>
-          <w:trHeight w:val="460"/>
-        </w:trPr>
-        <w:tc>
-          <w:tcPr>
-            <w:tcW w:w="1900" w:type="dxa"/>
-            <w:tcMar>
-              <w:top w:w="45" w:type="dxa"/>
-              <w:left w:w="80" w:type="dxa"/>
-              <w:bottom w:w="45" w:type="dxa"/>
-              <w:right w:w="80" w:type="dxa"/>
-            </w:tcMar>
-          </w:tcPr>
-          <w:p>
-            <w:r>
-              <w:t>Бартоломей А. М.</w:t>
-            </w:r>
-          </w:p>
-        </w:tc>
-        <w:tc>
-          <w:tcPr>
-            <w:tcW w:w="830" w:type="dxa"/>
-            <w:tcMar>
-              <w:top w:w="45" w:type="dxa"/>
-              <w:left w:w="80" w:type="dxa"/>
-              <w:bottom w:w="45" w:type="dxa"/>
-              <w:right w:w="80" w:type="dxa"/>
-            </w:tcMar>
+        <w:tc>
+          <w:tcPr>
+            <w:tcW w:type="dxa" w:w="1701"/>
           </w:tcPr>
           <w:p>
             <w:r>
@@ -8563,29 +8613,7 @@
         </w:tc>
         <w:tc>
           <w:tcPr>
-            <w:tcW w:w="830" w:type="dxa"/>
-            <w:tcMar>
-              <w:top w:w="45" w:type="dxa"/>
-              <w:left w:w="80" w:type="dxa"/>
-              <w:bottom w:w="45" w:type="dxa"/>
-              <w:right w:w="80" w:type="dxa"/>
-            </w:tcMar>
-          </w:tcPr>
-          <w:p>
-            <w:r>
-              <w:t>3</w:t>
-            </w:r>
-          </w:p>
-        </w:tc>
-        <w:tc>
-          <w:tcPr>
-            <w:tcW w:w="830" w:type="dxa"/>
-            <w:tcMar>
-              <w:top w:w="45" w:type="dxa"/>
-              <w:left w:w="80" w:type="dxa"/>
-              <w:bottom w:w="45" w:type="dxa"/>
-              <w:right w:w="80" w:type="dxa"/>
-            </w:tcMar>
+            <w:tcW w:type="dxa" w:w="1701"/>
           </w:tcPr>
           <w:p>
             <w:r>
@@ -8595,13 +8623,7 @@
         </w:tc>
         <w:tc>
           <w:tcPr>
-            <w:tcW w:w="830" w:type="dxa"/>
-            <w:tcMar>
-              <w:top w:w="45" w:type="dxa"/>
-              <w:left w:w="80" w:type="dxa"/>
-              <w:bottom w:w="45" w:type="dxa"/>
-              <w:right w:w="80" w:type="dxa"/>
-            </w:tcMar>
+            <w:tcW w:type="dxa" w:w="1417"/>
           </w:tcPr>
           <w:p>
             <w:r>
@@ -8609,15 +8631,21 @@
             </w:r>
           </w:p>
         </w:tc>
-        <w:tc>
-          <w:tcPr>
-            <w:tcW w:w="830" w:type="dxa"/>
-            <w:tcMar>
-              <w:top w:w="45" w:type="dxa"/>
-              <w:left w:w="80" w:type="dxa"/>
-              <w:bottom w:w="45" w:type="dxa"/>
-              <w:right w:w="80" w:type="dxa"/>
-            </w:tcMar>
+      </w:tr>
+      <w:tr>
+        <w:tc>
+          <w:tcPr>
+            <w:tcW w:type="dxa" w:w="3402"/>
+          </w:tcPr>
+          <w:p>
+            <w:r>
+              <w:t>Техническая документация</w:t>
+            </w:r>
+          </w:p>
+        </w:tc>
+        <w:tc>
+          <w:tcPr>
+            <w:tcW w:type="dxa" w:w="1417"/>
           </w:tcPr>
           <w:p>
             <w:r>
@@ -8627,13 +8655,7 @@
         </w:tc>
         <w:tc>
           <w:tcPr>
-            <w:tcW w:w="830" w:type="dxa"/>
-            <w:tcMar>
-              <w:top w:w="45" w:type="dxa"/>
-              <w:left w:w="80" w:type="dxa"/>
-              <w:bottom w:w="45" w:type="dxa"/>
-              <w:right w:w="80" w:type="dxa"/>
-            </w:tcMar>
+            <w:tcW w:type="dxa" w:w="1701"/>
           </w:tcPr>
           <w:p>
             <w:r>
@@ -8643,29 +8665,7 @@
         </w:tc>
         <w:tc>
           <w:tcPr>
-            <w:tcW w:w="830" w:type="dxa"/>
-            <w:tcMar>
-              <w:top w:w="45" w:type="dxa"/>
-              <w:left w:w="80" w:type="dxa"/>
-              <w:bottom w:w="45" w:type="dxa"/>
-              <w:right w:w="80" w:type="dxa"/>
-            </w:tcMar>
-          </w:tcPr>
-          <w:p>
-            <w:r>
-              <w:t>1</w:t>
-            </w:r>
-          </w:p>
-        </w:tc>
-        <w:tc>
-          <w:tcPr>
-            <w:tcW w:w="830" w:type="dxa"/>
-            <w:tcMar>
-              <w:top w:w="45" w:type="dxa"/>
-              <w:left w:w="80" w:type="dxa"/>
-              <w:bottom w:w="45" w:type="dxa"/>
-              <w:right w:w="80" w:type="dxa"/>
-            </w:tcMar>
+            <w:tcW w:type="dxa" w:w="1701"/>
           </w:tcPr>
           <w:p>
             <w:r>
@@ -8675,13 +8675,7 @@
         </w:tc>
         <w:tc>
           <w:tcPr>
-            <w:tcW w:w="1308" w:type="dxa"/>
-            <w:tcMar>
-              <w:top w:w="45" w:type="dxa"/>
-              <w:left w:w="80" w:type="dxa"/>
-              <w:bottom w:w="45" w:type="dxa"/>
-              <w:right w:w="80" w:type="dxa"/>
-            </w:tcMar>
+            <w:tcW w:type="dxa" w:w="1417"/>
           </w:tcPr>
           <w:p>
             <w:r>
@@ -8691,35 +8685,19 @@
         </w:tc>
       </w:tr>
       <w:tr>
-        <w:trPr>
-          <w:cantSplit/>
-          <w:trHeight w:val="460"/>
-        </w:trPr>
-        <w:tc>
-          <w:tcPr>
-            <w:tcW w:w="1900" w:type="dxa"/>
-            <w:tcMar>
-              <w:top w:w="45" w:type="dxa"/>
-              <w:left w:w="80" w:type="dxa"/>
-              <w:bottom w:w="45" w:type="dxa"/>
-              <w:right w:w="80" w:type="dxa"/>
-            </w:tcMar>
-          </w:tcPr>
-          <w:p>
-            <w:r>
-              <w:t>Золотилина Е. С.</w:t>
-            </w:r>
-          </w:p>
-        </w:tc>
-        <w:tc>
-          <w:tcPr>
-            <w:tcW w:w="830" w:type="dxa"/>
-            <w:tcMar>
-              <w:top w:w="45" w:type="dxa"/>
-              <w:left w:w="80" w:type="dxa"/>
-              <w:bottom w:w="45" w:type="dxa"/>
-              <w:right w:w="80" w:type="dxa"/>
-            </w:tcMar>
+        <w:tc>
+          <w:tcPr>
+            <w:tcW w:type="dxa" w:w="3402"/>
+          </w:tcPr>
+          <w:p>
+            <w:r>
+              <w:t>Что хочу развить</w:t>
+            </w:r>
+          </w:p>
+        </w:tc>
+        <w:tc>
+          <w:tcPr>
+            <w:tcW w:type="dxa" w:w="1417"/>
           </w:tcPr>
           <w:p>
             <w:r>
@@ -8729,29 +8707,7 @@
         </w:tc>
         <w:tc>
           <w:tcPr>
-            <w:tcW w:w="830" w:type="dxa"/>
-            <w:tcMar>
-              <w:top w:w="45" w:type="dxa"/>
-              <w:left w:w="80" w:type="dxa"/>
-              <w:bottom w:w="45" w:type="dxa"/>
-              <w:right w:w="80" w:type="dxa"/>
-            </w:tcMar>
-          </w:tcPr>
-          <w:p>
-            <w:r>
-              <w:t>2</w:t>
-            </w:r>
-          </w:p>
-        </w:tc>
-        <w:tc>
-          <w:tcPr>
-            <w:tcW w:w="830" w:type="dxa"/>
-            <w:tcMar>
-              <w:top w:w="45" w:type="dxa"/>
-              <w:left w:w="80" w:type="dxa"/>
-              <w:bottom w:w="45" w:type="dxa"/>
-              <w:right w:w="80" w:type="dxa"/>
-            </w:tcMar>
+            <w:tcW w:type="dxa" w:w="1701"/>
           </w:tcPr>
           <w:p>
             <w:r>
@@ -8761,13 +8717,7 @@
         </w:tc>
         <w:tc>
           <w:tcPr>
-            <w:tcW w:w="830" w:type="dxa"/>
-            <w:tcMar>
-              <w:top w:w="45" w:type="dxa"/>
-              <w:left w:w="80" w:type="dxa"/>
-              <w:bottom w:w="45" w:type="dxa"/>
-              <w:right w:w="80" w:type="dxa"/>
-            </w:tcMar>
+            <w:tcW w:type="dxa" w:w="1701"/>
           </w:tcPr>
           <w:p>
             <w:r>
@@ -8777,243 +8727,7 @@
         </w:tc>
         <w:tc>
           <w:tcPr>
-            <w:tcW w:w="830" w:type="dxa"/>
-            <w:tcMar>
-              <w:top w:w="45" w:type="dxa"/>
-              <w:left w:w="80" w:type="dxa"/>
-              <w:bottom w:w="45" w:type="dxa"/>
-              <w:right w:w="80" w:type="dxa"/>
-            </w:tcMar>
-          </w:tcPr>
-          <w:p>
-            <w:r>
-              <w:t>—</w:t>
-            </w:r>
-          </w:p>
-        </w:tc>
-        <w:tc>
-          <w:tcPr>
-            <w:tcW w:w="830" w:type="dxa"/>
-            <w:tcMar>
-              <w:top w:w="45" w:type="dxa"/>
-              <w:left w:w="80" w:type="dxa"/>
-              <w:bottom w:w="45" w:type="dxa"/>
-              <w:right w:w="80" w:type="dxa"/>
-            </w:tcMar>
-          </w:tcPr>
-          <w:p>
-            <w:r>
-              <w:t>—</w:t>
-            </w:r>
-          </w:p>
-        </w:tc>
-        <w:tc>
-          <w:tcPr>
-            <w:tcW w:w="830" w:type="dxa"/>
-            <w:tcMar>
-              <w:top w:w="45" w:type="dxa"/>
-              <w:left w:w="80" w:type="dxa"/>
-              <w:bottom w:w="45" w:type="dxa"/>
-              <w:right w:w="80" w:type="dxa"/>
-            </w:tcMar>
-          </w:tcPr>
-          <w:p>
-            <w:r>
-              <w:t>3</w:t>
-            </w:r>
-          </w:p>
-        </w:tc>
-        <w:tc>
-          <w:tcPr>
-            <w:tcW w:w="830" w:type="dxa"/>
-            <w:tcMar>
-              <w:top w:w="45" w:type="dxa"/>
-              <w:left w:w="80" w:type="dxa"/>
-              <w:bottom w:w="45" w:type="dxa"/>
-              <w:right w:w="80" w:type="dxa"/>
-            </w:tcMar>
-          </w:tcPr>
-          <w:p>
-            <w:r>
-              <w:t>—</w:t>
-            </w:r>
-          </w:p>
-        </w:tc>
-        <w:tc>
-          <w:tcPr>
-            <w:tcW w:w="1308" w:type="dxa"/>
-            <w:tcMar>
-              <w:top w:w="45" w:type="dxa"/>
-              <w:left w:w="80" w:type="dxa"/>
-              <w:bottom w:w="45" w:type="dxa"/>
-              <w:right w:w="80" w:type="dxa"/>
-            </w:tcMar>
-          </w:tcPr>
-          <w:p>
-            <w:r>
-              <w:t>—</w:t>
-            </w:r>
-          </w:p>
-        </w:tc>
-      </w:tr>
-      <w:tr>
-        <w:trPr>
-          <w:cantSplit/>
-          <w:trHeight w:val="460"/>
-        </w:trPr>
-        <w:tc>
-          <w:tcPr>
-            <w:tcW w:w="1900" w:type="dxa"/>
-            <w:tcMar>
-              <w:top w:w="45" w:type="dxa"/>
-              <w:left w:w="80" w:type="dxa"/>
-              <w:bottom w:w="45" w:type="dxa"/>
-              <w:right w:w="80" w:type="dxa"/>
-            </w:tcMar>
-          </w:tcPr>
-          <w:p>
-            <w:r>
-              <w:t>Поспелова М. Т.</w:t>
-            </w:r>
-          </w:p>
-        </w:tc>
-        <w:tc>
-          <w:tcPr>
-            <w:tcW w:w="830" w:type="dxa"/>
-            <w:tcMar>
-              <w:top w:w="45" w:type="dxa"/>
-              <w:left w:w="80" w:type="dxa"/>
-              <w:bottom w:w="45" w:type="dxa"/>
-              <w:right w:w="80" w:type="dxa"/>
-            </w:tcMar>
-          </w:tcPr>
-          <w:p>
-            <w:r>
-              <w:t>—</w:t>
-            </w:r>
-          </w:p>
-        </w:tc>
-        <w:tc>
-          <w:tcPr>
-            <w:tcW w:w="830" w:type="dxa"/>
-            <w:tcMar>
-              <w:top w:w="45" w:type="dxa"/>
-              <w:left w:w="80" w:type="dxa"/>
-              <w:bottom w:w="45" w:type="dxa"/>
-              <w:right w:w="80" w:type="dxa"/>
-            </w:tcMar>
-          </w:tcPr>
-          <w:p>
-            <w:r>
-              <w:t>—</w:t>
-            </w:r>
-          </w:p>
-        </w:tc>
-        <w:tc>
-          <w:tcPr>
-            <w:tcW w:w="830" w:type="dxa"/>
-            <w:tcMar>
-              <w:top w:w="45" w:type="dxa"/>
-              <w:left w:w="80" w:type="dxa"/>
-              <w:bottom w:w="45" w:type="dxa"/>
-              <w:right w:w="80" w:type="dxa"/>
-            </w:tcMar>
-          </w:tcPr>
-          <w:p>
-            <w:r>
-              <w:t>—</w:t>
-            </w:r>
-          </w:p>
-        </w:tc>
-        <w:tc>
-          <w:tcPr>
-            <w:tcW w:w="830" w:type="dxa"/>
-            <w:tcMar>
-              <w:top w:w="45" w:type="dxa"/>
-              <w:left w:w="80" w:type="dxa"/>
-              <w:bottom w:w="45" w:type="dxa"/>
-              <w:right w:w="80" w:type="dxa"/>
-            </w:tcMar>
-          </w:tcPr>
-          <w:p>
-            <w:r>
-              <w:t>—</w:t>
-            </w:r>
-          </w:p>
-        </w:tc>
-        <w:tc>
-          <w:tcPr>
-            <w:tcW w:w="830" w:type="dxa"/>
-            <w:tcMar>
-              <w:top w:w="45" w:type="dxa"/>
-              <w:left w:w="80" w:type="dxa"/>
-              <w:bottom w:w="45" w:type="dxa"/>
-              <w:right w:w="80" w:type="dxa"/>
-            </w:tcMar>
-          </w:tcPr>
-          <w:p>
-            <w:r>
-              <w:t>—</w:t>
-            </w:r>
-          </w:p>
-        </w:tc>
-        <w:tc>
-          <w:tcPr>
-            <w:tcW w:w="830" w:type="dxa"/>
-            <w:tcMar>
-              <w:top w:w="45" w:type="dxa"/>
-              <w:left w:w="80" w:type="dxa"/>
-              <w:bottom w:w="45" w:type="dxa"/>
-              <w:right w:w="80" w:type="dxa"/>
-            </w:tcMar>
-          </w:tcPr>
-          <w:p>
-            <w:r>
-              <w:t>—</w:t>
-            </w:r>
-          </w:p>
-        </w:tc>
-        <w:tc>
-          <w:tcPr>
-            <w:tcW w:w="830" w:type="dxa"/>
-            <w:tcMar>
-              <w:top w:w="45" w:type="dxa"/>
-              <w:left w:w="80" w:type="dxa"/>
-              <w:bottom w:w="45" w:type="dxa"/>
-              <w:right w:w="80" w:type="dxa"/>
-            </w:tcMar>
-          </w:tcPr>
-          <w:p>
-            <w:r>
-              <w:t>—</w:t>
-            </w:r>
-          </w:p>
-        </w:tc>
-        <w:tc>
-          <w:tcPr>
-            <w:tcW w:w="830" w:type="dxa"/>
-            <w:tcMar>
-              <w:top w:w="45" w:type="dxa"/>
-              <w:left w:w="80" w:type="dxa"/>
-              <w:bottom w:w="45" w:type="dxa"/>
-              <w:right w:w="80" w:type="dxa"/>
-            </w:tcMar>
-          </w:tcPr>
-          <w:p>
-            <w:r>
-              <w:t>—</w:t>
-            </w:r>
-          </w:p>
-        </w:tc>
-        <w:tc>
-          <w:tcPr>
-            <w:tcW w:w="1308" w:type="dxa"/>
-            <w:tcMar>
-              <w:top w:w="45" w:type="dxa"/>
-              <w:left w:w="80" w:type="dxa"/>
-              <w:bottom w:w="45" w:type="dxa"/>
-              <w:right w:w="80" w:type="dxa"/>
-            </w:tcMar>
+            <w:tcW w:type="dxa" w:w="1417"/>
           </w:tcPr>
           <w:p>
             <w:r>
@@ -9277,7 +8991,7 @@
           </w:tcPr>
           <w:p>
             <w:r>
-              <w:t>Проблема, пользователи, бэклог, сроки, документация; функции PO и Scrum Master в ЛР 1</w:t>
+              <w:t>Изучает потребности пользователей, формулирует требования и приоритеты, ведёт план задач и проектную документацию.</w:t>
             </w:r>
           </w:p>
         </w:tc>
@@ -9347,7 +9061,7 @@
           </w:tcPr>
           <w:p>
             <w:r>
-              <w:t>Доменная модель и техническая документация; архитектура обсуждается с разработчиками</w:t>
+              <w:t>Разрабатывает правила показа намерений при посещении места и ведёт техническую документацию.</w:t>
             </w:r>
           </w:p>
         </w:tc>
@@ -9417,7 +9131,7 @@
           </w:tcPr>
           <w:p>
             <w:r>
-              <w:t>Интерфейс намерений, настройка места и дизайн разрешений</w:t>
+              <w:t>Проектирует и разрабатывает экраны добавления намерений, выбора места и просмотра напоминаний.</w:t>
             </w:r>
           </w:p>
         </w:tc>
@@ -9487,7 +9201,7 @@
           </w:tcPr>
           <w:p>
             <w:r>
-              <w:t>Тесты Presence Engine, дедупликации и пользовательских сценариев; функции QA</w:t>
+              <w:t>Разрабатывает работу уведомлений и проверяет сценарии визита, повторных уведомлений и сохранения состояния.</w:t>
             </w:r>
           </w:p>
         </w:tc>
@@ -9534,7 +9248,7 @@
           <w:b/>
           <w:sz w:val="20"/>
         </w:rPr>
-        <w:t>4.3. Ротация Scrum Master</w:t>
+        <w:t>4.3. Ведущий итерации (Scrum Master)</w:t>
       </w:r>
     </w:p>
     <w:p>
@@ -9542,7 +9256,7 @@
         <w:rPr>
           <w:sz w:val="20"/>
         </w:rPr>
-        <w:t>В ЛР 1 координацию ведёт Бартоломей А. М. как менеджер проекта. Для следующих итераций предложена ротация: Боровик → Золотилина → Поспелова. Формальный график команда фиксирует при планировании.</w:t>
+        <w:t>Scrum Master помогает команде организовать встречи, следит за обновлением задач на доске и помогает устранять препятствия. В ЛР 1 эту роль выполняет Бартоломей А. М. Предлагаемый порядок для следующих итераций: Боровик → Золотилина → Поспелова, по одному участнику на итерацию. График команда утверждает при планировании.</w:t>
       </w:r>
     </w:p>
     <w:p>

</xml_diff>

<commit_message>
Refine user problem and audit lab one report
</commit_message>
<xml_diff>
--- a/docs/lab-01/ЛР1_Отчёт_GoCue.docx
+++ b/docs/lab-01/ЛР1_Отчёт_GoCue.docx
@@ -522,7 +522,7 @@
           </w:tcPr>
           <w:p>
             <w:r>
-              <w:t>GoCue — мобильное приложение контекстных намерений; тема согласована с преподавателем по сообщению команды.</w:t>
+              <w:t>GoCue — мобильное приложение для напоминаний о делах в подходящем месте; тема согласована с преподавателем по сообщению команды.</w:t>
             </w:r>
           </w:p>
         </w:tc>
@@ -560,7 +560,7 @@
           </w:tcPr>
           <w:p>
             <w:r>
-              <w:t>Привязанные к месту дела вспоминаются слишком рано или после ухода. Список требует ручной проверки, а сырой вход в геозону может дать ложное или повторное уведомление. Масштаб проблемы пока не измерен.</w:t>
+              <w:t>Люди забывают о делах, которые можно выполнить в определённом месте: например, вспоминают о нужной покупке уже после ухода из магазина. Список приходится проверять вручную, а напоминание на заданное время может прийти до визита или после него. Частоту этой проблемы ещё предстоит проверить с пользователями.</w:t>
             </w:r>
           </w:p>
         </w:tc>
@@ -636,7 +636,7 @@
           </w:tcPr>
           <w:p>
             <w:r>
-              <w:t>Внешнего заказчика нет. Преподаватель курса согласует тему; добровольцы помогут проверить сценарии.</w:t>
+              <w:t>Внешнего заказчика нет. Преподаватель согласует учебную тему; сценарии использования планируем проверить с добровольцами.</w:t>
             </w:r>
           </w:p>
         </w:tc>
@@ -674,7 +674,7 @@
           </w:tcPr>
           <w:p>
             <w:r>
-              <w:t>Пользователь вводит намерение и выбирает контекст. Система хранит привязку MY_SUPERMARKET к физическому месту, ждёт подтверждённого визита и показывает подходящие намерения одной группой.</w:t>
+              <w:t>Пользователь записывает дело и выбирает место или его тип. Когда приложение определяет, что человек остановился в подходящем месте, оно показывает все связанные с ним невыполненные дела вместе.</w:t>
             </w:r>
           </w:p>
         </w:tc>
@@ -712,7 +712,7 @@
           </w:tcPr>
           <w:p>
             <w:r>
-              <w:t>Создание и завершение намерений; настройка MY_SUPERMARKET; геозона и подтверждение визита; групповая нотификация; Remind next visit; локальное хранение, журнал событий и симуляция.</w:t>
+              <w:t>Создание и завершение намерений; настройка предпочитаемого магазина; подтверждение визита; одно уведомление со всеми подходящими делами; перенос на следующий визит; локальное хранение, журнал событий и экран симуляции.</w:t>
             </w:r>
           </w:p>
         </w:tc>
@@ -902,7 +902,7 @@
           </w:tcPr>
           <w:p>
             <w:r>
-              <w:t>https://github.com/users/techmo0/projects/1/views/1; ссылка предоставлена владельцем, содержимое и доступ команды предстоит проверить.</w:t>
+              <w:t>https://github.com/users/techmo0/projects/1/views/1</w:t>
             </w:r>
           </w:p>
         </w:tc>
@@ -940,7 +940,7 @@
           </w:tcPr>
           <w:p>
             <w:r>
-              <w:t>Пока не настроено; необязательно.</w:t>
+              <w:t>Необязательно.</w:t>
             </w:r>
           </w:p>
         </w:tc>
@@ -1688,7 +1688,7 @@
           </w:tcPr>
           <w:p>
             <w:r>
-              <w:t>Тема согласована с преподавателем, роли подтверждены командой; матрица компетенций ещё не заполнена.</w:t>
+              <w:t>Тема согласована с преподавателем, роли подтверждены; матрица компетенций заполнена частично и требует самооценки участников.</w:t>
             </w:r>
           </w:p>
         </w:tc>
@@ -1879,7 +1879,7 @@
           </w:tcPr>
           <w:p>
             <w:r>
-              <w:t>О намерении, связанном с местом, пользователь вспоминает не в момент действия; напоминание по времени не знает реального контекста.</w:t>
+              <w:t>О поручениях, которые можно выполнить только в определённом месте, люди нередко вспоминают слишком поздно. Список нужно проверять самостоятельно, а напоминание по времени может не совпасть с посещением нужного места.</w:t>
             </w:r>
           </w:p>
         </w:tc>
@@ -1957,7 +1957,7 @@
           </w:tcPr>
           <w:p>
             <w:r>
-              <w:t>Забытым покупкам и повторным поездкам; слишком ранние уведомления вызывают раздражение.</w:t>
+              <w:t>Несделанным покупкам, возвращению в магазин или дополнительной поездке; неуместные напоминания отвлекают.</w:t>
             </w:r>
           </w:p>
         </w:tc>
@@ -1996,7 +1996,7 @@
           </w:tcPr>
           <w:p>
             <w:r>
-              <w:t>Записать намерение один раз и получить одну уместную группу задач во время подтверждённого визита.</w:t>
+              <w:t>Записать дело один раз и вспомнить о нём тогда, когда человек находится в подходящем месте и может его выполнить.</w:t>
             </w:r>
           </w:p>
         </w:tc>
@@ -2286,7 +2286,7 @@
           </w:tcPr>
           <w:p>
             <w:r>
-              <w:t>Знаком с уведомлениями по месту</w:t>
+              <w:t>Уже пробовал напоминания по месту</w:t>
             </w:r>
           </w:p>
         </w:tc>
@@ -2302,7 +2302,7 @@
           </w:tcPr>
           <w:p>
             <w:r>
-              <w:t>Избежать срабатывания при проезде мимо и повторов</w:t>
+              <w:t>Получать сигнал только тогда, когда можно заняться делом</w:t>
             </w:r>
           </w:p>
         </w:tc>
@@ -2318,7 +2318,7 @@
           </w:tcPr>
           <w:p>
             <w:r>
-              <w:t>Обычное напоминание по геозоне; сравнение проверим</w:t>
+              <w:t>Использует обычное напоминание по геозоне</w:t>
             </w:r>
           </w:p>
         </w:tc>
@@ -2340,7 +2340,7 @@
           </w:tcPr>
           <w:p>
             <w:r>
-              <w:t>Участник теста</w:t>
+              <w:t>Человек с повторяющимися покупками</w:t>
             </w:r>
           </w:p>
         </w:tc>
@@ -2356,7 +2356,7 @@
           </w:tcPr>
           <w:p>
             <w:r>
-              <w:t>Доброволец с устройством выбранной платформы</w:t>
+              <w:t>Регулярно заходит в знакомый магазин</w:t>
             </w:r>
           </w:p>
         </w:tc>
@@ -2372,7 +2372,7 @@
           </w:tcPr>
           <w:p>
             <w:r>
-              <w:t>Понять настройку места и перенос до следующего визита</w:t>
+              <w:t>Не забывать несколько покупок во время одного визита</w:t>
             </w:r>
           </w:p>
         </w:tc>
@@ -2388,7 +2388,7 @@
           </w:tcPr>
           <w:p>
             <w:r>
-              <w:t>Будет приглашён после согласования сценариев</w:t>
+              <w:t>Держит список покупок в заметках или в памяти</w:t>
             </w:r>
           </w:p>
         </w:tc>
@@ -2666,7 +2666,7 @@
           </w:tcPr>
           <w:p>
             <w:r>
-              <w:t>Подтверждает остановку и группирует активные намерения без дублей</w:t>
+              <w:t>Показывает записанные дела, когда человек остановился в подходящем месте</w:t>
             </w:r>
           </w:p>
         </w:tc>
@@ -2774,7 +2774,7 @@
           </w:tcPr>
           <w:p>
             <w:r>
-              <w:t>Семантические места, подтверждённый визит, подавление до следующего визита и журнал</w:t>
+              <w:t>Позволяет выбрать привычное место, собирает связанные с ним дела вместе и не повторяет уведомление во время того же визита</w:t>
             </w:r>
           </w:p>
         </w:tc>
@@ -2813,7 +2813,7 @@
         <w:rPr>
           <w:sz w:val="20"/>
         </w:rPr>
-        <w:t>Для людей с делами, привязанными к месту, GoCue — мобильное приложение, которое сохраняет намерение и возвращает его при подтверждённом визите. Оно учитывает семантическое место, остановку и группирует задачи без дублей.</w:t>
+        <w:t>Для людей, которые забывают о поручениях во время посещения нужного места, GoCue — мобильное приложение, которое напоминает о записанных делах после остановки в этом месте и показывает их одним списком.</w:t>
       </w:r>
     </w:p>
     <w:p>
@@ -3051,7 +3051,7 @@
           </w:tcPr>
           <w:p>
             <w:r>
-              <w:t>Напоминания при прибытии в место</w:t>
+              <w:t>Позволяет задать напоминание по месту</w:t>
             </w:r>
           </w:p>
         </w:tc>
@@ -3067,7 +3067,7 @@
           </w:tcPr>
           <w:p>
             <w:r>
-              <w:t>GoCue делает ставку на подтверждение визита и группу намерений; поведение сравнить эмпирически</w:t>
+              <w:t>Сравнение поведения при кратком визите и группировки нескольких дел требует отдельной проверки</w:t>
             </w:r>
           </w:p>
         </w:tc>
@@ -3105,7 +3105,7 @@
           </w:tcPr>
           <w:p>
             <w:r>
-              <w:t>Заметки и напоминания по времени; геонапоминания отменены</w:t>
+              <w:t>Сохраняет заметки; напоминания перенесены в Google Tasks, геонапоминания больше недоступны</w:t>
             </w:r>
           </w:p>
         </w:tc>
@@ -3121,7 +3121,7 @@
           </w:tcPr>
           <w:p>
             <w:r>
-              <w:t>GoCue работает с местом и подтверждённым визитом; состояние конкурента проверено по справке Google</w:t>
+              <w:t>Не напоминает о заметке при посещении нужного места; это подтверждено справкой Google</w:t>
             </w:r>
           </w:p>
         </w:tc>
@@ -3138,14 +3138,9 @@
       </w:pPr>
       <w:r>
         <w:rPr>
-          <w:rFonts w:ascii="Times New Roman" w:hAnsi="Times New Roman" w:cs="Times New Roman"/>
-          <w:i/>
-          <w:iCs/>
-          <w:color w:val="7F7F7F"/>
           <w:sz w:val="20"/>
-          <w:szCs w:val="28"/>
-        </w:rPr>
-        <w:t>Проверьте факты об аналогах сами, даже если нашли их с помощью ИИ.</w:t>
+        </w:rPr>
+        <w:t>Сведения о возможностях аналогов сверены с официальными справками Apple и Google; отличия в поведении уведомлений ещё требуют практической проверки.</w:t>
       </w:r>
     </w:p>
     <w:p>
@@ -3528,7 +3523,7 @@
           </w:tcPr>
           <w:p>
             <w:r>
-              <w:t>Подтвердить визит по dwell, не уведомлять на сыром входе</w:t>
+              <w:t>Подтвердить пребывание в месте; не уведомлять сразу при входе</w:t>
             </w:r>
           </w:p>
         </w:tc>
@@ -3668,7 +3663,7 @@
           </w:tcPr>
           <w:p>
             <w:r>
-              <w:t>Remind next visit и локальный журнал с симуляцией</w:t>
+              <w:t>Напомнить при следующем визите; вести локальный журнал и поддержать симуляцию</w:t>
             </w:r>
           </w:p>
         </w:tc>
@@ -4122,7 +4117,7 @@
           </w:tcPr>
           <w:p>
             <w:r>
-              <w:t>Точность на сценариях визита</w:t>
+              <w:t>Отсутствие ложных сигналов в симуляции</w:t>
             </w:r>
           </w:p>
         </w:tc>
@@ -4154,7 +4149,7 @@
           </w:tcPr>
           <w:p>
             <w:r>
-              <w:t>0 уведомлений на сыром входе и проезде мимо в 20 симулированных сценариях</w:t>
+              <w:t>0 уведомлений при кратком проходе или проезде мимо в 20 симулированных сценариях</w:t>
             </w:r>
           </w:p>
         </w:tc>
@@ -4170,7 +4165,7 @@
           </w:tcPr>
           <w:p>
             <w:r>
-              <w:t>Автотесты Presence Engine и ручная проверка на устройстве; реальную надёжность оценивать отдельно</w:t>
+              <w:t>Автотесты определения визита; затем отдельная проверка на устройстве</w:t>
             </w:r>
           </w:p>
         </w:tc>
@@ -4698,7 +4693,7 @@
           </w:tcPr>
           <w:p>
             <w:r>
-              <w:t>К 12-й неделе 8-го семестра подготовить и показать прототип GoCue: создание намерения, ручная привязка MY_SUPERMARKET, подтверждённый визит, групповое уведомление, завершение и Remind next visit. Пройти 20 сценариев симуляции без уведомления на сыром входе и без дублей за визит, затем проверить один реальный геофенс на устройстве. Даты уточнить по дорожной карте курса.</w:t>
+              <w:t>К 12-й неделе 8-го семестра подготовить и показать прототип GoCue: создание намерения, выбор предпочитаемого магазина, подтверждение визита, групповое уведомление, завершение дела и перенос на следующий визит. Пройти 20 сценариев симуляции без уведомлений при кратком проходе мимо и без повторов за один визит, затем проверить работу у одного реального места на устройстве. Даты уточнить по дорожной карте курса.</w:t>
             </w:r>
           </w:p>
         </w:tc>
@@ -5231,7 +5226,7 @@
           </w:tcPr>
           <w:p>
             <w:r>
-              <w:t>Согласованная тема, выбранная платформа и доменный прототип без GPS</w:t>
+              <w:t>Согласованная тема, выбранная платформа и прототип правил работы намерений без GPS</w:t>
             </w:r>
           </w:p>
         </w:tc>
@@ -5375,7 +5370,7 @@
           </w:tcPr>
           <w:p>
             <w:r>
-              <w:t>Один реальный геофенс, анализ ошибок и ограничений разрешений</w:t>
+              <w:t>Проверка геозоны у одного реального места, анализ ошибок и влияния разрешений</w:t>
             </w:r>
           </w:p>
         </w:tc>
@@ -5724,7 +5719,7 @@
           </w:tcPr>
           <w:p>
             <w:r>
-              <w:t>Владелец устройства</w:t>
+              <w:t>Участники тестирования</w:t>
             </w:r>
           </w:p>
         </w:tc>
@@ -5740,7 +5735,7 @@
           </w:tcPr>
           <w:p>
             <w:r>
-              <w:t>Контроль геоданных, разрешений и уведомлений</w:t>
+              <w:t>Понятная настройка места, контроль геоданных и отсутствие лишних уведомлений</w:t>
             </w:r>
           </w:p>
         </w:tc>
@@ -5756,7 +5751,7 @@
           </w:tcPr>
           <w:p>
             <w:r>
-              <w:t>В</w:t>
+              <w:t>С</w:t>
             </w:r>
           </w:p>
         </w:tc>
@@ -5772,7 +5767,7 @@
           </w:tcPr>
           <w:p>
             <w:r>
-              <w:t>Понятное объяснение доступа и удаление локальных данных</w:t>
+              <w:t>Добровольное участие, объяснение разрешений и возможность удалить локальные данные</w:t>
             </w:r>
           </w:p>
         </w:tc>
@@ -6269,12 +6264,12 @@
         <w:tblLook w:val="04A0" w:firstRow="1" w:lastRow="0" w:firstColumn="1" w:lastColumn="0" w:noHBand="0" w:noVBand="1"/>
       </w:tblPr>
       <w:tblGrid>
-        <w:gridCol w:w="500"/>
-        <w:gridCol w:w="2900"/>
-        <w:gridCol w:w="1050"/>
-        <w:gridCol w:w="1050"/>
-        <w:gridCol w:w="2732"/>
-        <w:gridCol w:w="1406"/>
+        <w:gridCol w:w="454"/>
+        <w:gridCol w:w="2494"/>
+        <w:gridCol w:w="1134"/>
+        <w:gridCol w:w="850"/>
+        <w:gridCol w:w="3005"/>
+        <w:gridCol w:w="1701"/>
       </w:tblGrid>
       <w:tr>
         <w:trPr>
@@ -6283,7 +6278,7 @@
         </w:trPr>
         <w:tc>
           <w:tcPr>
-            <w:tcW w:w="500" w:type="dxa"/>
+            <w:tcW w:w="454" w:type="dxa"/>
             <w:shd w:val="clear" w:color="auto" w:fill="1F3864"/>
             <w:tcMar>
               <w:top w:w="45" w:type="dxa"/>
@@ -6308,7 +6303,7 @@
                 <w:b/>
                 <w:bCs/>
                 <w:color w:val="FFFFFF"/>
-                <w:sz w:val="28"/>
+                <w:sz w:val="17"/>
                 <w:szCs w:val="28"/>
               </w:rPr>
               <w:t>№</w:t>
@@ -6317,7 +6312,7 @@
         </w:tc>
         <w:tc>
           <w:tcPr>
-            <w:tcW w:w="2900" w:type="dxa"/>
+            <w:tcW w:w="2494" w:type="dxa"/>
             <w:shd w:val="clear" w:color="auto" w:fill="1F3864"/>
             <w:tcMar>
               <w:top w:w="45" w:type="dxa"/>
@@ -6341,7 +6336,7 @@
                 <w:b/>
                 <w:bCs/>
                 <w:color w:val="FFFFFF"/>
-                <w:sz w:val="28"/>
+                <w:sz w:val="17"/>
                 <w:szCs w:val="28"/>
               </w:rPr>
               <w:t>Риск</w:t>
@@ -6350,7 +6345,27 @@
         </w:tc>
         <w:tc>
           <w:tcPr>
-            <w:tcW w:w="1050" w:type="dxa"/>
+            <w:tcW w:w="1134" w:type="dxa"/>
+            <w:shd w:val="clear" w:color="auto" w:fill="1F3864"/>
+            <w:tcMar>
+              <w:top w:w="45" w:type="dxa"/>
+              <w:left w:w="80" w:type="dxa"/>
+              <w:bottom w:w="45" w:type="dxa"/>
+              <w:right w:w="80" w:type="dxa"/>
+            </w:tcMar>
+          </w:tcPr>
+          <w:p>
+            <w:r>
+              <w:rPr>
+                <w:sz w:val="17"/>
+              </w:rPr>
+              <w:t>Вероятность</w:t>
+            </w:r>
+          </w:p>
+        </w:tc>
+        <w:tc>
+          <w:tcPr>
+            <w:tcW w:w="850" w:type="dxa"/>
             <w:shd w:val="clear" w:color="auto" w:fill="1F3864"/>
             <w:tcMar>
               <w:top w:w="45" w:type="dxa"/>
@@ -6375,16 +6390,16 @@
                 <w:b/>
                 <w:bCs/>
                 <w:color w:val="FFFFFF"/>
-                <w:sz w:val="28"/>
-                <w:szCs w:val="28"/>
-              </w:rPr>
-              <w:t>Вероят­ность</w:t>
-            </w:r>
-          </w:p>
-        </w:tc>
-        <w:tc>
-          <w:tcPr>
-            <w:tcW w:w="1050" w:type="dxa"/>
+                <w:sz w:val="17"/>
+                <w:szCs w:val="28"/>
+              </w:rPr>
+              <w:t>Влияние</w:t>
+            </w:r>
+          </w:p>
+        </w:tc>
+        <w:tc>
+          <w:tcPr>
+            <w:tcW w:w="3005" w:type="dxa"/>
             <w:shd w:val="clear" w:color="auto" w:fill="1F3864"/>
             <w:tcMar>
               <w:top w:w="45" w:type="dxa"/>
@@ -6396,7 +6411,6 @@
           <w:p>
             <w:pPr>
               <w:spacing w:after="30" w:line="245" w:lineRule="auto"/>
-              <w:jc w:val="center"/>
               <w:rPr>
                 <w:rFonts w:ascii="Times New Roman" w:hAnsi="Times New Roman" w:cs="Times New Roman"/>
                 <w:sz w:val="28"/>
@@ -6409,16 +6423,16 @@
                 <w:b/>
                 <w:bCs/>
                 <w:color w:val="FFFFFF"/>
-                <w:sz w:val="28"/>
-                <w:szCs w:val="28"/>
-              </w:rPr>
-              <w:t>Влияние</w:t>
-            </w:r>
-          </w:p>
-        </w:tc>
-        <w:tc>
-          <w:tcPr>
-            <w:tcW w:w="2732" w:type="dxa"/>
+                <w:sz w:val="17"/>
+                <w:szCs w:val="28"/>
+              </w:rPr>
+              <w:t>Меры снижения</w:t>
+            </w:r>
+          </w:p>
+        </w:tc>
+        <w:tc>
+          <w:tcPr>
+            <w:tcW w:w="1701" w:type="dxa"/>
             <w:shd w:val="clear" w:color="auto" w:fill="1F3864"/>
             <w:tcMar>
               <w:top w:w="45" w:type="dxa"/>
@@ -6428,57 +6442,11 @@
             </w:tcMar>
           </w:tcPr>
           <w:p>
-            <w:pPr>
-              <w:spacing w:after="30" w:line="245" w:lineRule="auto"/>
-              <w:rPr>
-                <w:rFonts w:ascii="Times New Roman" w:hAnsi="Times New Roman" w:cs="Times New Roman"/>
-                <w:sz w:val="28"/>
-                <w:szCs w:val="28"/>
-              </w:rPr>
-            </w:pPr>
-            <w:r>
-              <w:rPr>
-                <w:rFonts w:ascii="Times New Roman" w:hAnsi="Times New Roman" w:cs="Times New Roman"/>
-                <w:b/>
-                <w:bCs/>
-                <w:color w:val="FFFFFF"/>
-                <w:sz w:val="28"/>
-                <w:szCs w:val="28"/>
-              </w:rPr>
-              <w:t>Меры снижения</w:t>
-            </w:r>
-          </w:p>
-        </w:tc>
-        <w:tc>
-          <w:tcPr>
-            <w:tcW w:w="1406" w:type="dxa"/>
-            <w:shd w:val="clear" w:color="auto" w:fill="1F3864"/>
-            <w:tcMar>
-              <w:top w:w="45" w:type="dxa"/>
-              <w:left w:w="80" w:type="dxa"/>
-              <w:bottom w:w="45" w:type="dxa"/>
-              <w:right w:w="80" w:type="dxa"/>
-            </w:tcMar>
-          </w:tcPr>
-          <w:p>
-            <w:pPr>
-              <w:spacing w:after="30" w:line="245" w:lineRule="auto"/>
-              <w:rPr>
-                <w:rFonts w:ascii="Times New Roman" w:hAnsi="Times New Roman" w:cs="Times New Roman"/>
-                <w:sz w:val="28"/>
-                <w:szCs w:val="28"/>
-              </w:rPr>
-            </w:pPr>
-            <w:r>
-              <w:rPr>
-                <w:rFonts w:ascii="Times New Roman" w:hAnsi="Times New Roman" w:cs="Times New Roman"/>
-                <w:b/>
-                <w:bCs/>
-                <w:color w:val="FFFFFF"/>
-                <w:sz w:val="28"/>
-                <w:szCs w:val="28"/>
-              </w:rPr>
-              <w:t>Ответ­ственный</w:t>
+            <w:r>
+              <w:rPr>
+                <w:sz w:val="17"/>
+              </w:rPr>
+              <w:t>Ответственный</w:t>
             </w:r>
           </w:p>
         </w:tc>
@@ -6490,7 +6458,7 @@
         </w:trPr>
         <w:tc>
           <w:tcPr>
-            <w:tcW w:w="500" w:type="dxa"/>
+            <w:tcW w:w="454" w:type="dxa"/>
             <w:tcMar>
               <w:top w:w="45" w:type="dxa"/>
               <w:left w:w="80" w:type="dxa"/>
@@ -6506,7 +6474,7 @@
         </w:tc>
         <w:tc>
           <w:tcPr>
-            <w:tcW w:w="2900" w:type="dxa"/>
+            <w:tcW w:w="2494" w:type="dxa"/>
             <w:tcMar>
               <w:top w:w="45" w:type="dxa"/>
               <w:left w:w="80" w:type="dxa"/>
@@ -6522,7 +6490,7 @@
         </w:tc>
         <w:tc>
           <w:tcPr>
-            <w:tcW w:w="1050" w:type="dxa"/>
+            <w:tcW w:w="1134" w:type="dxa"/>
             <w:tcMar>
               <w:top w:w="45" w:type="dxa"/>
               <w:left w:w="80" w:type="dxa"/>
@@ -6538,7 +6506,7 @@
         </w:tc>
         <w:tc>
           <w:tcPr>
-            <w:tcW w:w="1050" w:type="dxa"/>
+            <w:tcW w:w="850" w:type="dxa"/>
             <w:tcMar>
               <w:top w:w="45" w:type="dxa"/>
               <w:left w:w="80" w:type="dxa"/>
@@ -6554,7 +6522,7 @@
         </w:tc>
         <w:tc>
           <w:tcPr>
-            <w:tcW w:w="2732" w:type="dxa"/>
+            <w:tcW w:w="3005" w:type="dxa"/>
             <w:tcMar>
               <w:top w:w="45" w:type="dxa"/>
               <w:left w:w="80" w:type="dxa"/>
@@ -6570,7 +6538,7 @@
         </w:tc>
         <w:tc>
           <w:tcPr>
-            <w:tcW w:w="1406" w:type="dxa"/>
+            <w:tcW w:w="1701" w:type="dxa"/>
             <w:tcMar>
               <w:top w:w="45" w:type="dxa"/>
               <w:left w:w="80" w:type="dxa"/>
@@ -6592,7 +6560,7 @@
         </w:trPr>
         <w:tc>
           <w:tcPr>
-            <w:tcW w:w="500" w:type="dxa"/>
+            <w:tcW w:w="454" w:type="dxa"/>
             <w:tcMar>
               <w:top w:w="45" w:type="dxa"/>
               <w:left w:w="80" w:type="dxa"/>
@@ -6608,7 +6576,7 @@
         </w:tc>
         <w:tc>
           <w:tcPr>
-            <w:tcW w:w="2900" w:type="dxa"/>
+            <w:tcW w:w="2494" w:type="dxa"/>
             <w:tcMar>
               <w:top w:w="45" w:type="dxa"/>
               <w:left w:w="80" w:type="dxa"/>
@@ -6624,7 +6592,7 @@
         </w:tc>
         <w:tc>
           <w:tcPr>
-            <w:tcW w:w="1050" w:type="dxa"/>
+            <w:tcW w:w="1134" w:type="dxa"/>
             <w:tcMar>
               <w:top w:w="45" w:type="dxa"/>
               <w:left w:w="80" w:type="dxa"/>
@@ -6640,7 +6608,7 @@
         </w:tc>
         <w:tc>
           <w:tcPr>
-            <w:tcW w:w="1050" w:type="dxa"/>
+            <w:tcW w:w="850" w:type="dxa"/>
             <w:tcMar>
               <w:top w:w="45" w:type="dxa"/>
               <w:left w:w="80" w:type="dxa"/>
@@ -6656,7 +6624,7 @@
         </w:tc>
         <w:tc>
           <w:tcPr>
-            <w:tcW w:w="2732" w:type="dxa"/>
+            <w:tcW w:w="3005" w:type="dxa"/>
             <w:tcMar>
               <w:top w:w="45" w:type="dxa"/>
               <w:left w:w="80" w:type="dxa"/>
@@ -6672,7 +6640,7 @@
         </w:tc>
         <w:tc>
           <w:tcPr>
-            <w:tcW w:w="1406" w:type="dxa"/>
+            <w:tcW w:w="1701" w:type="dxa"/>
             <w:tcMar>
               <w:top w:w="45" w:type="dxa"/>
               <w:left w:w="80" w:type="dxa"/>
@@ -6694,7 +6662,7 @@
         </w:trPr>
         <w:tc>
           <w:tcPr>
-            <w:tcW w:w="500" w:type="dxa"/>
+            <w:tcW w:w="454" w:type="dxa"/>
             <w:tcMar>
               <w:top w:w="45" w:type="dxa"/>
               <w:left w:w="80" w:type="dxa"/>
@@ -6710,7 +6678,7 @@
         </w:tc>
         <w:tc>
           <w:tcPr>
-            <w:tcW w:w="2900" w:type="dxa"/>
+            <w:tcW w:w="2494" w:type="dxa"/>
             <w:tcMar>
               <w:top w:w="45" w:type="dxa"/>
               <w:left w:w="80" w:type="dxa"/>
@@ -6726,7 +6694,7 @@
         </w:tc>
         <w:tc>
           <w:tcPr>
-            <w:tcW w:w="1050" w:type="dxa"/>
+            <w:tcW w:w="1134" w:type="dxa"/>
             <w:tcMar>
               <w:top w:w="45" w:type="dxa"/>
               <w:left w:w="80" w:type="dxa"/>
@@ -6742,7 +6710,7 @@
         </w:tc>
         <w:tc>
           <w:tcPr>
-            <w:tcW w:w="1050" w:type="dxa"/>
+            <w:tcW w:w="850" w:type="dxa"/>
             <w:tcMar>
               <w:top w:w="45" w:type="dxa"/>
               <w:left w:w="80" w:type="dxa"/>
@@ -6758,7 +6726,7 @@
         </w:tc>
         <w:tc>
           <w:tcPr>
-            <w:tcW w:w="2732" w:type="dxa"/>
+            <w:tcW w:w="3005" w:type="dxa"/>
             <w:tcMar>
               <w:top w:w="45" w:type="dxa"/>
               <w:left w:w="80" w:type="dxa"/>
@@ -6774,7 +6742,7 @@
         </w:tc>
         <w:tc>
           <w:tcPr>
-            <w:tcW w:w="1406" w:type="dxa"/>
+            <w:tcW w:w="1701" w:type="dxa"/>
             <w:tcMar>
               <w:top w:w="45" w:type="dxa"/>
               <w:left w:w="80" w:type="dxa"/>
@@ -6796,7 +6764,7 @@
         </w:trPr>
         <w:tc>
           <w:tcPr>
-            <w:tcW w:w="500" w:type="dxa"/>
+            <w:tcW w:w="454" w:type="dxa"/>
             <w:tcMar>
               <w:top w:w="45" w:type="dxa"/>
               <w:left w:w="80" w:type="dxa"/>
@@ -6812,7 +6780,7 @@
         </w:tc>
         <w:tc>
           <w:tcPr>
-            <w:tcW w:w="2900" w:type="dxa"/>
+            <w:tcW w:w="2494" w:type="dxa"/>
             <w:tcMar>
               <w:top w:w="45" w:type="dxa"/>
               <w:left w:w="80" w:type="dxa"/>
@@ -6828,7 +6796,7 @@
         </w:tc>
         <w:tc>
           <w:tcPr>
-            <w:tcW w:w="1050" w:type="dxa"/>
+            <w:tcW w:w="1134" w:type="dxa"/>
             <w:tcMar>
               <w:top w:w="45" w:type="dxa"/>
               <w:left w:w="80" w:type="dxa"/>
@@ -6844,7 +6812,7 @@
         </w:tc>
         <w:tc>
           <w:tcPr>
-            <w:tcW w:w="1050" w:type="dxa"/>
+            <w:tcW w:w="850" w:type="dxa"/>
             <w:tcMar>
               <w:top w:w="45" w:type="dxa"/>
               <w:left w:w="80" w:type="dxa"/>
@@ -6860,23 +6828,23 @@
         </w:tc>
         <w:tc>
           <w:tcPr>
-            <w:tcW w:w="2732" w:type="dxa"/>
-            <w:tcMar>
-              <w:top w:w="45" w:type="dxa"/>
-              <w:left w:w="80" w:type="dxa"/>
-              <w:bottom w:w="45" w:type="dxa"/>
-              <w:right w:w="80" w:type="dxa"/>
-            </w:tcMar>
-          </w:tcPr>
-          <w:p>
-            <w:r>
-              <w:t>Выбрать одну ОС, начать с доменной логики и симуляции, пересматривать объём</w:t>
-            </w:r>
-          </w:p>
-        </w:tc>
-        <w:tc>
-          <w:tcPr>
-            <w:tcW w:w="1406" w:type="dxa"/>
+            <w:tcW w:w="3005" w:type="dxa"/>
+            <w:tcMar>
+              <w:top w:w="45" w:type="dxa"/>
+              <w:left w:w="80" w:type="dxa"/>
+              <w:bottom w:w="45" w:type="dxa"/>
+              <w:right w:w="80" w:type="dxa"/>
+            </w:tcMar>
+          </w:tcPr>
+          <w:p>
+            <w:r>
+              <w:t>Выбрать одну ОС, начать с правил работы намерений и симуляции, пересматривать объём</w:t>
+            </w:r>
+          </w:p>
+        </w:tc>
+        <w:tc>
+          <w:tcPr>
+            <w:tcW w:w="1701" w:type="dxa"/>
             <w:tcMar>
               <w:top w:w="45" w:type="dxa"/>
               <w:left w:w="80" w:type="dxa"/>
@@ -6898,7 +6866,7 @@
         </w:trPr>
         <w:tc>
           <w:tcPr>
-            <w:tcW w:w="500" w:type="dxa"/>
+            <w:tcW w:w="454" w:type="dxa"/>
             <w:tcMar>
               <w:top w:w="45" w:type="dxa"/>
               <w:left w:w="80" w:type="dxa"/>
@@ -6914,7 +6882,7 @@
         </w:tc>
         <w:tc>
           <w:tcPr>
-            <w:tcW w:w="2900" w:type="dxa"/>
+            <w:tcW w:w="2494" w:type="dxa"/>
             <w:tcMar>
               <w:top w:w="45" w:type="dxa"/>
               <w:left w:w="80" w:type="dxa"/>
@@ -6930,7 +6898,7 @@
         </w:tc>
         <w:tc>
           <w:tcPr>
-            <w:tcW w:w="1050" w:type="dxa"/>
+            <w:tcW w:w="1134" w:type="dxa"/>
             <w:tcMar>
               <w:top w:w="45" w:type="dxa"/>
               <w:left w:w="80" w:type="dxa"/>
@@ -6946,7 +6914,7 @@
         </w:tc>
         <w:tc>
           <w:tcPr>
-            <w:tcW w:w="1050" w:type="dxa"/>
+            <w:tcW w:w="850" w:type="dxa"/>
             <w:tcMar>
               <w:top w:w="45" w:type="dxa"/>
               <w:left w:w="80" w:type="dxa"/>
@@ -6962,7 +6930,7 @@
         </w:tc>
         <w:tc>
           <w:tcPr>
-            <w:tcW w:w="2732" w:type="dxa"/>
+            <w:tcW w:w="3005" w:type="dxa"/>
             <w:tcMar>
               <w:top w:w="45" w:type="dxa"/>
               <w:left w:w="80" w:type="dxa"/>
@@ -6978,7 +6946,7 @@
         </w:tc>
         <w:tc>
           <w:tcPr>
-            <w:tcW w:w="1406" w:type="dxa"/>
+            <w:tcW w:w="1701" w:type="dxa"/>
             <w:tcMar>
               <w:top w:w="45" w:type="dxa"/>
               <w:left w:w="80" w:type="dxa"/>
@@ -7005,80 +6973,9 @@
       </w:pPr>
       <w:r>
         <w:rPr>
-          <w:rFonts w:ascii="Times New Roman" w:hAnsi="Times New Roman" w:cs="Times New Roman"/>
-          <w:i/>
-          <w:iCs/>
-          <w:color w:val="7F7F7F"/>
           <w:sz w:val="20"/>
-          <w:szCs w:val="28"/>
-        </w:rPr>
-        <w:t xml:space="preserve">Оценки: В </w:t>
-      </w:r>
-      <w:r>
-        <w:rPr>
-          <w:rFonts w:ascii="Times New Roman" w:hAnsi="Times New Roman" w:cs="Times New Roman"/>
-          <w:i/>
-          <w:iCs/>
-          <w:color w:val="7F7F7F"/>
-          <w:sz w:val="20"/>
-          <w:szCs w:val="28"/>
-        </w:rPr>
-        <w:t>–</w:t>
-      </w:r>
-      <w:r>
-        <w:rPr>
-          <w:rFonts w:ascii="Times New Roman" w:hAnsi="Times New Roman" w:cs="Times New Roman"/>
-          <w:i/>
-          <w:iCs/>
-          <w:color w:val="7F7F7F"/>
-          <w:sz w:val="20"/>
-          <w:szCs w:val="28"/>
-        </w:rPr>
-        <w:t xml:space="preserve"> высокая, С </w:t>
-      </w:r>
-      <w:r>
-        <w:rPr>
-          <w:rFonts w:ascii="Times New Roman" w:hAnsi="Times New Roman" w:cs="Times New Roman"/>
-          <w:i/>
-          <w:iCs/>
-          <w:color w:val="7F7F7F"/>
-          <w:sz w:val="20"/>
-          <w:szCs w:val="28"/>
-        </w:rPr>
-        <w:t>–</w:t>
-      </w:r>
-      <w:r>
-        <w:rPr>
-          <w:rFonts w:ascii="Times New Roman" w:hAnsi="Times New Roman" w:cs="Times New Roman"/>
-          <w:i/>
-          <w:iCs/>
-          <w:color w:val="7F7F7F"/>
-          <w:sz w:val="20"/>
-          <w:szCs w:val="28"/>
-        </w:rPr>
-        <w:t xml:space="preserve"> средняя, Н </w:t>
-      </w:r>
-      <w:r>
-        <w:rPr>
-          <w:rFonts w:ascii="Times New Roman" w:hAnsi="Times New Roman" w:cs="Times New Roman"/>
-          <w:i/>
-          <w:iCs/>
-          <w:color w:val="7F7F7F"/>
-          <w:sz w:val="20"/>
-          <w:szCs w:val="28"/>
-        </w:rPr>
-        <w:t>–</w:t>
-      </w:r>
-      <w:r>
-        <w:rPr>
-          <w:rFonts w:ascii="Times New Roman" w:hAnsi="Times New Roman" w:cs="Times New Roman"/>
-          <w:i/>
-          <w:iCs/>
-          <w:color w:val="7F7F7F"/>
-          <w:sz w:val="20"/>
-          <w:szCs w:val="28"/>
-        </w:rPr>
-        <w:t xml:space="preserve"> низкая. Подумайте о рисках команды (нагрузка, болезни, уход участника), технологий, данных, заказчика и сроков.</w:t>
+        </w:rPr>
+        <w:t>Оценки: В – высокая, С – средняя, Н – низкая. Риски команды, технологий и данных пересматриваются на планировании.</w:t>
       </w:r>
     </w:p>
     <w:p>
@@ -7651,10 +7548,10 @@
         <w:tblLook w:val="04A0" w:firstRow="1" w:lastRow="0" w:firstColumn="1" w:lastColumn="0" w:noHBand="0" w:noVBand="1"/>
       </w:tblPr>
       <w:tblGrid>
-        <w:gridCol w:w="3600"/>
-        <w:gridCol w:w="2800"/>
-        <w:gridCol w:w="1600"/>
-        <w:gridCol w:w="1638"/>
+        <w:gridCol w:w="2438"/>
+        <w:gridCol w:w="2494"/>
+        <w:gridCol w:w="3402"/>
+        <w:gridCol w:w="1134"/>
       </w:tblGrid>
       <w:tr>
         <w:trPr>
@@ -7663,7 +7560,7 @@
         </w:trPr>
         <w:tc>
           <w:tcPr>
-            <w:tcW w:w="3600" w:type="dxa"/>
+            <w:tcW w:w="2438" w:type="dxa"/>
             <w:shd w:val="clear" w:color="auto" w:fill="1F3864"/>
             <w:tcMar>
               <w:top w:w="45" w:type="dxa"/>
@@ -7696,7 +7593,7 @@
         </w:tc>
         <w:tc>
           <w:tcPr>
-            <w:tcW w:w="2800" w:type="dxa"/>
+            <w:tcW w:w="2494" w:type="dxa"/>
             <w:shd w:val="clear" w:color="auto" w:fill="1F3864"/>
             <w:tcMar>
               <w:top w:w="45" w:type="dxa"/>
@@ -7729,7 +7626,7 @@
         </w:tc>
         <w:tc>
           <w:tcPr>
-            <w:tcW w:w="1600" w:type="dxa"/>
+            <w:tcW w:w="3402" w:type="dxa"/>
             <w:shd w:val="clear" w:color="auto" w:fill="1F3864"/>
             <w:tcMar>
               <w:top w:w="45" w:type="dxa"/>
@@ -7739,31 +7636,14 @@
             </w:tcMar>
           </w:tcPr>
           <w:p>
-            <w:pPr>
-              <w:spacing w:after="30" w:line="245" w:lineRule="auto"/>
-              <w:jc w:val="center"/>
-              <w:rPr>
-                <w:rFonts w:ascii="Times New Roman" w:hAnsi="Times New Roman" w:cs="Times New Roman"/>
-                <w:sz w:val="28"/>
-                <w:szCs w:val="28"/>
-              </w:rPr>
-            </w:pPr>
-            <w:r>
-              <w:rPr>
-                <w:rFonts w:ascii="Times New Roman" w:hAnsi="Times New Roman" w:cs="Times New Roman"/>
-                <w:b/>
-                <w:bCs/>
-                <w:color w:val="FFFFFF"/>
-                <w:sz w:val="28"/>
-                <w:szCs w:val="28"/>
-              </w:rPr>
-              <w:t>Ознакомлен(а)</w:t>
-            </w:r>
-          </w:p>
-        </w:tc>
-        <w:tc>
-          <w:tcPr>
-            <w:tcW w:w="1638" w:type="dxa"/>
+            <w:r>
+              <w:t>Ознакомление</w:t>
+            </w:r>
+          </w:p>
+        </w:tc>
+        <w:tc>
+          <w:tcPr>
+            <w:tcW w:w="1134" w:type="dxa"/>
             <w:shd w:val="clear" w:color="auto" w:fill="1F3864"/>
             <w:tcMar>
               <w:top w:w="45" w:type="dxa"/>
@@ -7802,7 +7682,7 @@
         </w:trPr>
         <w:tc>
           <w:tcPr>
-            <w:tcW w:w="3600" w:type="dxa"/>
+            <w:tcW w:w="2438" w:type="dxa"/>
             <w:tcMar>
               <w:top w:w="45" w:type="dxa"/>
               <w:left w:w="80" w:type="dxa"/>
@@ -7818,7 +7698,7 @@
         </w:tc>
         <w:tc>
           <w:tcPr>
-            <w:tcW w:w="2800" w:type="dxa"/>
+            <w:tcW w:w="2494" w:type="dxa"/>
             <w:tcMar>
               <w:top w:w="45" w:type="dxa"/>
               <w:left w:w="80" w:type="dxa"/>
@@ -7834,23 +7714,23 @@
         </w:tc>
         <w:tc>
           <w:tcPr>
-            <w:tcW w:w="1600" w:type="dxa"/>
-            <w:tcMar>
-              <w:top w:w="45" w:type="dxa"/>
-              <w:left w:w="80" w:type="dxa"/>
-              <w:bottom w:w="45" w:type="dxa"/>
-              <w:right w:w="80" w:type="dxa"/>
-            </w:tcMar>
-          </w:tcPr>
-          <w:p>
-            <w:r>
-              <w:t>☐ личное ознакомление не подтверждено</w:t>
-            </w:r>
-          </w:p>
-        </w:tc>
-        <w:tc>
-          <w:tcPr>
-            <w:tcW w:w="1638" w:type="dxa"/>
+            <w:tcW w:w="3402" w:type="dxa"/>
+            <w:tcMar>
+              <w:top w:w="45" w:type="dxa"/>
+              <w:left w:w="80" w:type="dxa"/>
+              <w:bottom w:w="45" w:type="dxa"/>
+              <w:right w:w="80" w:type="dxa"/>
+            </w:tcMar>
+          </w:tcPr>
+          <w:p>
+            <w:r>
+              <w:t>☐ не подтверждено</w:t>
+            </w:r>
+          </w:p>
+        </w:tc>
+        <w:tc>
+          <w:tcPr>
+            <w:tcW w:w="1134" w:type="dxa"/>
             <w:tcMar>
               <w:top w:w="45" w:type="dxa"/>
               <w:left w:w="80" w:type="dxa"/>
@@ -7872,7 +7752,7 @@
         </w:trPr>
         <w:tc>
           <w:tcPr>
-            <w:tcW w:w="3600" w:type="dxa"/>
+            <w:tcW w:w="2438" w:type="dxa"/>
             <w:tcMar>
               <w:top w:w="45" w:type="dxa"/>
               <w:left w:w="80" w:type="dxa"/>
@@ -7888,7 +7768,7 @@
         </w:tc>
         <w:tc>
           <w:tcPr>
-            <w:tcW w:w="2800" w:type="dxa"/>
+            <w:tcW w:w="2494" w:type="dxa"/>
             <w:tcMar>
               <w:top w:w="45" w:type="dxa"/>
               <w:left w:w="80" w:type="dxa"/>
@@ -7904,23 +7784,23 @@
         </w:tc>
         <w:tc>
           <w:tcPr>
-            <w:tcW w:w="1600" w:type="dxa"/>
-            <w:tcMar>
-              <w:top w:w="45" w:type="dxa"/>
-              <w:left w:w="80" w:type="dxa"/>
-              <w:bottom w:w="45" w:type="dxa"/>
-              <w:right w:w="80" w:type="dxa"/>
-            </w:tcMar>
-          </w:tcPr>
-          <w:p>
-            <w:r>
-              <w:t>☐ личное ознакомление не подтверждено</w:t>
-            </w:r>
-          </w:p>
-        </w:tc>
-        <w:tc>
-          <w:tcPr>
-            <w:tcW w:w="1638" w:type="dxa"/>
+            <w:tcW w:w="3402" w:type="dxa"/>
+            <w:tcMar>
+              <w:top w:w="45" w:type="dxa"/>
+              <w:left w:w="80" w:type="dxa"/>
+              <w:bottom w:w="45" w:type="dxa"/>
+              <w:right w:w="80" w:type="dxa"/>
+            </w:tcMar>
+          </w:tcPr>
+          <w:p>
+            <w:r>
+              <w:t>☐ не подтверждено</w:t>
+            </w:r>
+          </w:p>
+        </w:tc>
+        <w:tc>
+          <w:tcPr>
+            <w:tcW w:w="1134" w:type="dxa"/>
             <w:tcMar>
               <w:top w:w="45" w:type="dxa"/>
               <w:left w:w="80" w:type="dxa"/>
@@ -7942,7 +7822,7 @@
         </w:trPr>
         <w:tc>
           <w:tcPr>
-            <w:tcW w:w="3600" w:type="dxa"/>
+            <w:tcW w:w="2438" w:type="dxa"/>
             <w:tcMar>
               <w:top w:w="45" w:type="dxa"/>
               <w:left w:w="80" w:type="dxa"/>
@@ -7958,7 +7838,7 @@
         </w:tc>
         <w:tc>
           <w:tcPr>
-            <w:tcW w:w="2800" w:type="dxa"/>
+            <w:tcW w:w="2494" w:type="dxa"/>
             <w:tcMar>
               <w:top w:w="45" w:type="dxa"/>
               <w:left w:w="80" w:type="dxa"/>
@@ -7974,23 +7854,23 @@
         </w:tc>
         <w:tc>
           <w:tcPr>
-            <w:tcW w:w="1600" w:type="dxa"/>
-            <w:tcMar>
-              <w:top w:w="45" w:type="dxa"/>
-              <w:left w:w="80" w:type="dxa"/>
-              <w:bottom w:w="45" w:type="dxa"/>
-              <w:right w:w="80" w:type="dxa"/>
-            </w:tcMar>
-          </w:tcPr>
-          <w:p>
-            <w:r>
-              <w:t>☐ личное ознакомление не подтверждено</w:t>
-            </w:r>
-          </w:p>
-        </w:tc>
-        <w:tc>
-          <w:tcPr>
-            <w:tcW w:w="1638" w:type="dxa"/>
+            <w:tcW w:w="3402" w:type="dxa"/>
+            <w:tcMar>
+              <w:top w:w="45" w:type="dxa"/>
+              <w:left w:w="80" w:type="dxa"/>
+              <w:bottom w:w="45" w:type="dxa"/>
+              <w:right w:w="80" w:type="dxa"/>
+            </w:tcMar>
+          </w:tcPr>
+          <w:p>
+            <w:r>
+              <w:t>☐ не подтверждено</w:t>
+            </w:r>
+          </w:p>
+        </w:tc>
+        <w:tc>
+          <w:tcPr>
+            <w:tcW w:w="1134" w:type="dxa"/>
             <w:tcMar>
               <w:top w:w="45" w:type="dxa"/>
               <w:left w:w="80" w:type="dxa"/>
@@ -8012,7 +7892,7 @@
         </w:trPr>
         <w:tc>
           <w:tcPr>
-            <w:tcW w:w="3600" w:type="dxa"/>
+            <w:tcW w:w="2438" w:type="dxa"/>
             <w:tcMar>
               <w:top w:w="45" w:type="dxa"/>
               <w:left w:w="80" w:type="dxa"/>
@@ -8028,7 +7908,7 @@
         </w:tc>
         <w:tc>
           <w:tcPr>
-            <w:tcW w:w="2800" w:type="dxa"/>
+            <w:tcW w:w="2494" w:type="dxa"/>
             <w:tcMar>
               <w:top w:w="45" w:type="dxa"/>
               <w:left w:w="80" w:type="dxa"/>
@@ -8044,23 +7924,23 @@
         </w:tc>
         <w:tc>
           <w:tcPr>
-            <w:tcW w:w="1600" w:type="dxa"/>
-            <w:tcMar>
-              <w:top w:w="45" w:type="dxa"/>
-              <w:left w:w="80" w:type="dxa"/>
-              <w:bottom w:w="45" w:type="dxa"/>
-              <w:right w:w="80" w:type="dxa"/>
-            </w:tcMar>
-          </w:tcPr>
-          <w:p>
-            <w:r>
-              <w:t>☐ личное ознакомление не подтверждено</w:t>
-            </w:r>
-          </w:p>
-        </w:tc>
-        <w:tc>
-          <w:tcPr>
-            <w:tcW w:w="1638" w:type="dxa"/>
+            <w:tcW w:w="3402" w:type="dxa"/>
+            <w:tcMar>
+              <w:top w:w="45" w:type="dxa"/>
+              <w:left w:w="80" w:type="dxa"/>
+              <w:bottom w:w="45" w:type="dxa"/>
+              <w:right w:w="80" w:type="dxa"/>
+            </w:tcMar>
+          </w:tcPr>
+          <w:p>
+            <w:r>
+              <w:t>☐ не подтверждено</w:t>
+            </w:r>
+          </w:p>
+        </w:tc>
+        <w:tc>
+          <w:tcPr>
+            <w:tcW w:w="1134" w:type="dxa"/>
             <w:tcMar>
               <w:top w:w="45" w:type="dxa"/>
               <w:left w:w="80" w:type="dxa"/>
@@ -9974,12 +9854,9 @@
       </w:pPr>
       <w:r>
         <w:rPr>
-          <w:rFonts w:ascii="Times New Roman" w:hAnsi="Times New Roman" w:cs="Times New Roman"/>
-          <w:color w:val="5B6573"/>
           <w:sz w:val="20"/>
-          <w:szCs w:val="28"/>
-        </w:rPr>
-        <w:t>Правила курса обязательны для всех команд; добавьте собственные правила команды.</w:t>
+        </w:rPr>
+        <w:t>Команда использует ИИ только как вспомогательный инструмент и проверяет материалы перед включением в отчёт или код.</w:t>
       </w:r>
     </w:p>
     <w:tbl>
@@ -10265,7 +10142,7 @@
           </w:tcPr>
           <w:p>
             <w:r>
-              <w:t>Черновики карточки GoCue, Vision, устава, README и бэклога</w:t>
+              <w:t>Черновики карточки, Vision, устава и README</w:t>
             </w:r>
           </w:p>
         </w:tc>
@@ -10275,7 +10152,7 @@
           </w:tcPr>
           <w:p>
             <w:r>
-              <w:t>Черновик принят для обсуждения; утверждение темы, ролей и фактов ожидается</w:t>
+              <w:t>Черновик принят; требовалась проверка команды</w:t>
             </w:r>
           </w:p>
         </w:tc>
@@ -10285,7 +10162,7 @@
           </w:tcPr>
           <w:p>
             <w:r>
-              <w:t>Сверены структура с заданием и исходная спецификация проекта; сравнение аналогов и формулировки команда должна перепроверить</w:t>
+              <w:t>Структура сверена с заданием и спецификацией; аналоги проверены позднее по справкам Apple и Google</w:t>
             </w:r>
           </w:p>
         </w:tc>
@@ -10887,12 +10764,7 @@
         </w:rPr>
       </w:pPr>
       <w:r>
-        <w:rPr>
-          <w:rFonts w:ascii="Times New Roman" w:hAnsi="Times New Roman" w:cs="Times New Roman"/>
-          <w:sz w:val="28"/>
-          <w:szCs w:val="28"/>
-        </w:rPr>
-        <w:t>6.2. Шаблон README.md</w:t>
+        <w:t>6.2. Краткое содержание README.md</w:t>
       </w:r>
     </w:p>
     <w:p>
@@ -10906,12 +10778,9 @@
       </w:pPr>
       <w:r>
         <w:rPr>
-          <w:rFonts w:ascii="Times New Roman" w:hAnsi="Times New Roman" w:cs="Times New Roman"/>
-          <w:color w:val="5B6573"/>
           <w:sz w:val="20"/>
-          <w:szCs w:val="28"/>
-        </w:rPr>
-        <w:t>Скопируйте текст в файл README.md в корне репозитория и заполните.</w:t>
+        </w:rPr>
+        <w:t>Ниже приведено краткое содержание; полный актуальный README.md размещён в корне репозитория GoCue.</w:t>
       </w:r>
     </w:p>
     <w:tbl>
@@ -10953,27 +10822,10 @@
           </w:tcPr>
           <w:p>
             <w:r>
-              <w:t># GoCue</w:t>
+              <w:t>GoCue — учебный проект команды «Диалог»: мобильное приложение, которое возвращает записанное дело во время посещения подходящего места.</w:t>
               <w:br/>
               <w:br/>
-              <w:t>Локальное мобильное приложение: намерение появляется при подтверждённом визите в подходящее место.</w:t>
-              <w:br/>
-              <w:br/>
-              <w:t>## Команда «Диалог»</w:t>
-              <w:br/>
-              <w:t>Бартоломей А. М. — менеджер проекта, аналитик, технический писатель; Боровик Ф. И. — разработчик, технический писатель; Золотилина Е. С. — разработчик, дизайнер; Поспелова М. Т. — разработчик, тестировщик.</w:t>
-              <w:br/>
-              <w:br/>
-              <w:t>## Документы</w:t>
-              <w:br/>
-              <w:t>Отчёт ЛР 1: docs/lab-01/</w:t>
-              <w:br/>
-              <w:t>Доска задач: https://github.com/users/techmo0/projects/1/views/1</w:t>
-              <w:br/>
-              <w:br/>
-              <w:t>## Статус</w:t>
-              <w:br/>
-              <w:t>ЛР 1 — инициация; тема согласована с преподавателем.</w:t>
+              <w:t>README.md содержит состав команды и роли, границы MVP, ссылки на продуктовую спецификацию, отчёт ЛР 1, черновик задач, репозиторий и доску GitHub Projects. В нём отмечено, что мобильная платформа пока не выбрана, а тема проекта согласована с преподавателем.</w:t>
             </w:r>
           </w:p>
         </w:tc>
@@ -12223,7 +12075,7 @@
           </w:tcPr>
           <w:p>
             <w:r>
-              <w:t>Составить матрицу компетенций и распределить роли</w:t>
+              <w:t>Дополнить самооценку компетенций участников</w:t>
             </w:r>
           </w:p>
         </w:tc>
@@ -12271,7 +12123,7 @@
           </w:tcPr>
           <w:p>
             <w:r>
-              <w:t>Backlog — issue ещё не создан</w:t>
+              <w:t>Не завершено; issue не создан</w:t>
             </w:r>
           </w:p>
         </w:tc>
@@ -12361,7 +12213,7 @@
           </w:tcPr>
           <w:p>
             <w:r>
-              <w:t>Backlog — issue ещё не создан</w:t>
+              <w:t>Выполнено в отчёте; issue не создан</w:t>
             </w:r>
           </w:p>
         </w:tc>
@@ -12398,7 +12250,7 @@
           </w:tcPr>
           <w:p>
             <w:r>
-              <w:t>Создать организацию, репозиторий и README</w:t>
+              <w:t>Решить вопрос с организацией GitHub</w:t>
             </w:r>
           </w:p>
         </w:tc>
@@ -12446,7 +12298,7 @@
           </w:tcPr>
           <w:p>
             <w:r>
-              <w:t>Backlog — issue ещё не создан</w:t>
+              <w:t>Не завершено; репозиторий и README уже есть; issue не создан</w:t>
             </w:r>
           </w:p>
         </w:tc>
@@ -12485,7 +12337,7 @@
           </w:tcPr>
           <w:p>
             <w:r>
-              <w:t>Настроить доску GitHub Projects</w:t>
+              <w:t>Донастроить доску GitHub Projects</w:t>
             </w:r>
           </w:p>
         </w:tc>
@@ -12536,7 +12388,7 @@
           </w:tcPr>
           <w:p>
             <w:r>
-              <w:t>Backlog — issue ещё не создан</w:t>
+              <w:t>Доска создана; настройки не подтверждены; issue не создан</w:t>
             </w:r>
           </w:p>
         </w:tc>
@@ -12621,7 +12473,7 @@
           </w:tcPr>
           <w:p>
             <w:r>
-              <w:t>Backlog — issue ещё не создан</w:t>
+              <w:t>Черновик есть в отчёте; issue не создан</w:t>
             </w:r>
           </w:p>
         </w:tc>
@@ -12711,7 +12563,7 @@
           </w:tcPr>
           <w:p>
             <w:r>
-              <w:t>Backlog — issue ещё не создан</w:t>
+              <w:t>Не выполнено; issue не создан</w:t>
             </w:r>
           </w:p>
         </w:tc>
@@ -12796,7 +12648,7 @@
           </w:tcPr>
           <w:p>
             <w:r>
-              <w:t>Backlog — issue ещё не создан</w:t>
+              <w:t>Черновик есть в отчёте; issue не создан</w:t>
             </w:r>
           </w:p>
         </w:tc>
@@ -12835,7 +12687,7 @@
           </w:tcPr>
           <w:p>
             <w:r>
-              <w:t>Сформулировать рабочие соглашения и DoD</w:t>
+              <w:t>Утвердить рабочие соглашения и критерии готовности</w:t>
             </w:r>
           </w:p>
         </w:tc>
@@ -12886,7 +12738,7 @@
           </w:tcPr>
           <w:p>
             <w:r>
-              <w:t>Backlog — issue ещё не создан</w:t>
+              <w:t>Черновик есть; согласование не подтверждено; issue не создан</w:t>
             </w:r>
           </w:p>
         </w:tc>
@@ -12923,7 +12775,7 @@
           </w:tcPr>
           <w:p>
             <w:r>
-              <w:t>Сформулировать политику ИИ и завести журнал ИИ</w:t>
+              <w:t>Утвердить политику ИИ и вести журнал использования</w:t>
             </w:r>
           </w:p>
         </w:tc>
@@ -12971,7 +12823,7 @@
           </w:tcPr>
           <w:p>
             <w:r>
-              <w:t>Backlog — issue ещё не создан</w:t>
+              <w:t>Черновик есть; согласование не подтверждено; issue не создан</w:t>
             </w:r>
           </w:p>
         </w:tc>
@@ -13010,7 +12862,7 @@
           </w:tcPr>
           <w:p>
             <w:r>
-              <w:t>Собрать отчёт и загрузить на портал и в репозиторий</w:t>
+              <w:t>Загрузить отчёт на портал</w:t>
             </w:r>
           </w:p>
         </w:tc>
@@ -13061,7 +12913,7 @@
           </w:tcPr>
           <w:p>
             <w:r>
-              <w:t>Backlog — issue ещё не создан</w:t>
+              <w:t>Не подтверждено; отчёт есть в репозитории; issue не создан</w:t>
             </w:r>
           </w:p>
         </w:tc>
@@ -13146,7 +12998,7 @@
           </w:tcPr>
           <w:p>
             <w:r>
-              <w:t>Backlog — issue ещё не создан</w:t>
+              <w:t>Не выполнено; issue не создан</w:t>
             </w:r>
           </w:p>
         </w:tc>
@@ -13185,7 +13037,7 @@
           </w:tcPr>
           <w:p>
             <w:r>
-              <w:t>Проверить аналоги и сценарии с добровольцами</w:t>
+              <w:t>Проверить сценарии с добровольцами</w:t>
             </w:r>
           </w:p>
         </w:tc>
@@ -13236,7 +13088,7 @@
           </w:tcPr>
           <w:p>
             <w:r>
-              <w:t>Backlog — issue ещё не создан</w:t>
+              <w:t>Не выполнено; сведения об аналогах сверены со справками; issue не создан</w:t>
             </w:r>
           </w:p>
         </w:tc>
@@ -13273,7 +13125,7 @@
           </w:tcPr>
           <w:p>
             <w:r>
-              <w:t>Выбрать платформу, проверить системные API и собрать доменный прототип</w:t>
+              <w:t>Выбрать платформу, проверить системные API и собрать прототип логики без GPS</w:t>
             </w:r>
           </w:p>
         </w:tc>
@@ -13321,7 +13173,7 @@
           </w:tcPr>
           <w:p>
             <w:r>
-              <w:t>Backlog — issue ещё не создан</w:t>
+              <w:t>Не выполнено; issue не создан</w:t>
             </w:r>
           </w:p>
         </w:tc>
@@ -13414,7 +13266,7 @@
         <w:rPr>
           <w:sz w:val="20"/>
         </w:rPr>
-        <w:t>К моменту подготовки отчёта тема GoCue согласована с преподавателем, роли подтверждены командой, есть спецификация, репозиторий и ссылка на созданную доску GitHub Projects. Матрица компетенций ещё не заполнена. Рецензия другой команды и ретроспектива не проведены; преподавателю пока не предоставлен доступ к приватной доске. Наполнение доски задачами, мини-защита и загрузка на портал также не подтверждены. После фактического выполнения команда дополнит этот раздел результатами ретроспективы: что получилось, что мешало, что меняем в ЛР 2.</w:t>
+        <w:t>К моменту подготовки отчёта тема GoCue согласована с преподавателем, роли подтверждены командой, есть спецификация, репозиторий и ссылка на созданную доску GitHub Projects. Матрица компетенций заполнена частично: остальные оценки участники должны выставить сами. Рецензия другой команды и ретроспектива не проведены; преподавателю пока не предоставлен доступ к приватной доске. Наполнение доски задачами, мини-защита и загрузка на портал также не подтверждены. После фактического выполнения команда дополнит этот раздел результатами ретроспективы: что получилось, что мешало, что меняем в ЛР 2.</w:t>
       </w:r>
     </w:p>
     <w:p>

</xml_diff>

<commit_message>
Record Android platform and Galaxy S25 test device
</commit_message>
<xml_diff>
--- a/docs/lab-01/ЛР1_Отчёт_GoCue.docx
+++ b/docs/lab-01/ЛР1_Отчёт_GoCue.docx
@@ -522,7 +522,7 @@
           </w:tcPr>
           <w:p>
             <w:r>
-              <w:t>GoCue — мобильное приложение для напоминаний о делах в подходящем месте; тема согласована с преподавателем по сообщению команды.</w:t>
+              <w:t>GoCue — мобильное приложение для напоминаний о делах в подходящем месте.</w:t>
             </w:r>
           </w:p>
         </w:tc>
@@ -750,7 +750,7 @@
           </w:tcPr>
           <w:p>
             <w:r>
-              <w:t>Только системные API геолокации, геозон и уведомлений выбранной ОС; внешнего сетевого API нет.</w:t>
+              <w:t>Только системные API геолокации, геозон и уведомлений Android; внешнего сетевого API нет.</w:t>
             </w:r>
           </w:p>
         </w:tc>
@@ -826,7 +826,7 @@
           </w:tcPr>
           <w:p>
             <w:r>
-              <w:t>Нативное приложение: Android/Kotlin/Jetpack Compose/Room либо iOS/Swift/SwiftUI/SwiftData. Платформу определим после оценки навыков и устройств. Правила показа намерений отделены от данных GPS.</w:t>
+              <w:t>Выбрана платформа Android; предполагаемые технологии — Kotlin, Jetpack Compose и Room. Правила показа намерений отделены от данных GPS.</w:t>
             </w:r>
           </w:p>
         </w:tc>
@@ -1353,7 +1353,7 @@
           </w:tcPr>
           <w:p>
             <w:r>
-              <w:t>Добровольцы доступны; устройство и ОС для испытаний ещё не подтверждены.</w:t>
+              <w:t>Платформа Android и смартфон для испытаний выбраны; пользовательские сценарии с добровольцами ещё нужно согласовать.</w:t>
             </w:r>
           </w:p>
         </w:tc>
@@ -1554,7 +1554,7 @@
           </w:tcPr>
           <w:p>
             <w:r>
-              <w:t>Интеграция с системными геозонами планируется, но платформа и прототип ещё впереди.</w:t>
+              <w:t>Интеграция с системными геозонами Android планируется, но на устройстве ещё не проверена.</w:t>
             </w:r>
           </w:p>
         </w:tc>
@@ -1672,7 +1672,7 @@
           </w:tcPr>
           <w:p>
             <w:r>
-              <w:t>1</w:t>
+              <w:t>2</w:t>
             </w:r>
           </w:p>
         </w:tc>
@@ -1688,7 +1688,7 @@
           </w:tcPr>
           <w:p>
             <w:r>
-              <w:t>Тема согласована с преподавателем, роли подтверждены; матрица компетенций заполнена частично и требует самооценки участников.</w:t>
+              <w:t>Тема согласована, роли подтверждены, Android и устройство для испытаний выбраны; в матрице компетенций ещё нужны оценки участников.</w:t>
             </w:r>
           </w:p>
         </w:tc>
@@ -1743,7 +1743,7 @@
           </w:tcPr>
           <w:p>
             <w:r>
-              <w:t>11/14 (предварительно)</w:t>
+              <w:t>12/14 (предварительно)</w:t>
             </w:r>
           </w:p>
         </w:tc>
@@ -1760,7 +1760,7 @@
           </w:tcPr>
           <w:p>
             <w:r>
-              <w:t>Уточнить после выбора платформы, проверки устройства и интервью.</w:t>
+              <w:t>Уточнить после проверки геозон на устройстве и интервью с пользователями.</w:t>
             </w:r>
           </w:p>
         </w:tc>
@@ -4572,7 +4572,7 @@
         </w:rPr>
       </w:pPr>
       <w:r>
-        <w:t>Допущение: команда сможет проверить фоновую геолокацию на устройстве выбранной платформы; до этого логику проверяем симуляцией без GPS.</w:t>
+        <w:t>Допущение: Samsung Galaxy S25 будет доступен для испытаний фоновой геолокации Android; до испытаний логику проверяем симуляцией без GPS.</w:t>
       </w:r>
     </w:p>
     <w:p>
@@ -4590,7 +4590,7 @@
         </w:rPr>
       </w:pPr>
       <w:r>
-        <w:t>Ограничение: MVP — одно нативное мобильное приложение с локальным хранением без сервера, аккаунта и LLM; платформу команда ещё выбирает.</w:t>
+        <w:t>Ограничение: MVP — нативное приложение для Android с локальным хранением без сервера, аккаунта и LLM.</w:t>
       </w:r>
     </w:p>
     <w:p>
@@ -5226,7 +5226,7 @@
           </w:tcPr>
           <w:p>
             <w:r>
-              <w:t>Согласованная тема, выбранная платформа и прототип правил работы намерений без GPS</w:t>
+              <w:t>Согласованная тема, Android как платформа и прототип правил работы намерений без GPS</w:t>
             </w:r>
           </w:p>
         </w:tc>
@@ -6112,7 +6112,7 @@
           </w:tcPr>
           <w:p>
             <w:r>
-              <w:t>Выбор между Android и iOS не сделан; фоновые API и тестовое устройство нужно проверить рано.</w:t>
+              <w:t>Выбран Android и определён смартфон для испытаний; ограничения фоновой геолокации ещё нужно проверить на устройстве.</w:t>
             </w:r>
           </w:p>
         </w:tc>
@@ -6838,7 +6838,7 @@
           </w:tcPr>
           <w:p>
             <w:r>
-              <w:t>Выбрать одну ОС, начать с правил работы намерений и симуляции, пересматривать объём</w:t>
+              <w:t>Разрабатывать только под Android, начать с правил работы намерений и симуляции, пересматривать объём</w:t>
             </w:r>
           </w:p>
         </w:tc>
@@ -10825,7 +10825,7 @@
               <w:t>GoCue — учебный проект команды «Диалог»: мобильное приложение, которое возвращает записанное дело во время посещения подходящего места.</w:t>
               <w:br/>
               <w:br/>
-              <w:t>README.md содержит состав команды и роли, границы MVP, ссылки на продуктовую спецификацию, отчёт ЛР 1, черновик задач, репозиторий и доску GitHub Projects. В нём отмечено, что мобильная платформа пока не выбрана, а тема проекта согласована с преподавателем.</w:t>
+              <w:t>README.md содержит состав команды и роли, границы MVP, ссылки на продуктовую спецификацию, отчёт ЛР 1, черновик задач, репозиторий и доску GitHub Projects. В нём отмечено, что выбрана платформа Android, а испытания геозон планируются на смартфоне.</w:t>
             </w:r>
           </w:p>
         </w:tc>
@@ -13125,7 +13125,7 @@
           </w:tcPr>
           <w:p>
             <w:r>
-              <w:t>Выбрать платформу, проверить системные API и собрать прототип логики без GPS</w:t>
+              <w:t>Проверить системные API Android на Samsung Galaxy S25 и собрать прототип логики без GPS</w:t>
             </w:r>
           </w:p>
         </w:tc>
@@ -13173,7 +13173,7 @@
           </w:tcPr>
           <w:p>
             <w:r>
-              <w:t>Не выполнено; issue не создан</w:t>
+              <w:t>Не выполнено; платформа и устройство выбраны; issue не создан</w:t>
             </w:r>
           </w:p>
         </w:tc>
@@ -13266,7 +13266,7 @@
         <w:rPr>
           <w:sz w:val="20"/>
         </w:rPr>
-        <w:t>К моменту подготовки отчёта тема GoCue согласована с преподавателем, роли подтверждены командой, есть спецификация, репозиторий и ссылка на созданную доску GitHub Projects. Матрица компетенций заполнена частично: остальные оценки участники должны выставить сами. Рецензия другой команды и ретроспектива не проведены; преподавателю пока не предоставлен доступ к приватной доске. Наполнение доски задачами, мини-защита и загрузка на портал также не подтверждены. После фактического выполнения команда дополнит этот раздел результатами ретроспективы: что получилось, что мешало, что меняем в ЛР 2.</w:t>
+        <w:t>К моменту подготовки отчёта тема GoCue согласована с преподавателем, роли подтверждены командой, выбрана платформа Android и определён смартфон для испытаний. Есть спецификация, репозиторий и ссылка на созданную доску GitHub Projects. Матрица компетенций заполнена частично: остальные оценки участники должны выставить сами. Рецензия другой команды и ретроспектива не проведены; преподавателю пока не предоставлен доступ к приватной доске. Наполнение доски задачами, мини-защита и загрузка на портал также не подтверждены. После фактического выполнения команда дополнит этот раздел результатами ретроспективы: что получилось, что мешало, что меняем в ЛР 2.</w:t>
       </w:r>
     </w:p>
     <w:p>

</xml_diff>

<commit_message>
Align report headings and clarify team rules
</commit_message>
<xml_diff>
--- a/docs/lab-01/ЛР1_Отчёт_GoCue.docx
+++ b/docs/lab-01/ЛР1_Отчёт_GoCue.docx
@@ -560,7 +560,7 @@
           </w:tcPr>
           <w:p>
             <w:r>
-              <w:t>Люди забывают о делах, которые можно выполнить в определённом месте: например, вспоминают о нужной покупке уже после ухода из магазина. Список приходится проверять вручную, а напоминание на заданное время может прийти до визита или после него. Частоту этой проблемы ещё предстоит проверить с пользователями.</w:t>
+              <w:t>Люди забывают о делах, которые можно выполнить в определённом месте: например, вспоминают о нужной покупке уже после ухода из магазина. Список приходится проверять вручную, а напоминание на заданное время может прийти до визита или после него.</w:t>
             </w:r>
           </w:p>
         </w:tc>
@@ -1688,7 +1688,7 @@
           </w:tcPr>
           <w:p>
             <w:r>
-              <w:t>Тема согласована, роли подтверждены, Android и устройство для испытаний выбраны; в матрице компетенций ещё нужны оценки участников.</w:t>
+              <w:t>Тема согласована, роли подтверждены, Android и устройство для испытаний выбраны.</w:t>
             </w:r>
           </w:p>
         </w:tc>
@@ -2560,43 +2560,8 @@
             </w:tcMar>
           </w:tcPr>
           <w:p>
-            <w:pPr>
-              <w:spacing w:after="30" w:line="245" w:lineRule="auto"/>
-              <w:rPr>
-                <w:rFonts w:ascii="Times New Roman" w:hAnsi="Times New Roman" w:cs="Times New Roman"/>
-                <w:sz w:val="28"/>
-                <w:szCs w:val="28"/>
-              </w:rPr>
-            </w:pPr>
-            <w:r>
-              <w:rPr>
-                <w:rFonts w:ascii="Times New Roman" w:hAnsi="Times New Roman" w:cs="Times New Roman"/>
-                <w:b/>
-                <w:bCs/>
-                <w:sz w:val="28"/>
-                <w:szCs w:val="28"/>
-              </w:rPr>
-              <w:t xml:space="preserve">[Название] </w:t>
-            </w:r>
-            <w:r>
-              <w:rPr>
-                <w:rFonts w:ascii="Times New Roman" w:hAnsi="Times New Roman" w:cs="Times New Roman"/>
-                <w:b/>
-                <w:bCs/>
-                <w:sz w:val="28"/>
-                <w:szCs w:val="28"/>
-              </w:rPr>
-              <w:t>–</w:t>
-            </w:r>
-            <w:r>
-              <w:rPr>
-                <w:rFonts w:ascii="Times New Roman" w:hAnsi="Times New Roman" w:cs="Times New Roman"/>
-                <w:b/>
-                <w:bCs/>
-                <w:sz w:val="28"/>
-                <w:szCs w:val="28"/>
-              </w:rPr>
-              <w:t xml:space="preserve"> это</w:t>
+            <w:r>
+              <w:t>GoCue – это</w:t>
             </w:r>
           </w:p>
         </w:tc>
@@ -5576,25 +5541,8 @@
             </w:tcMar>
           </w:tcPr>
           <w:p>
-            <w:pPr>
-              <w:spacing w:after="30" w:line="245" w:lineRule="auto"/>
-              <w:jc w:val="center"/>
-              <w:rPr>
-                <w:rFonts w:ascii="Times New Roman" w:hAnsi="Times New Roman" w:cs="Times New Roman"/>
-                <w:sz w:val="28"/>
-                <w:szCs w:val="28"/>
-              </w:rPr>
-            </w:pPr>
-            <w:r>
-              <w:rPr>
-                <w:rFonts w:ascii="Times New Roman" w:hAnsi="Times New Roman" w:cs="Times New Roman"/>
-                <w:b/>
-                <w:bCs/>
-                <w:color w:val="FFFFFF"/>
-                <w:sz w:val="28"/>
-                <w:szCs w:val="28"/>
-              </w:rPr>
-              <w:t>Влияние (В / С / Н)</w:t>
+            <w:r>
+              <w:t>Влияние на проект</w:t>
             </w:r>
           </w:p>
         </w:tc>
@@ -5681,7 +5629,7 @@
           </w:tcPr>
           <w:p>
             <w:r>
-              <w:t>С</w:t>
+              <w:t>Среднее</w:t>
             </w:r>
           </w:p>
         </w:tc>
@@ -5751,7 +5699,7 @@
           </w:tcPr>
           <w:p>
             <w:r>
-              <w:t>С</w:t>
+              <w:t>Среднее</w:t>
             </w:r>
           </w:p>
         </w:tc>
@@ -5821,7 +5769,7 @@
           </w:tcPr>
           <w:p>
             <w:r>
-              <w:t>В</w:t>
+              <w:t>Высокое</w:t>
             </w:r>
           </w:p>
         </w:tc>
@@ -5891,7 +5839,7 @@
           </w:tcPr>
           <w:p>
             <w:r>
-              <w:t>В</w:t>
+              <w:t>Высокое</w:t>
             </w:r>
           </w:p>
         </w:tc>
@@ -6058,7 +6006,7 @@
           </w:tcPr>
           <w:p>
             <w:r>
-              <w:t>Часы участников вне занятий не подтверждены; оценить после самооценки.</w:t>
+              <w:t>Часы участников вне занятий не подтверждены; оценить на планировании.</w:t>
             </w:r>
           </w:p>
         </w:tc>
@@ -8038,16 +7986,16 @@
         <w:tblLook w:firstColumn="1" w:firstRow="1" w:lastColumn="0" w:lastRow="0" w:noHBand="0" w:noVBand="1" w:val="04A0"/>
       </w:tblPr>
       <w:tblGrid>
-        <w:gridCol w:w="3402"/>
-        <w:gridCol w:w="1417"/>
+        <w:gridCol w:w="3005"/>
         <w:gridCol w:w="1701"/>
         <w:gridCol w:w="1701"/>
-        <w:gridCol w:w="1417"/>
+        <w:gridCol w:w="1701"/>
+        <w:gridCol w:w="1531"/>
       </w:tblGrid>
       <w:tr>
         <w:tc>
           <w:tcPr>
-            <w:tcW w:type="dxa" w:w="3402"/>
+            <w:tcW w:type="dxa" w:w="3005"/>
           </w:tcPr>
           <w:p>
             <w:r>
@@ -8057,7 +8005,7 @@
         </w:tc>
         <w:tc>
           <w:tcPr>
-            <w:tcW w:type="dxa" w:w="1417"/>
+            <w:tcW w:type="dxa" w:w="1701"/>
           </w:tcPr>
           <w:p>
             <w:r>
@@ -8087,7 +8035,7 @@
         </w:tc>
         <w:tc>
           <w:tcPr>
-            <w:tcW w:type="dxa" w:w="1417"/>
+            <w:tcW w:type="dxa" w:w="1531"/>
           </w:tcPr>
           <w:p>
             <w:r>
@@ -8099,7 +8047,7 @@
       <w:tr>
         <w:tc>
           <w:tcPr>
-            <w:tcW w:type="dxa" w:w="3402"/>
+            <w:tcW w:type="dxa" w:w="3005"/>
           </w:tcPr>
           <w:p>
             <w:r>
@@ -8109,21 +8057,11 @@
         </w:tc>
         <w:tc>
           <w:tcPr>
-            <w:tcW w:type="dxa" w:w="1417"/>
-          </w:tcPr>
-          <w:p>
-            <w:r>
-              <w:t>—</w:t>
-            </w:r>
-          </w:p>
-        </w:tc>
-        <w:tc>
-          <w:tcPr>
             <w:tcW w:type="dxa" w:w="1701"/>
           </w:tcPr>
           <w:p>
             <w:r>
-              <w:t>—</w:t>
+              <w:t>3</w:t>
             </w:r>
           </w:p>
         </w:tc>
@@ -8133,25 +8071,35 @@
           </w:tcPr>
           <w:p>
             <w:r>
-              <w:t>—</w:t>
-            </w:r>
-          </w:p>
-        </w:tc>
-        <w:tc>
-          <w:tcPr>
-            <w:tcW w:type="dxa" w:w="1417"/>
-          </w:tcPr>
-          <w:p>
-            <w:r>
-              <w:t>—</w:t>
-            </w:r>
-          </w:p>
-        </w:tc>
-      </w:tr>
-      <w:tr>
-        <w:tc>
-          <w:tcPr>
-            <w:tcW w:type="dxa" w:w="3402"/>
+              <w:t>1</w:t>
+            </w:r>
+          </w:p>
+        </w:tc>
+        <w:tc>
+          <w:tcPr>
+            <w:tcW w:type="dxa" w:w="1701"/>
+          </w:tcPr>
+          <w:p>
+            <w:r>
+              <w:t>1</w:t>
+            </w:r>
+          </w:p>
+        </w:tc>
+        <w:tc>
+          <w:tcPr>
+            <w:tcW w:type="dxa" w:w="1531"/>
+          </w:tcPr>
+          <w:p>
+            <w:r>
+              <w:t>1</w:t>
+            </w:r>
+          </w:p>
+        </w:tc>
+      </w:tr>
+      <w:tr>
+        <w:tc>
+          <w:tcPr>
+            <w:tcW w:type="dxa" w:w="3005"/>
           </w:tcPr>
           <w:p>
             <w:r>
@@ -8161,7 +8109,69 @@
         </w:tc>
         <w:tc>
           <w:tcPr>
-            <w:tcW w:type="dxa" w:w="1417"/>
+            <w:tcW w:type="dxa" w:w="1701"/>
+          </w:tcPr>
+          <w:p>
+            <w:r>
+              <w:t>1</w:t>
+            </w:r>
+          </w:p>
+        </w:tc>
+        <w:tc>
+          <w:tcPr>
+            <w:tcW w:type="dxa" w:w="1701"/>
+          </w:tcPr>
+          <w:p>
+            <w:r>
+              <w:t>3</w:t>
+            </w:r>
+          </w:p>
+        </w:tc>
+        <w:tc>
+          <w:tcPr>
+            <w:tcW w:type="dxa" w:w="1701"/>
+          </w:tcPr>
+          <w:p>
+            <w:r>
+              <w:t>3</w:t>
+            </w:r>
+          </w:p>
+        </w:tc>
+        <w:tc>
+          <w:tcPr>
+            <w:tcW w:type="dxa" w:w="1531"/>
+          </w:tcPr>
+          <w:p>
+            <w:r>
+              <w:t>2</w:t>
+            </w:r>
+          </w:p>
+        </w:tc>
+      </w:tr>
+      <w:tr>
+        <w:tc>
+          <w:tcPr>
+            <w:tcW w:type="dxa" w:w="3005"/>
+          </w:tcPr>
+          <w:p>
+            <w:r>
+              <w:t>Геолокация и геозоны</w:t>
+            </w:r>
+          </w:p>
+        </w:tc>
+        <w:tc>
+          <w:tcPr>
+            <w:tcW w:type="dxa" w:w="1701"/>
+          </w:tcPr>
+          <w:p>
+            <w:r>
+              <w:t>3</w:t>
+            </w:r>
+          </w:p>
+        </w:tc>
+        <w:tc>
+          <w:tcPr>
+            <w:tcW w:type="dxa" w:w="1701"/>
           </w:tcPr>
           <w:p>
             <w:r>
@@ -8175,6 +8185,38 @@
           </w:tcPr>
           <w:p>
             <w:r>
+              <w:t>0</w:t>
+            </w:r>
+          </w:p>
+        </w:tc>
+        <w:tc>
+          <w:tcPr>
+            <w:tcW w:type="dxa" w:w="1531"/>
+          </w:tcPr>
+          <w:p>
+            <w:r>
+              <w:t>2</w:t>
+            </w:r>
+          </w:p>
+        </w:tc>
+      </w:tr>
+      <w:tr>
+        <w:tc>
+          <w:tcPr>
+            <w:tcW w:type="dxa" w:w="3005"/>
+          </w:tcPr>
+          <w:p>
+            <w:r>
+              <w:t>Фоновая работа и уведомления</w:t>
+            </w:r>
+          </w:p>
+        </w:tc>
+        <w:tc>
+          <w:tcPr>
+            <w:tcW w:type="dxa" w:w="1701"/>
+          </w:tcPr>
+          <w:p>
+            <w:r>
               <w:t>3</w:t>
             </w:r>
           </w:p>
@@ -8185,49 +8227,59 @@
           </w:tcPr>
           <w:p>
             <w:r>
+              <w:t>0</w:t>
+            </w:r>
+          </w:p>
+        </w:tc>
+        <w:tc>
+          <w:tcPr>
+            <w:tcW w:type="dxa" w:w="1701"/>
+          </w:tcPr>
+          <w:p>
+            <w:r>
+              <w:t>3</w:t>
+            </w:r>
+          </w:p>
+        </w:tc>
+        <w:tc>
+          <w:tcPr>
+            <w:tcW w:type="dxa" w:w="1531"/>
+          </w:tcPr>
+          <w:p>
+            <w:r>
+              <w:t>1</w:t>
+            </w:r>
+          </w:p>
+        </w:tc>
+      </w:tr>
+      <w:tr>
+        <w:tc>
+          <w:tcPr>
+            <w:tcW w:type="dxa" w:w="3005"/>
+          </w:tcPr>
+          <w:p>
+            <w:r>
+              <w:t>Локальное хранение данных</w:t>
+            </w:r>
+          </w:p>
+        </w:tc>
+        <w:tc>
+          <w:tcPr>
+            <w:tcW w:type="dxa" w:w="1701"/>
+          </w:tcPr>
+          <w:p>
+            <w:r>
               <w:t>2</w:t>
             </w:r>
           </w:p>
         </w:tc>
         <w:tc>
           <w:tcPr>
-            <w:tcW w:type="dxa" w:w="1417"/>
-          </w:tcPr>
-          <w:p>
-            <w:r>
-              <w:t>—</w:t>
-            </w:r>
-          </w:p>
-        </w:tc>
-      </w:tr>
-      <w:tr>
-        <w:tc>
-          <w:tcPr>
-            <w:tcW w:type="dxa" w:w="3402"/>
-          </w:tcPr>
-          <w:p>
-            <w:r>
-              <w:t>Геолокация и геозоны</w:t>
-            </w:r>
-          </w:p>
-        </w:tc>
-        <w:tc>
-          <w:tcPr>
-            <w:tcW w:type="dxa" w:w="1417"/>
-          </w:tcPr>
-          <w:p>
-            <w:r>
-              <w:t>—</w:t>
-            </w:r>
-          </w:p>
-        </w:tc>
-        <w:tc>
-          <w:tcPr>
             <w:tcW w:type="dxa" w:w="1701"/>
           </w:tcPr>
           <w:p>
             <w:r>
-              <w:t>—</w:t>
+              <w:t>1</w:t>
             </w:r>
           </w:p>
         </w:tc>
@@ -8237,39 +8289,29 @@
           </w:tcPr>
           <w:p>
             <w:r>
-              <w:t>—</w:t>
-            </w:r>
-          </w:p>
-        </w:tc>
-        <w:tc>
-          <w:tcPr>
-            <w:tcW w:type="dxa" w:w="1417"/>
-          </w:tcPr>
-          <w:p>
-            <w:r>
-              <w:t>—</w:t>
-            </w:r>
-          </w:p>
-        </w:tc>
-      </w:tr>
-      <w:tr>
-        <w:tc>
-          <w:tcPr>
-            <w:tcW w:type="dxa" w:w="3402"/>
-          </w:tcPr>
-          <w:p>
-            <w:r>
-              <w:t>Фоновая работа и уведомления</w:t>
-            </w:r>
-          </w:p>
-        </w:tc>
-        <w:tc>
-          <w:tcPr>
-            <w:tcW w:type="dxa" w:w="1417"/>
-          </w:tcPr>
-          <w:p>
-            <w:r>
-              <w:t>—</w:t>
+              <w:t>0</w:t>
+            </w:r>
+          </w:p>
+        </w:tc>
+        <w:tc>
+          <w:tcPr>
+            <w:tcW w:type="dxa" w:w="1531"/>
+          </w:tcPr>
+          <w:p>
+            <w:r>
+              <w:t>1</w:t>
+            </w:r>
+          </w:p>
+        </w:tc>
+      </w:tr>
+      <w:tr>
+        <w:tc>
+          <w:tcPr>
+            <w:tcW w:type="dxa" w:w="3005"/>
+          </w:tcPr>
+          <w:p>
+            <w:r>
+              <w:t>Архитектура и логика намерений</w:t>
             </w:r>
           </w:p>
         </w:tc>
@@ -8279,7 +8321,7 @@
           </w:tcPr>
           <w:p>
             <w:r>
-              <w:t>—</w:t>
+              <w:t>3</w:t>
             </w:r>
           </w:p>
         </w:tc>
@@ -8289,39 +8331,7 @@
           </w:tcPr>
           <w:p>
             <w:r>
-              <w:t>—</w:t>
-            </w:r>
-          </w:p>
-        </w:tc>
-        <w:tc>
-          <w:tcPr>
-            <w:tcW w:type="dxa" w:w="1417"/>
-          </w:tcPr>
-          <w:p>
-            <w:r>
-              <w:t>—</w:t>
-            </w:r>
-          </w:p>
-        </w:tc>
-      </w:tr>
-      <w:tr>
-        <w:tc>
-          <w:tcPr>
-            <w:tcW w:type="dxa" w:w="3402"/>
-          </w:tcPr>
-          <w:p>
-            <w:r>
-              <w:t>Локальное хранение данных</w:t>
-            </w:r>
-          </w:p>
-        </w:tc>
-        <w:tc>
-          <w:tcPr>
-            <w:tcW w:type="dxa" w:w="1417"/>
-          </w:tcPr>
-          <w:p>
-            <w:r>
-              <w:t>—</w:t>
+              <w:t>0</w:t>
             </w:r>
           </w:p>
         </w:tc>
@@ -8331,7 +8341,29 @@
           </w:tcPr>
           <w:p>
             <w:r>
-              <w:t>—</w:t>
+              <w:t>1</w:t>
+            </w:r>
+          </w:p>
+        </w:tc>
+        <w:tc>
+          <w:tcPr>
+            <w:tcW w:type="dxa" w:w="1531"/>
+          </w:tcPr>
+          <w:p>
+            <w:r>
+              <w:t>1</w:t>
+            </w:r>
+          </w:p>
+        </w:tc>
+      </w:tr>
+      <w:tr>
+        <w:tc>
+          <w:tcPr>
+            <w:tcW w:type="dxa" w:w="3005"/>
+          </w:tcPr>
+          <w:p>
+            <w:r>
+              <w:t>Тестирование</w:t>
             </w:r>
           </w:p>
         </w:tc>
@@ -8341,39 +8373,7 @@
           </w:tcPr>
           <w:p>
             <w:r>
-              <w:t>—</w:t>
-            </w:r>
-          </w:p>
-        </w:tc>
-        <w:tc>
-          <w:tcPr>
-            <w:tcW w:type="dxa" w:w="1417"/>
-          </w:tcPr>
-          <w:p>
-            <w:r>
-              <w:t>—</w:t>
-            </w:r>
-          </w:p>
-        </w:tc>
-      </w:tr>
-      <w:tr>
-        <w:tc>
-          <w:tcPr>
-            <w:tcW w:type="dxa" w:w="3402"/>
-          </w:tcPr>
-          <w:p>
-            <w:r>
-              <w:t>Архитектура и логика намерений</w:t>
-            </w:r>
-          </w:p>
-        </w:tc>
-        <w:tc>
-          <w:tcPr>
-            <w:tcW w:type="dxa" w:w="1417"/>
-          </w:tcPr>
-          <w:p>
-            <w:r>
-              <w:t>—</w:t>
+              <w:t>1</w:t>
             </w:r>
           </w:p>
         </w:tc>
@@ -8383,7 +8383,7 @@
           </w:tcPr>
           <w:p>
             <w:r>
-              <w:t>—</w:t>
+              <w:t>2</w:t>
             </w:r>
           </w:p>
         </w:tc>
@@ -8393,35 +8393,35 @@
           </w:tcPr>
           <w:p>
             <w:r>
-              <w:t>—</w:t>
-            </w:r>
-          </w:p>
-        </w:tc>
-        <w:tc>
-          <w:tcPr>
-            <w:tcW w:type="dxa" w:w="1417"/>
-          </w:tcPr>
-          <w:p>
-            <w:r>
-              <w:t>—</w:t>
-            </w:r>
-          </w:p>
-        </w:tc>
-      </w:tr>
-      <w:tr>
-        <w:tc>
-          <w:tcPr>
-            <w:tcW w:type="dxa" w:w="3402"/>
-          </w:tcPr>
-          <w:p>
-            <w:r>
-              <w:t>Тестирование</w:t>
-            </w:r>
-          </w:p>
-        </w:tc>
-        <w:tc>
-          <w:tcPr>
-            <w:tcW w:type="dxa" w:w="1417"/>
+              <w:t>3</w:t>
+            </w:r>
+          </w:p>
+        </w:tc>
+        <w:tc>
+          <w:tcPr>
+            <w:tcW w:type="dxa" w:w="1531"/>
+          </w:tcPr>
+          <w:p>
+            <w:r>
+              <w:t>3</w:t>
+            </w:r>
+          </w:p>
+        </w:tc>
+      </w:tr>
+      <w:tr>
+        <w:tc>
+          <w:tcPr>
+            <w:tcW w:type="dxa" w:w="3005"/>
+          </w:tcPr>
+          <w:p>
+            <w:r>
+              <w:t>Анализ потребностей пользователей</w:t>
+            </w:r>
+          </w:p>
+        </w:tc>
+        <w:tc>
+          <w:tcPr>
+            <w:tcW w:type="dxa" w:w="1701"/>
           </w:tcPr>
           <w:p>
             <w:r>
@@ -8435,7 +8435,7 @@
           </w:tcPr>
           <w:p>
             <w:r>
-              <w:t>1</w:t>
+              <w:t>3</w:t>
             </w:r>
           </w:p>
         </w:tc>
@@ -8451,33 +8451,23 @@
         </w:tc>
         <w:tc>
           <w:tcPr>
-            <w:tcW w:type="dxa" w:w="1417"/>
-          </w:tcPr>
-          <w:p>
-            <w:r>
-              <w:t>—</w:t>
-            </w:r>
-          </w:p>
-        </w:tc>
-      </w:tr>
-      <w:tr>
-        <w:tc>
-          <w:tcPr>
-            <w:tcW w:type="dxa" w:w="3402"/>
-          </w:tcPr>
-          <w:p>
-            <w:r>
-              <w:t>Анализ потребностей пользователей</w:t>
-            </w:r>
-          </w:p>
-        </w:tc>
-        <w:tc>
-          <w:tcPr>
-            <w:tcW w:type="dxa" w:w="1417"/>
-          </w:tcPr>
-          <w:p>
-            <w:r>
-              <w:t>—</w:t>
+            <w:tcW w:type="dxa" w:w="1531"/>
+          </w:tcPr>
+          <w:p>
+            <w:r>
+              <w:t>2</w:t>
+            </w:r>
+          </w:p>
+        </w:tc>
+      </w:tr>
+      <w:tr>
+        <w:tc>
+          <w:tcPr>
+            <w:tcW w:type="dxa" w:w="3005"/>
+          </w:tcPr>
+          <w:p>
+            <w:r>
+              <w:t>Техническая документация</w:t>
             </w:r>
           </w:p>
         </w:tc>
@@ -8487,7 +8477,7 @@
           </w:tcPr>
           <w:p>
             <w:r>
-              <w:t>—</w:t>
+              <w:t>3</w:t>
             </w:r>
           </w:p>
         </w:tc>
@@ -8497,39 +8487,7 @@
           </w:tcPr>
           <w:p>
             <w:r>
-              <w:t>—</w:t>
-            </w:r>
-          </w:p>
-        </w:tc>
-        <w:tc>
-          <w:tcPr>
-            <w:tcW w:type="dxa" w:w="1417"/>
-          </w:tcPr>
-          <w:p>
-            <w:r>
-              <w:t>—</w:t>
-            </w:r>
-          </w:p>
-        </w:tc>
-      </w:tr>
-      <w:tr>
-        <w:tc>
-          <w:tcPr>
-            <w:tcW w:type="dxa" w:w="3402"/>
-          </w:tcPr>
-          <w:p>
-            <w:r>
-              <w:t>Техническая документация</w:t>
-            </w:r>
-          </w:p>
-        </w:tc>
-        <w:tc>
-          <w:tcPr>
-            <w:tcW w:type="dxa" w:w="1417"/>
-          </w:tcPr>
-          <w:p>
-            <w:r>
-              <w:t>—</w:t>
+              <w:t>3</w:t>
             </w:r>
           </w:p>
         </w:tc>
@@ -8539,7 +8497,29 @@
           </w:tcPr>
           <w:p>
             <w:r>
-              <w:t>—</w:t>
+              <w:t>2</w:t>
+            </w:r>
+          </w:p>
+        </w:tc>
+        <w:tc>
+          <w:tcPr>
+            <w:tcW w:type="dxa" w:w="1531"/>
+          </w:tcPr>
+          <w:p>
+            <w:r>
+              <w:t>3</w:t>
+            </w:r>
+          </w:p>
+        </w:tc>
+      </w:tr>
+      <w:tr>
+        <w:tc>
+          <w:tcPr>
+            <w:tcW w:type="dxa" w:w="3005"/>
+          </w:tcPr>
+          <w:p>
+            <w:r>
+              <w:t>Что хочу развить</w:t>
             </w:r>
           </w:p>
         </w:tc>
@@ -8549,39 +8529,10 @@
           </w:tcPr>
           <w:p>
             <w:r>
-              <w:t>—</w:t>
-            </w:r>
-          </w:p>
-        </w:tc>
-        <w:tc>
-          <w:tcPr>
-            <w:tcW w:type="dxa" w:w="1417"/>
-          </w:tcPr>
-          <w:p>
-            <w:r>
-              <w:t>—</w:t>
-            </w:r>
-          </w:p>
-        </w:tc>
-      </w:tr>
-      <w:tr>
-        <w:tc>
-          <w:tcPr>
-            <w:tcW w:type="dxa" w:w="3402"/>
-          </w:tcPr>
-          <w:p>
-            <w:r>
-              <w:t>Что хочу развить</w:t>
-            </w:r>
-          </w:p>
-        </w:tc>
-        <w:tc>
-          <w:tcPr>
-            <w:tcW w:type="dxa" w:w="1417"/>
-          </w:tcPr>
-          <w:p>
-            <w:r>
-              <w:t>—</w:t>
+              <w:rPr>
+                <w:sz w:val="17"/>
+              </w:rPr>
+              <w:t>Аналитику и проектирование интерфейса</w:t>
             </w:r>
           </w:p>
         </w:tc>
@@ -8591,7 +8542,10 @@
           </w:tcPr>
           <w:p>
             <w:r>
-              <w:t>—</w:t>
+              <w:rPr>
+                <w:sz w:val="17"/>
+              </w:rPr>
+              <w:t>Разработку во всех сферах</w:t>
             </w:r>
           </w:p>
         </w:tc>
@@ -8601,17 +8555,23 @@
           </w:tcPr>
           <w:p>
             <w:r>
-              <w:t>—</w:t>
-            </w:r>
-          </w:p>
-        </w:tc>
-        <w:tc>
-          <w:tcPr>
-            <w:tcW w:type="dxa" w:w="1417"/>
-          </w:tcPr>
-          <w:p>
-            <w:r>
-              <w:t>—</w:t>
+              <w:rPr>
+                <w:sz w:val="17"/>
+              </w:rPr>
+              <w:t>Геолокация и геозоны, мобильная разработка</w:t>
+            </w:r>
+          </w:p>
+        </w:tc>
+        <w:tc>
+          <w:tcPr>
+            <w:tcW w:type="dxa" w:w="1531"/>
+          </w:tcPr>
+          <w:p>
+            <w:r>
+              <w:rPr>
+                <w:sz w:val="17"/>
+              </w:rPr>
+              <w:t>Мобильная разработка</w:t>
             </w:r>
           </w:p>
         </w:tc>
@@ -9123,12 +9083,15 @@
       </w:r>
     </w:p>
     <w:p>
+      <w:pPr>
+        <w:pStyle w:val="22"/>
+      </w:pPr>
       <w:r>
         <w:rPr>
-          <w:b/>
-          <w:sz w:val="20"/>
-        </w:rPr>
-        <w:t>4.3. Ведущий итерации (Scrum Master)</w:t>
+          <w:rFonts w:ascii="Times New Roman" w:hAnsi="Times New Roman"/>
+          <w:sz w:val="28"/>
+        </w:rPr>
+        <w:t>4.3. Кто ведёт итерацию (Scrum Master)</w:t>
       </w:r>
     </w:p>
     <w:p>
@@ -9136,16 +9099,27 @@
         <w:rPr>
           <w:sz w:val="20"/>
         </w:rPr>
-        <w:t>Scrum Master помогает команде организовать встречи, следит за обновлением задач на доске и помогает устранять препятствия. В ЛР 1 эту роль выполняет Бартоломей А. М. Предлагаемый порядок для следующих итераций: Боровик → Золотилина → Поспелова, по одному участнику на итерацию. График команда утверждает при планировании.</w:t>
+        <w:t>Ведущий итерации организует встречи, следит за задачами и помогает устранить препятствия. В ЛР 1 это Бартоломей А. М. Затем роль предлагается передавать Боровику, Золотилиной и Поспеловой по одной итерации. Порядок ещё должна подтвердить команда.</w:t>
+      </w:r>
+    </w:p>
+    <w:p>
+      <w:pPr>
+        <w:pStyle w:val="22"/>
+      </w:pPr>
+      <w:r>
+        <w:rPr>
+          <w:rFonts w:ascii="Times New Roman" w:hAnsi="Times New Roman"/>
+          <w:sz w:val="28"/>
+        </w:rPr>
+        <w:t>4.4. Правила совместной работы</w:t>
       </w:r>
     </w:p>
     <w:p>
       <w:r>
         <w:rPr>
-          <w:b/>
           <w:sz w:val="20"/>
         </w:rPr>
-        <w:t>4.4. Рабочие соглашения</w:t>
+        <w:t>Это проект договорённостей о связи, задачах, решениях и коде. Команда должна его обсудить и утвердить.</w:t>
       </w:r>
     </w:p>
     <w:tbl>
@@ -9174,7 +9148,7 @@
           </w:tcPr>
           <w:p>
             <w:r>
-              <w:t>Предлагаемое соглашение; требует подтверждения командой</w:t>
+              <w:t>Предлагаемое правило</w:t>
             </w:r>
           </w:p>
         </w:tc>
@@ -9186,7 +9160,7 @@
           </w:tcPr>
           <w:p>
             <w:r>
-              <w:t>Канал и ответ</w:t>
+              <w:t>Общение</w:t>
             </w:r>
           </w:p>
         </w:tc>
@@ -9196,7 +9170,7 @@
           </w:tcPr>
           <w:p>
             <w:r>
-              <w:t>Площадку выбирает команда; на обычное сообщение отвечаем в течение одного рабочего дня. Срочные блокировки помечаем отдельно.</w:t>
+              <w:t>Один общий чат; отвечаем в рабочий день. Срочные вопросы помечаем отдельно.</w:t>
             </w:r>
           </w:p>
         </w:tc>
@@ -9218,7 +9192,7 @@
           </w:tcPr>
           <w:p>
             <w:r>
-              <w:t>Работу дольше часа ведём через issue с исполнителем, результатом и сроком. Статус обновляем в день изменения.</w:t>
+              <w:t>Записываем на доске ответственного и результат; статус обновляем при изменении.</w:t>
             </w:r>
           </w:p>
         </w:tc>
@@ -9240,7 +9214,7 @@
           </w:tcPr>
           <w:p>
             <w:r>
-              <w:t>Сначала обсуждаем в issue; если нет согласия за день, решение по продукту принимает Бартоломей как аналитик, а техническое решение принимают разработчики большинством голосов с записью аргументов.</w:t>
+              <w:t>Требования уточняет Бартоломей; технические решения разработчики принимают вместе. Итог записываем в задаче.</w:t>
             </w:r>
           </w:p>
         </w:tc>
@@ -9252,7 +9226,7 @@
           </w:tcPr>
           <w:p>
             <w:r>
-              <w:t>Git</w:t>
+              <w:t>Изменения кода</w:t>
             </w:r>
           </w:p>
         </w:tc>
@@ -9262,7 +9236,7 @@
           </w:tcPr>
           <w:p>
             <w:r>
-              <w:t>Отдельная ветка на задачу, изменения в main через pull request и ревью другого участника. Секреты и реальные данные в коммиты не попадают.</w:t>
+              <w:t>Работаем в отдельной ветке Git. Перед объединением код проверяет другой участник. Пароли не публикуем.</w:t>
             </w:r>
           </w:p>
         </w:tc>
@@ -9284,7 +9258,7 @@
           </w:tcPr>
           <w:p>
             <w:r>
-              <w:t>Сообщаем о риске минимум за день до срока; делим задачу или переносим с явной записью на доске.</w:t>
+              <w:t>Предупреждаем заранее, согласуем новый срок или меньший объём и отмечаем это на доске.</w:t>
             </w:r>
           </w:p>
         </w:tc>
@@ -9296,7 +9270,7 @@
           </w:tcPr>
           <w:p>
             <w:r>
-              <w:t>Конфликт</w:t>
+              <w:t>Разногласия</w:t>
             </w:r>
           </w:p>
         </w:tc>
@@ -9306,19 +9280,22 @@
           </w:tcPr>
           <w:p>
             <w:r>
-              <w:t>Обсуждаем предмет разногласия и варианты решения; при тупике обращаемся к преподавателю курса.</w:t>
+              <w:t>Обсуждаем варианты; если не договорились, обращаемся к преподавателю.</w:t>
             </w:r>
           </w:p>
         </w:tc>
       </w:tr>
     </w:tbl>
     <w:p>
+      <w:pPr>
+        <w:pStyle w:val="22"/>
+      </w:pPr>
       <w:r>
         <w:rPr>
-          <w:b/>
-          <w:sz w:val="20"/>
-        </w:rPr>
-        <w:t>4.5. Definition of Done</w:t>
+          <w:rFonts w:ascii="Times New Roman" w:hAnsi="Times New Roman"/>
+          <w:sz w:val="28"/>
+        </w:rPr>
+        <w:t>4.5. Когда задача считается готовой (Definition of Done)</w:t>
       </w:r>
     </w:p>
     <w:p>
@@ -9326,7 +9303,7 @@
         <w:rPr>
           <w:sz w:val="20"/>
         </w:rPr>
-        <w:t>Задача выполнена, если результат соответствует критерию готовности; ссылка на документ или код есть в issue; другой участник проверил изменение; применимые тесты пройдены; секретов и персональных данных нет; статус доски обновлён. Правило утверждается командой.</w:t>
+        <w:t>Это единый перечень условий для всех задач: результат соответствует описанию, код или документ приложен к задаче, другой участник проверил работу, нужные тесты пройдены, статус доски обновлён. Пароли и личные данные не публикуются. Правило ещё должна утвердить команда.</w:t>
       </w:r>
     </w:p>
     <w:p>
@@ -10043,10 +10020,13 @@
       </w:tr>
     </w:tbl>
     <w:p>
+      <w:pPr>
+        <w:pStyle w:val="22"/>
+      </w:pPr>
       <w:r>
         <w:rPr>
-          <w:b/>
-          <w:sz w:val="20"/>
+          <w:rFonts w:ascii="Times New Roman" w:hAnsi="Times New Roman"/>
+          <w:sz w:val="28"/>
         </w:rPr>
         <w:t>5.3. Журнал использования ИИ</w:t>
       </w:r>
@@ -10122,6 +10102,9 @@
           </w:tcPr>
           <w:p>
             <w:r>
+              <w:rPr>
+                <w:sz w:val="17"/>
+              </w:rPr>
               <w:t>30.09.2026</w:t>
             </w:r>
           </w:p>
@@ -10132,7 +10115,10 @@
           </w:tcPr>
           <w:p>
             <w:r>
-              <w:t>Подготовка ЛР 1; ChatGPT / Codex</w:t>
+              <w:rPr>
+                <w:sz w:val="17"/>
+              </w:rPr>
+              <w:t>ЛР 1; ChatGPT / Codex</w:t>
             </w:r>
           </w:p>
         </w:tc>
@@ -10142,6 +10128,9 @@
           </w:tcPr>
           <w:p>
             <w:r>
+              <w:rPr>
+                <w:sz w:val="17"/>
+              </w:rPr>
               <w:t>Черновики карточки, Vision, устава и README</w:t>
             </w:r>
           </w:p>
@@ -10152,7 +10141,10 @@
           </w:tcPr>
           <w:p>
             <w:r>
-              <w:t>Черновик принят; требовалась проверка команды</w:t>
+              <w:rPr>
+                <w:sz w:val="17"/>
+              </w:rPr>
+              <w:t>Отредактировано; ждёт проверки команды</w:t>
             </w:r>
           </w:p>
         </w:tc>
@@ -10162,7 +10154,10 @@
           </w:tcPr>
           <w:p>
             <w:r>
-              <w:t>Структура сверена с заданием и спецификацией; аналоги проверены позднее по справкам Apple и Google</w:t>
+              <w:rPr>
+                <w:sz w:val="17"/>
+              </w:rPr>
+              <w:t>Структура — по заданию; аналоги — по справкам Apple и Google</w:t>
             </w:r>
           </w:p>
         </w:tc>
@@ -11830,6 +11825,14 @@
         <w:t>6.4. Задачи ЛР 1</w:t>
       </w:r>
     </w:p>
+    <w:p>
+      <w:r>
+        <w:rPr>
+          <w:sz w:val="20"/>
+        </w:rPr>
+        <w:t>Исполнители указаны предварительно. Номера задач появятся после их создания на GitHub; статусы ниже отражают текущую работу, а не состояние доски.</w:t>
+      </w:r>
+    </w:p>
     <w:tbl>
       <w:tblPr>
         <w:tblW w:w="9638" w:type="dxa"/>
@@ -12075,7 +12078,7 @@
           </w:tcPr>
           <w:p>
             <w:r>
-              <w:t>Дополнить самооценку компетенций участников</w:t>
+              <w:t>Проверить и утвердить заполненную матрицу компетенций</w:t>
             </w:r>
           </w:p>
         </w:tc>
@@ -12091,7 +12094,7 @@
           </w:tcPr>
           <w:p>
             <w:r>
-              <w:t>Вся команда (предварительно)</w:t>
+              <w:t>Вся команда</w:t>
             </w:r>
           </w:p>
         </w:tc>
@@ -12123,7 +12126,7 @@
           </w:tcPr>
           <w:p>
             <w:r>
-              <w:t>Не завершено; issue не создан</w:t>
+              <w:t>На согласовании</w:t>
             </w:r>
           </w:p>
         </w:tc>
@@ -12179,7 +12182,7 @@
           </w:tcPr>
           <w:p>
             <w:r>
-              <w:t>Бартоломей А. М. (предварительно)</w:t>
+              <w:t>Бартоломей А. М.</w:t>
             </w:r>
           </w:p>
         </w:tc>
@@ -12213,7 +12216,7 @@
           </w:tcPr>
           <w:p>
             <w:r>
-              <w:t>Выполнено в отчёте; issue не создан</w:t>
+              <w:t>Готово</w:t>
             </w:r>
           </w:p>
         </w:tc>
@@ -12266,7 +12269,7 @@
           </w:tcPr>
           <w:p>
             <w:r>
-              <w:t>Боровик Ф. И. (предварительно)</w:t>
+              <w:t>Боровик Ф. И.</w:t>
             </w:r>
           </w:p>
         </w:tc>
@@ -12298,7 +12301,7 @@
           </w:tcPr>
           <w:p>
             <w:r>
-              <w:t>Не завершено; репозиторий и README уже есть; issue не создан</w:t>
+              <w:t>Не начато</w:t>
             </w:r>
           </w:p>
         </w:tc>
@@ -12354,7 +12357,7 @@
           </w:tcPr>
           <w:p>
             <w:r>
-              <w:t>Боровик Ф. И. (предварительно)</w:t>
+              <w:t>Боровик Ф. И.</w:t>
             </w:r>
           </w:p>
         </w:tc>
@@ -12388,7 +12391,7 @@
           </w:tcPr>
           <w:p>
             <w:r>
-              <w:t>Доска создана; настройки не подтверждены; issue не создан</w:t>
+              <w:t>Частично</w:t>
             </w:r>
           </w:p>
         </w:tc>
@@ -12441,7 +12444,7 @@
           </w:tcPr>
           <w:p>
             <w:r>
-              <w:t>Бартоломей А. М. (предварительно)</w:t>
+              <w:t>Бартоломей А. М.</w:t>
             </w:r>
           </w:p>
         </w:tc>
@@ -12473,7 +12476,7 @@
           </w:tcPr>
           <w:p>
             <w:r>
-              <w:t>Черновик есть в отчёте; issue не создан</w:t>
+              <w:t>Черновик</w:t>
             </w:r>
           </w:p>
         </w:tc>
@@ -12529,7 +12532,7 @@
           </w:tcPr>
           <w:p>
             <w:r>
-              <w:t>Золотилина Е. С. (предварительно)</w:t>
+              <w:t>Золотилина Е. С.</w:t>
             </w:r>
           </w:p>
         </w:tc>
@@ -12563,7 +12566,7 @@
           </w:tcPr>
           <w:p>
             <w:r>
-              <w:t>Не выполнено; issue не создан</w:t>
+              <w:t>Не начато</w:t>
             </w:r>
           </w:p>
         </w:tc>
@@ -12616,7 +12619,7 @@
           </w:tcPr>
           <w:p>
             <w:r>
-              <w:t>Бартоломей А. М. (предварительно)</w:t>
+              <w:t>Бартоломей А. М.</w:t>
             </w:r>
           </w:p>
         </w:tc>
@@ -12648,7 +12651,7 @@
           </w:tcPr>
           <w:p>
             <w:r>
-              <w:t>Черновик есть в отчёте; issue не создан</w:t>
+              <w:t>Черновик</w:t>
             </w:r>
           </w:p>
         </w:tc>
@@ -12704,7 +12707,7 @@
           </w:tcPr>
           <w:p>
             <w:r>
-              <w:t>Вся команда (предварительно)</w:t>
+              <w:t>Вся команда</w:t>
             </w:r>
           </w:p>
         </w:tc>
@@ -12738,7 +12741,7 @@
           </w:tcPr>
           <w:p>
             <w:r>
-              <w:t>Черновик есть; согласование не подтверждено; issue не создан</w:t>
+              <w:t>На согласовании</w:t>
             </w:r>
           </w:p>
         </w:tc>
@@ -12791,7 +12794,7 @@
           </w:tcPr>
           <w:p>
             <w:r>
-              <w:t>Поспелова М. Т. (предварительно)</w:t>
+              <w:t>Поспелова М. Т.</w:t>
             </w:r>
           </w:p>
         </w:tc>
@@ -12823,7 +12826,7 @@
           </w:tcPr>
           <w:p>
             <w:r>
-              <w:t>Черновик есть; согласование не подтверждено; issue не создан</w:t>
+              <w:t>На согласовании</w:t>
             </w:r>
           </w:p>
         </w:tc>
@@ -12879,7 +12882,7 @@
           </w:tcPr>
           <w:p>
             <w:r>
-              <w:t>Вся команда (предварительно)</w:t>
+              <w:t>Вся команда</w:t>
             </w:r>
           </w:p>
         </w:tc>
@@ -12913,7 +12916,7 @@
           </w:tcPr>
           <w:p>
             <w:r>
-              <w:t>Не подтверждено; отчёт есть в репозитории; issue не создан</w:t>
+              <w:t>Не подтверждено</w:t>
             </w:r>
           </w:p>
         </w:tc>
@@ -12966,7 +12969,7 @@
           </w:tcPr>
           <w:p>
             <w:r>
-              <w:t>Вся команда (предварительно)</w:t>
+              <w:t>Вся команда</w:t>
             </w:r>
           </w:p>
         </w:tc>
@@ -12998,7 +13001,7 @@
           </w:tcPr>
           <w:p>
             <w:r>
-              <w:t>Не выполнено; issue не создан</w:t>
+              <w:t>Не начато</w:t>
             </w:r>
           </w:p>
         </w:tc>
@@ -13054,7 +13057,7 @@
           </w:tcPr>
           <w:p>
             <w:r>
-              <w:t>Бартоломей А. М. (предварительно)</w:t>
+              <w:t>Бартоломей А. М.</w:t>
             </w:r>
           </w:p>
         </w:tc>
@@ -13088,7 +13091,7 @@
           </w:tcPr>
           <w:p>
             <w:r>
-              <w:t>Не выполнено; сведения об аналогах сверены со справками; issue не создан</w:t>
+              <w:t>Не начато</w:t>
             </w:r>
           </w:p>
         </w:tc>
@@ -13141,7 +13144,7 @@
           </w:tcPr>
           <w:p>
             <w:r>
-              <w:t>Боровик Ф. И. (предварительно)</w:t>
+              <w:t>Боровик Ф. И.</w:t>
             </w:r>
           </w:p>
         </w:tc>
@@ -13173,7 +13176,7 @@
           </w:tcPr>
           <w:p>
             <w:r>
-              <w:t>Не выполнено; платформа и устройство выбраны; issue не создан</w:t>
+              <w:t>Не начато</w:t>
             </w:r>
           </w:p>
         </w:tc>
@@ -13253,10 +13256,13 @@
       </w:pPr>
     </w:p>
     <w:p>
+      <w:pPr>
+        <w:pStyle w:val="12"/>
+      </w:pPr>
       <w:r>
         <w:rPr>
-          <w:b/>
-          <w:sz w:val="20"/>
+          <w:rFonts w:ascii="Times New Roman" w:hAnsi="Times New Roman"/>
+          <w:sz w:val="28"/>
         </w:rPr>
         <w:t>7. Завершение ЛР 1 и ретроспектива</w:t>
       </w:r>
@@ -13266,14 +13272,17 @@
         <w:rPr>
           <w:sz w:val="20"/>
         </w:rPr>
-        <w:t>К моменту подготовки отчёта тема GoCue согласована с преподавателем, роли подтверждены командой, выбрана платформа Android и определён смартфон для испытаний. Есть спецификация, репозиторий и ссылка на созданную доску GitHub Projects. Матрица компетенций заполнена частично: остальные оценки участники должны выставить сами. Рецензия другой команды и ретроспектива не проведены; преподавателю пока не предоставлен доступ к приватной доске. Наполнение доски задачами, мини-защита и загрузка на портал также не подтверждены. После фактического выполнения команда дополнит этот раздел результатами ретроспективы: что получилось, что мешало, что меняем в ЛР 2.</w:t>
+        <w:t>К моменту подготовки отчёта тема GoCue согласована с преподавателем, роли подтверждены командой, выбрана платформа Android и определён смартфон для испытаний. Есть спецификация, репозиторий, заполненная матрица компетенций и ссылка на созданную доску GitHub Projects. Совместное утверждение матрицы не подтверждено. Рецензия другой команды и ретроспектива не проведены; преподавателю пока не предоставлен доступ к приватной доске. Наполнение доски задачами, мини-защита и загрузка на портал также не подтверждены. После фактического выполнения команда дополнит этот раздел результатами ретроспективы: что получилось, что мешало, что меняем в ЛР 2.</w:t>
       </w:r>
     </w:p>
     <w:p>
+      <w:pPr>
+        <w:pStyle w:val="12"/>
+      </w:pPr>
       <w:r>
         <w:rPr>
-          <w:b/>
-          <w:sz w:val="20"/>
+          <w:rFonts w:ascii="Times New Roman" w:hAnsi="Times New Roman"/>
+          <w:sz w:val="28"/>
         </w:rPr>
         <w:t>8. Источники для раздела об аналогах</w:t>
       </w:r>

</xml_diff>

<commit_message>
Complete AI policy and usage log in lab report
</commit_message>
<xml_diff>
--- a/docs/lab-01/ЛР1_Отчёт_GoCue.docx
+++ b/docs/lab-01/ЛР1_Отчёт_GoCue.docx
@@ -9308,6 +9308,7 @@
     </w:p>
     <w:p>
       <w:pPr>
+        <w:pStyle w:val="12"/>
         <w:spacing w:before="60" w:after="120" w:line="276" w:lineRule="auto"/>
         <w:rPr>
           <w:rFonts w:ascii="Times New Roman" w:hAnsi="Times New Roman" w:cs="Times New Roman"/>
@@ -9317,11 +9318,17 @@
       </w:pPr>
       <w:r>
         <w:rPr>
-          <w:rFonts w:ascii="Times New Roman" w:hAnsi="Times New Roman" w:cs="Times New Roman"/>
+          <w:szCs w:val="28"/>
+        </w:rPr>
+        <w:t>5. Политика использования ИИ в команде</w:t>
+      </w:r>
+    </w:p>
+    <w:p>
+      <w:r>
+        <w:rPr>
           <w:sz w:val="20"/>
-          <w:szCs w:val="28"/>
-        </w:rPr>
-        <w:t>5. Политика использования ИИ в команде</w:t>
+        </w:rPr>
+        <w:t>ИИ применялся при подготовке учебных материалов, но не входит в само приложение GoCue. Ниже указано фактическое использование и предложены правила для дальнейшей работы.</w:t>
       </w:r>
     </w:p>
     <w:p>
@@ -9337,7 +9344,7 @@
         <w:rPr>
           <w:sz w:val="20"/>
         </w:rPr>
-        <w:t>Ответственная за раздел: Поспелова М. Т. (тестирование); правила согласуются всей командой.</w:t>
+        <w:t>Ведение журнала предложено Поспеловой М. Т.; правила использования ИИ утверждает вся команда.</w:t>
       </w:r>
     </w:p>
     <w:p>
@@ -9466,24 +9473,8 @@
             </w:tcMar>
           </w:tcPr>
           <w:p>
-            <w:pPr>
-              <w:spacing w:after="30" w:line="245" w:lineRule="auto"/>
-              <w:rPr>
-                <w:rFonts w:ascii="Times New Roman" w:hAnsi="Times New Roman" w:cs="Times New Roman"/>
-                <w:sz w:val="28"/>
-                <w:szCs w:val="28"/>
-              </w:rPr>
-            </w:pPr>
-            <w:r>
-              <w:rPr>
-                <w:rFonts w:ascii="Times New Roman" w:hAnsi="Times New Roman" w:cs="Times New Roman"/>
-                <w:b/>
-                <w:bCs/>
-                <w:color w:val="FFFFFF"/>
-                <w:sz w:val="28"/>
-                <w:szCs w:val="28"/>
-              </w:rPr>
-              <w:t>Кто использует</w:t>
+            <w:r>
+              <w:t>Кто применял</w:t>
             </w:r>
           </w:p>
         </w:tc>
@@ -9554,7 +9545,7 @@
           </w:tcPr>
           <w:p>
             <w:r>
-              <w:t>Черновик Vision и устава, анализ шаблона, проверка формулировок, подготовка отчёта и README</w:t>
+              <w:t>Черновики карточки проекта, Vision, устава, README и задач; анализ задания и шаблона; правка текста и сборка отчёта.</w:t>
             </w:r>
           </w:p>
         </w:tc>
@@ -9570,7 +9561,7 @@
           </w:tcPr>
           <w:p>
             <w:r>
-              <w:t>Инициатор запроса (участник команды уточняется)</w:t>
+              <w:t>Команда «Диалог» при подготовке ЛР 1</w:t>
             </w:r>
           </w:p>
         </w:tc>
@@ -9586,222 +9577,20 @@
           </w:tcPr>
           <w:p>
             <w:r>
-              <w:t>Каждую формулировку проверяет команда; факты об аналогах сверяются с первоисточниками</w:t>
-            </w:r>
-          </w:p>
-        </w:tc>
-      </w:tr>
-      <w:tr>
-        <w:trPr>
-          <w:cantSplit/>
-          <w:trHeight w:val="460"/>
-        </w:trPr>
-        <w:tc>
-          <w:tcPr>
-            <w:tcW w:w="2300" w:type="dxa"/>
-            <w:tcMar>
-              <w:top w:w="45" w:type="dxa"/>
-              <w:left w:w="80" w:type="dxa"/>
-              <w:bottom w:w="45" w:type="dxa"/>
-              <w:right w:w="80" w:type="dxa"/>
-            </w:tcMar>
-          </w:tcPr>
-          <w:p>
-            <w:r>
-              <w:t>Другие ИИ-инструменты</w:t>
-            </w:r>
-          </w:p>
-        </w:tc>
-        <w:tc>
-          <w:tcPr>
-            <w:tcW w:w="3000" w:type="dxa"/>
-            <w:tcMar>
-              <w:top w:w="45" w:type="dxa"/>
-              <w:left w:w="80" w:type="dxa"/>
-              <w:bottom w:w="45" w:type="dxa"/>
-              <w:right w:w="80" w:type="dxa"/>
-            </w:tcMar>
-          </w:tcPr>
-          <w:p>
-            <w:r>
-              <w:t>Пока не заявлены</w:t>
-            </w:r>
-          </w:p>
-        </w:tc>
-        <w:tc>
-          <w:tcPr>
-            <w:tcW w:w="2000" w:type="dxa"/>
-            <w:tcMar>
-              <w:top w:w="45" w:type="dxa"/>
-              <w:left w:w="80" w:type="dxa"/>
-              <w:bottom w:w="45" w:type="dxa"/>
-              <w:right w:w="80" w:type="dxa"/>
-            </w:tcMar>
-          </w:tcPr>
-          <w:p>
-            <w:r>
-              <w:t>—</w:t>
-            </w:r>
-          </w:p>
-        </w:tc>
-        <w:tc>
-          <w:tcPr>
-            <w:tcW w:w="2338" w:type="dxa"/>
-            <w:tcMar>
-              <w:top w:w="45" w:type="dxa"/>
-              <w:left w:w="80" w:type="dxa"/>
-              <w:bottom w:w="45" w:type="dxa"/>
-              <w:right w:w="80" w:type="dxa"/>
-            </w:tcMar>
-          </w:tcPr>
-          <w:p>
-            <w:r>
-              <w:t>Добавлять в журнал только после фактического использования</w:t>
-            </w:r>
-          </w:p>
-        </w:tc>
-      </w:tr>
-      <w:tr>
-        <w:trPr>
-          <w:cantSplit/>
-          <w:trHeight w:val="460"/>
-        </w:trPr>
-        <w:tc>
-          <w:tcPr>
-            <w:tcW w:w="2300" w:type="dxa"/>
-            <w:tcMar>
-              <w:top w:w="45" w:type="dxa"/>
-              <w:left w:w="80" w:type="dxa"/>
-              <w:bottom w:w="45" w:type="dxa"/>
-              <w:right w:w="80" w:type="dxa"/>
-            </w:tcMar>
-          </w:tcPr>
-          <w:p>
-            <w:r>
-              <w:t>—</w:t>
-            </w:r>
-          </w:p>
-        </w:tc>
-        <w:tc>
-          <w:tcPr>
-            <w:tcW w:w="3000" w:type="dxa"/>
-            <w:tcMar>
-              <w:top w:w="45" w:type="dxa"/>
-              <w:left w:w="80" w:type="dxa"/>
-              <w:bottom w:w="45" w:type="dxa"/>
-              <w:right w:w="80" w:type="dxa"/>
-            </w:tcMar>
-          </w:tcPr>
-          <w:p>
-            <w:r>
-              <w:t>—</w:t>
-            </w:r>
-          </w:p>
-        </w:tc>
-        <w:tc>
-          <w:tcPr>
-            <w:tcW w:w="2000" w:type="dxa"/>
-            <w:tcMar>
-              <w:top w:w="45" w:type="dxa"/>
-              <w:left w:w="80" w:type="dxa"/>
-              <w:bottom w:w="45" w:type="dxa"/>
-              <w:right w:w="80" w:type="dxa"/>
-            </w:tcMar>
-          </w:tcPr>
-          <w:p>
-            <w:r>
-              <w:t>—</w:t>
-            </w:r>
-          </w:p>
-        </w:tc>
-        <w:tc>
-          <w:tcPr>
-            <w:tcW w:w="2338" w:type="dxa"/>
-            <w:tcMar>
-              <w:top w:w="45" w:type="dxa"/>
-              <w:left w:w="80" w:type="dxa"/>
-              <w:bottom w:w="45" w:type="dxa"/>
-              <w:right w:w="80" w:type="dxa"/>
-            </w:tcMar>
-          </w:tcPr>
-          <w:p>
-            <w:r>
-              <w:t>—</w:t>
-            </w:r>
-          </w:p>
-        </w:tc>
-      </w:tr>
-      <w:tr>
-        <w:trPr>
-          <w:cantSplit/>
-          <w:trHeight w:val="460"/>
-        </w:trPr>
-        <w:tc>
-          <w:tcPr>
-            <w:tcW w:w="2300" w:type="dxa"/>
-            <w:tcMar>
-              <w:top w:w="45" w:type="dxa"/>
-              <w:left w:w="80" w:type="dxa"/>
-              <w:bottom w:w="45" w:type="dxa"/>
-              <w:right w:w="80" w:type="dxa"/>
-            </w:tcMar>
-          </w:tcPr>
-          <w:p>
-            <w:r>
-              <w:t>—</w:t>
-            </w:r>
-          </w:p>
-        </w:tc>
-        <w:tc>
-          <w:tcPr>
-            <w:tcW w:w="3000" w:type="dxa"/>
-            <w:tcMar>
-              <w:top w:w="45" w:type="dxa"/>
-              <w:left w:w="80" w:type="dxa"/>
-              <w:bottom w:w="45" w:type="dxa"/>
-              <w:right w:w="80" w:type="dxa"/>
-            </w:tcMar>
-          </w:tcPr>
-          <w:p>
-            <w:r>
-              <w:t>—</w:t>
-            </w:r>
-          </w:p>
-        </w:tc>
-        <w:tc>
-          <w:tcPr>
-            <w:tcW w:w="2000" w:type="dxa"/>
-            <w:tcMar>
-              <w:top w:w="45" w:type="dxa"/>
-              <w:left w:w="80" w:type="dxa"/>
-              <w:bottom w:w="45" w:type="dxa"/>
-              <w:right w:w="80" w:type="dxa"/>
-            </w:tcMar>
-          </w:tcPr>
-          <w:p>
-            <w:r>
-              <w:t>—</w:t>
-            </w:r>
-          </w:p>
-        </w:tc>
-        <w:tc>
-          <w:tcPr>
-            <w:tcW w:w="2338" w:type="dxa"/>
-            <w:tcMar>
-              <w:top w:w="45" w:type="dxa"/>
-              <w:left w:w="80" w:type="dxa"/>
-              <w:bottom w:w="45" w:type="dxa"/>
-              <w:right w:w="80" w:type="dxa"/>
-            </w:tcMar>
-          </w:tcPr>
-          <w:p>
-            <w:r>
-              <w:t>—</w:t>
+              <w:t>Результат не считается готовым без проверки по заданию, спецификации и первоисточникам.</w:t>
             </w:r>
           </w:p>
         </w:tc>
       </w:tr>
     </w:tbl>
+    <w:p>
+      <w:r>
+        <w:rPr>
+          <w:sz w:val="20"/>
+        </w:rPr>
+        <w:t>Другие ИИ-инструменты в работе над ЛР 1 не заявлены.</w:t>
+      </w:r>
+    </w:p>
     <w:p>
       <w:pPr>
         <w:pStyle w:val="22"/>
@@ -9833,7 +9622,7 @@
         <w:rPr>
           <w:sz w:val="20"/>
         </w:rPr>
-        <w:t>Команда использует ИИ только как вспомогательный инструмент и проверяет материалы перед включением в отчёт или код.</w:t>
+        <w:t>Ниже — проект правил команды. До сдачи отчёта участники должны их обсудить и подтвердить.</w:t>
       </w:r>
     </w:p>
     <w:tbl>
@@ -9981,7 +9770,7 @@
           </w:tcPr>
           <w:p>
             <w:r>
-              <w:t>Черновики идей, текста, схем, кода и тестов; дополнительно — генерация только синтетических контекстных событий.</w:t>
+              <w:t>Получать идеи и черновики текста, кода и тестов; использовать вымышленные примеры мест и визитов.</w:t>
             </w:r>
           </w:p>
         </w:tc>
@@ -9997,7 +9786,7 @@
           </w:tcPr>
           <w:p>
             <w:r>
-              <w:t>Журнал применения ИИ; человеческая проверка результата; проверка источников и лицензий; пометка применения ИИ в изменениях документации и кода.</w:t>
+              <w:t>Записывать применение ИИ в журнал; проверять результат вручную; сверять факты об аналогах с официальными источниками; отмечать ошибки и правки.</w:t>
             </w:r>
           </w:p>
         </w:tc>
@@ -10013,7 +9802,7 @@
           </w:tcPr>
           <w:p>
             <w:r>
-              <w:t>Передавать персональные данные, реальные маршруты и точные места пользователей, ключи и пароли; сдавать непроверенный текст; скрывать применение ИИ; выдавать планируемые действия за выполненные.</w:t>
+              <w:t>Передавать ИИ персональные данные, реальные маршруты, адреса пользователей, ключи и пароли; сдавать непроверенный текст; скрывать использование ИИ или выдавать планы за выполненную работу.</w:t>
             </w:r>
           </w:p>
         </w:tc>
@@ -10034,62 +9823,78 @@
     <w:tbl>
       <w:tblPr>
         <w:tblW w:type="auto" w:w="0"/>
+        <w:tblLayout w:type="fixed"/>
         <w:tblLook w:firstColumn="1" w:firstRow="1" w:lastColumn="0" w:lastRow="0" w:noHBand="0" w:noVBand="1" w:val="04A0"/>
       </w:tblPr>
       <w:tblGrid>
-        <w:gridCol w:w="1928"/>
-        <w:gridCol w:w="1928"/>
-        <w:gridCol w:w="1928"/>
-        <w:gridCol w:w="1928"/>
-        <w:gridCol w:w="1928"/>
+        <w:gridCol w:w="1247"/>
+        <w:gridCol w:w="1757"/>
+        <w:gridCol w:w="2324"/>
+        <w:gridCol w:w="1871"/>
+        <w:gridCol w:w="2438"/>
       </w:tblGrid>
       <w:tr>
         <w:tc>
           <w:tcPr>
-            <w:tcW w:type="dxa" w:w="1928"/>
-          </w:tcPr>
-          <w:p>
-            <w:r>
+            <w:tcW w:type="dxa" w:w="1247"/>
+          </w:tcPr>
+          <w:p>
+            <w:r>
+              <w:rPr>
+                <w:sz w:val="17"/>
+              </w:rPr>
               <w:t>Дата</w:t>
             </w:r>
           </w:p>
         </w:tc>
         <w:tc>
           <w:tcPr>
-            <w:tcW w:type="dxa" w:w="1928"/>
-          </w:tcPr>
-          <w:p>
-            <w:r>
+            <w:tcW w:type="dxa" w:w="1757"/>
+          </w:tcPr>
+          <w:p>
+            <w:r>
+              <w:rPr>
+                <w:sz w:val="17"/>
+              </w:rPr>
               <w:t>Задача и инструмент</w:t>
             </w:r>
           </w:p>
         </w:tc>
         <w:tc>
           <w:tcPr>
-            <w:tcW w:type="dxa" w:w="1928"/>
-          </w:tcPr>
-          <w:p>
-            <w:r>
+            <w:tcW w:type="dxa" w:w="2324"/>
+          </w:tcPr>
+          <w:p>
+            <w:r>
+              <w:rPr>
+                <w:sz w:val="17"/>
+              </w:rPr>
               <w:t>Получено</w:t>
             </w:r>
           </w:p>
         </w:tc>
         <w:tc>
           <w:tcPr>
-            <w:tcW w:type="dxa" w:w="1928"/>
-          </w:tcPr>
-          <w:p>
-            <w:r>
+            <w:tcW w:type="dxa" w:w="1871"/>
+          </w:tcPr>
+          <w:p>
+            <w:r>
+              <w:rPr>
+                <w:sz w:val="17"/>
+              </w:rPr>
               <w:t>Решение</w:t>
             </w:r>
           </w:p>
         </w:tc>
         <w:tc>
           <w:tcPr>
-            <w:tcW w:type="dxa" w:w="1928"/>
-          </w:tcPr>
-          <w:p>
-            <w:r>
+            <w:tcW w:type="dxa" w:w="2438"/>
+          </w:tcPr>
+          <w:p>
+            <w:r>
+              <w:rPr>
+                <w:sz w:val="17"/>
+              </w:rPr>
               <w:t>Проверка</w:t>
             </w:r>
           </w:p>
@@ -10098,7 +9903,7 @@
       <w:tr>
         <w:tc>
           <w:tcPr>
-            <w:tcW w:type="dxa" w:w="1928"/>
+            <w:tcW w:type="dxa" w:w="1247"/>
           </w:tcPr>
           <w:p>
             <w:r>
@@ -10111,53 +9916,120 @@
         </w:tc>
         <w:tc>
           <w:tcPr>
-            <w:tcW w:type="dxa" w:w="1928"/>
+            <w:tcW w:type="dxa" w:w="1757"/>
           </w:tcPr>
           <w:p>
             <w:r>
               <w:rPr>
                 <w:sz w:val="17"/>
               </w:rPr>
-              <w:t>ЛР 1; ChatGPT / Codex</w:t>
-            </w:r>
-          </w:p>
-        </w:tc>
-        <w:tc>
-          <w:tcPr>
-            <w:tcW w:type="dxa" w:w="1928"/>
+              <w:t>Черновик ЛР 1; ChatGPT / Codex</w:t>
+            </w:r>
+          </w:p>
+        </w:tc>
+        <w:tc>
+          <w:tcPr>
+            <w:tcW w:type="dxa" w:w="2324"/>
           </w:tcPr>
           <w:p>
             <w:r>
               <w:rPr>
                 <w:sz w:val="17"/>
               </w:rPr>
-              <w:t>Черновики карточки, Vision, устава и README</w:t>
-            </w:r>
-          </w:p>
-        </w:tc>
-        <w:tc>
-          <w:tcPr>
-            <w:tcW w:type="dxa" w:w="1928"/>
+              <w:t>Карточка, Vision, устав, README</w:t>
+            </w:r>
+          </w:p>
+        </w:tc>
+        <w:tc>
+          <w:tcPr>
+            <w:tcW w:type="dxa" w:w="1871"/>
           </w:tcPr>
           <w:p>
             <w:r>
               <w:rPr>
                 <w:sz w:val="17"/>
               </w:rPr>
-              <w:t>Отредактировано; ждёт проверки команды</w:t>
-            </w:r>
-          </w:p>
-        </w:tc>
-        <w:tc>
-          <w:tcPr>
-            <w:tcW w:type="dxa" w:w="1928"/>
+              <w:t>Взято как черновик</w:t>
+            </w:r>
+          </w:p>
+        </w:tc>
+        <w:tc>
+          <w:tcPr>
+            <w:tcW w:type="dxa" w:w="2438"/>
           </w:tcPr>
           <w:p>
             <w:r>
               <w:rPr>
                 <w:sz w:val="17"/>
               </w:rPr>
-              <w:t>Структура — по заданию; аналоги — по справкам Apple и Google</w:t>
+              <w:t>Сверено с заданием и спецификацией</w:t>
+            </w:r>
+          </w:p>
+        </w:tc>
+      </w:tr>
+      <w:tr>
+        <w:tc>
+          <w:tcPr>
+            <w:tcW w:type="dxa" w:w="1247"/>
+          </w:tcPr>
+          <w:p>
+            <w:r>
+              <w:rPr>
+                <w:sz w:val="17"/>
+              </w:rPr>
+              <w:t>14.10.2026</w:t>
+            </w:r>
+          </w:p>
+        </w:tc>
+        <w:tc>
+          <w:tcPr>
+            <w:tcW w:type="dxa" w:w="1757"/>
+          </w:tcPr>
+          <w:p>
+            <w:r>
+              <w:rPr>
+                <w:sz w:val="17"/>
+              </w:rPr>
+              <w:t>Правка ЛР 1; ChatGPT / Codex</w:t>
+            </w:r>
+          </w:p>
+        </w:tc>
+        <w:tc>
+          <w:tcPr>
+            <w:tcW w:type="dxa" w:w="2324"/>
+          </w:tcPr>
+          <w:p>
+            <w:r>
+              <w:rPr>
+                <w:sz w:val="17"/>
+              </w:rPr>
+              <w:t>Проблема, аналоги, матрица, раздел 5, DOCX и PDF</w:t>
+            </w:r>
+          </w:p>
+        </w:tc>
+        <w:tc>
+          <w:tcPr>
+            <w:tcW w:type="dxa" w:w="1871"/>
+          </w:tcPr>
+          <w:p>
+            <w:r>
+              <w:rPr>
+                <w:sz w:val="17"/>
+              </w:rPr>
+              <w:t>Исправлено в отчёте; ждёт утверждения команды</w:t>
+            </w:r>
+          </w:p>
+        </w:tc>
+        <w:tc>
+          <w:tcPr>
+            <w:tcW w:type="dxa" w:w="2438"/>
+          </w:tcPr>
+          <w:p>
+            <w:r>
+              <w:rPr>
+                <w:sz w:val="17"/>
+              </w:rPr>
+              <w:t>Сверено с ручными правками и заданием; аналоги — со справками Apple и Google</w:t>
             </w:r>
           </w:p>
         </w:tc>

</xml_diff>